<commit_message>
Add English source quotations with timestamps under each customer finding
Co-authored-by: peterli0913 <peterli0913@users.noreply.github.com>
</commit_message>
<xml_diff>
--- a/客户审计跟进会 改进要点总结 09-18-2026.docx
+++ b/客户审计跟进会 改进要点总结 09-18-2026.docx
@@ -405,10 +405,10 @@
         </w:tblCellMar>
       </w:tblPr>
       <w:tblGrid>
-        <w:gridCol w:w="624"/>
-        <w:gridCol w:w="3515"/>
-        <w:gridCol w:w="4025"/>
-        <w:gridCol w:w="1417"/>
+        <w:gridCol w:w="652"/>
+        <w:gridCol w:w="4224"/>
+        <w:gridCol w:w="3345"/>
+        <w:gridCol w:w="1360"/>
       </w:tblGrid>
       <w:tr>
         <w:tblPrEx>
@@ -434,7 +434,7 @@
         </w:trPr>
         <w:tc>
           <w:tcPr>
-            <w:tcW w:w="624" w:type="dxa"/>
+            <w:tcW w:w="652" w:type="dxa"/>
             <w:shd w:val="clear" w:color="auto" w:fill="1F4E79"/>
           </w:tcPr>
           <w:p>
@@ -456,7 +456,7 @@
         </w:tc>
         <w:tc>
           <w:tcPr>
-            <w:tcW w:w="3515" w:type="dxa"/>
+            <w:tcW w:w="4224" w:type="dxa"/>
             <w:shd w:val="clear" w:color="auto" w:fill="1F4E79"/>
           </w:tcPr>
           <w:p>
@@ -478,7 +478,7 @@
         </w:tc>
         <w:tc>
           <w:tcPr>
-            <w:tcW w:w="4025" w:type="dxa"/>
+            <w:tcW w:w="3345" w:type="dxa"/>
             <w:shd w:val="clear" w:color="auto" w:fill="1F4E79"/>
           </w:tcPr>
           <w:p>
@@ -500,7 +500,7 @@
         </w:tc>
         <w:tc>
           <w:tcPr>
-            <w:tcW w:w="1417" w:type="dxa"/>
+            <w:tcW w:w="1361" w:type="dxa"/>
             <w:shd w:val="clear" w:color="auto" w:fill="1F4E79"/>
           </w:tcPr>
           <w:p>
@@ -544,7 +544,7 @@
         </w:trPr>
         <w:tc>
           <w:tcPr>
-            <w:tcW w:w="624" w:type="dxa"/>
+            <w:tcW w:w="652" w:type="dxa"/>
           </w:tcPr>
           <w:p>
             <w:pPr>
@@ -565,7 +565,7 @@
         </w:tc>
         <w:tc>
           <w:tcPr>
-            <w:tcW w:w="3515" w:type="dxa"/>
+            <w:tcW w:w="4224" w:type="dxa"/>
           </w:tcPr>
           <w:p>
             <w:pPr>
@@ -580,12 +580,62 @@
                 <w:sz w:val="19"/>
               </w:rPr>
               <w:t>客户对我方清洁策略的整体思路，以及清洁程序如何制定、执行、记录，理解仍不清晰，认为这是当前最高关注领域。</w:t>
+            </w:r>
+          </w:p>
+          <w:p>
+            <w:pPr>
+              <w:spacing w:before="80" w:after="0" w:line="276" w:lineRule="auto"/>
+            </w:pPr>
+            <w:r>
+              <w:rPr>
+                <w:rFonts w:ascii="Arial" w:hAnsi="Arial" w:eastAsia="微软雅黑"/>
+                <w:b/>
+                <w:i w:val="0"/>
+                <w:color w:val="808080"/>
+                <w:sz w:val="16"/>
+              </w:rPr>
+              <w:t xml:space="preserve">原文 00:03:32  </w:t>
+            </w:r>
+            <w:r>
+              <w:rPr>
+                <w:rFonts w:ascii="Arial" w:hAnsi="Arial" w:eastAsia="微软雅黑"/>
+                <w:b w:val="0"/>
+                <w:i/>
+                <w:color w:val="1F4E79"/>
+                <w:sz w:val="17"/>
+              </w:rPr>
+              <w:t>“I think clean relations is one of the areas we probably have made the highest concern currently around your strategy generally. I think we try to talk through that yesterday. There's hope, maybe not clear on our ends managing that generally. This together out here developing that cleaning program. I was actually executed and documented. So I think there might be some whole sessions on that.”</w:t>
+            </w:r>
+          </w:p>
+          <w:p>
+            <w:pPr>
+              <w:spacing w:before="80" w:after="0" w:line="276" w:lineRule="auto"/>
+            </w:pPr>
+            <w:r>
+              <w:rPr>
+                <w:rFonts w:ascii="Arial" w:hAnsi="Arial" w:eastAsia="微软雅黑"/>
+                <w:b/>
+                <w:i w:val="0"/>
+                <w:color w:val="808080"/>
+                <w:sz w:val="16"/>
+              </w:rPr>
+              <w:t xml:space="preserve">原文 00:04:58  </w:t>
+            </w:r>
+            <w:r>
+              <w:rPr>
+                <w:rFonts w:ascii="Arial" w:hAnsi="Arial" w:eastAsia="微软雅黑"/>
+                <w:b w:val="0"/>
+                <w:i/>
+                <w:color w:val="1F4E79"/>
+                <w:sz w:val="17"/>
+              </w:rPr>
+              <w:t>“I think I would highly recommend we need to set up some specific discussion.”</w:t>
             </w:r>
           </w:p>
         </w:tc>
         <w:tc>
           <w:tcPr>
-            <w:tcW w:w="4025" w:type="dxa"/>
+            <w:tcW w:w="3345" w:type="dxa"/>
           </w:tcPr>
           <w:p>
             <w:pPr>
@@ -605,7 +655,7 @@
         </w:tc>
         <w:tc>
           <w:tcPr>
-            <w:tcW w:w="1417" w:type="dxa"/>
+            <w:tcW w:w="1361" w:type="dxa"/>
           </w:tcPr>
           <w:p>
             <w:pPr>
@@ -664,7 +714,7 @@
         </w:trPr>
         <w:tc>
           <w:tcPr>
-            <w:tcW w:w="624" w:type="dxa"/>
+            <w:tcW w:w="652" w:type="dxa"/>
             <w:shd w:val="clear" w:color="auto" w:fill="EAF1F8"/>
           </w:tcPr>
           <w:p>
@@ -686,7 +736,7 @@
         </w:tc>
         <w:tc>
           <w:tcPr>
-            <w:tcW w:w="3515" w:type="dxa"/>
+            <w:tcW w:w="4224" w:type="dxa"/>
             <w:shd w:val="clear" w:color="auto" w:fill="EAF1F8"/>
           </w:tcPr>
           <w:p>
@@ -702,12 +752,37 @@
                 <w:sz w:val="19"/>
               </w:rPr>
               <w:t>清洁验证的擦拭/淋洗回收率（swab / rinse recovery）通常在不锈钢表面建立，未覆盖隔膜等大面积软质部件。</w:t>
+            </w:r>
+          </w:p>
+          <w:p>
+            <w:pPr>
+              <w:spacing w:before="80" w:after="0" w:line="276" w:lineRule="auto"/>
+            </w:pPr>
+            <w:r>
+              <w:rPr>
+                <w:rFonts w:ascii="Arial" w:hAnsi="Arial" w:eastAsia="微软雅黑"/>
+                <w:b/>
+                <w:i w:val="0"/>
+                <w:color w:val="808080"/>
+                <w:sz w:val="16"/>
+              </w:rPr>
+              <w:t xml:space="preserve">原文 00:24:25  </w:t>
+            </w:r>
+            <w:r>
+              <w:rPr>
+                <w:rFonts w:ascii="Arial" w:hAnsi="Arial" w:eastAsia="微软雅黑"/>
+                <w:b w:val="0"/>
+                <w:i/>
+                <w:color w:val="1F4E79"/>
+                <w:sz w:val="17"/>
+              </w:rPr>
+              <w:t>“a lot of times clean studies like swab recovery factors, rinse recovery factors, they're usually done like stainless steel because those are the, it's all or whatever. Metallic LC is, and sometimes they may not be represented on these large surface areas of parts. Just making sure that your cleaning strategy accounts for the use and are we have a swamp point around there, and we assess for every factor off of the soft parts, etc.”</w:t>
             </w:r>
           </w:p>
         </w:tc>
         <w:tc>
           <w:tcPr>
-            <w:tcW w:w="4025" w:type="dxa"/>
+            <w:tcW w:w="3345" w:type="dxa"/>
             <w:shd w:val="clear" w:color="auto" w:fill="EAF1F8"/>
           </w:tcPr>
           <w:p>
@@ -728,7 +803,7 @@
         </w:tc>
         <w:tc>
           <w:tcPr>
-            <w:tcW w:w="1417" w:type="dxa"/>
+            <w:tcW w:w="1361" w:type="dxa"/>
             <w:shd w:val="clear" w:color="auto" w:fill="EAF1F8"/>
           </w:tcPr>
           <w:p>
@@ -788,7 +863,7 @@
         </w:trPr>
         <w:tc>
           <w:tcPr>
-            <w:tcW w:w="624" w:type="dxa"/>
+            <w:tcW w:w="652" w:type="dxa"/>
           </w:tcPr>
           <w:p>
             <w:pPr>
@@ -809,7 +884,7 @@
         </w:tc>
         <w:tc>
           <w:tcPr>
-            <w:tcW w:w="3515" w:type="dxa"/>
+            <w:tcW w:w="4224" w:type="dxa"/>
           </w:tcPr>
           <w:p>
             <w:pPr>
@@ -824,12 +899,62 @@
                 <w:sz w:val="19"/>
               </w:rPr>
               <w:t>客户已由压力控制改为流量控制 CIP：颗粒物部分堵塞喷淋球时，供水压力不变但实际流量下降，压力控制无法识别。</w:t>
+            </w:r>
+          </w:p>
+          <w:p>
+            <w:pPr>
+              <w:spacing w:before="80" w:after="0" w:line="276" w:lineRule="auto"/>
+            </w:pPr>
+            <w:r>
+              <w:rPr>
+                <w:rFonts w:ascii="Arial" w:hAnsi="Arial" w:eastAsia="微软雅黑"/>
+                <w:b/>
+                <w:i w:val="0"/>
+                <w:color w:val="808080"/>
+                <w:sz w:val="16"/>
+              </w:rPr>
+              <w:t xml:space="preserve">原文 00:52:55  </w:t>
+            </w:r>
+            <w:r>
+              <w:rPr>
+                <w:rFonts w:ascii="Arial" w:hAnsi="Arial" w:eastAsia="微软雅黑"/>
+                <w:b w:val="0"/>
+                <w:i/>
+                <w:color w:val="1F4E79"/>
+                <w:sz w:val="17"/>
+              </w:rPr>
+              <w:t>“We've gone away from pressure and we go to flow, specifically because we saw instances where like if you have debris or particulate get into your system, they can partially block the spray balls. So your supply pressure can be the same. You're taking more pressure drop across the spray lines, so your flow is lower or you're partially obstructed.”</w:t>
+            </w:r>
+          </w:p>
+          <w:p>
+            <w:pPr>
+              <w:spacing w:before="80" w:after="0" w:line="276" w:lineRule="auto"/>
+            </w:pPr>
+            <w:r>
+              <w:rPr>
+                <w:rFonts w:ascii="Arial" w:hAnsi="Arial" w:eastAsia="微软雅黑"/>
+                <w:b/>
+                <w:i w:val="0"/>
+                <w:color w:val="808080"/>
+                <w:sz w:val="16"/>
+              </w:rPr>
+              <w:t xml:space="preserve">原文 00:52:55  </w:t>
+            </w:r>
+            <w:r>
+              <w:rPr>
+                <w:rFonts w:ascii="Arial" w:hAnsi="Arial" w:eastAsia="微软雅黑"/>
+                <w:b w:val="0"/>
+                <w:i/>
+                <w:color w:val="1F4E79"/>
+                <w:sz w:val="17"/>
+              </w:rPr>
+              <w:t>“Do they have a pressure alarm or something to let them know they drop below that pressure so that they might have to be covered.”</w:t>
             </w:r>
           </w:p>
         </w:tc>
         <w:tc>
           <w:tcPr>
-            <w:tcW w:w="4025" w:type="dxa"/>
+            <w:tcW w:w="3345" w:type="dxa"/>
           </w:tcPr>
           <w:p>
             <w:pPr>
@@ -849,7 +974,7 @@
         </w:tc>
         <w:tc>
           <w:tcPr>
-            <w:tcW w:w="1417" w:type="dxa"/>
+            <w:tcW w:w="1361" w:type="dxa"/>
           </w:tcPr>
           <w:p>
             <w:pPr>
@@ -908,7 +1033,7 @@
         </w:trPr>
         <w:tc>
           <w:tcPr>
-            <w:tcW w:w="624" w:type="dxa"/>
+            <w:tcW w:w="652" w:type="dxa"/>
             <w:shd w:val="clear" w:color="auto" w:fill="EAF1F8"/>
           </w:tcPr>
           <w:p>
@@ -930,7 +1055,7 @@
         </w:tc>
         <w:tc>
           <w:tcPr>
-            <w:tcW w:w="3515" w:type="dxa"/>
+            <w:tcW w:w="4224" w:type="dxa"/>
             <w:shd w:val="clear" w:color="auto" w:fill="EAF1F8"/>
           </w:tcPr>
           <w:p>
@@ -946,12 +1071,62 @@
                 <w:sz w:val="19"/>
               </w:rPr>
               <w:t>客户希望用数据说明清洁限度的裕度（例如以 10 倍挑战量验证通过，则实际溶剂用量更大时仍有裕度）。</w:t>
+            </w:r>
+          </w:p>
+          <w:p>
+            <w:pPr>
+              <w:spacing w:before="80" w:after="0" w:line="276" w:lineRule="auto"/>
+            </w:pPr>
+            <w:r>
+              <w:rPr>
+                <w:rFonts w:ascii="Arial" w:hAnsi="Arial" w:eastAsia="微软雅黑"/>
+                <w:b/>
+                <w:i w:val="0"/>
+                <w:color w:val="808080"/>
+                <w:sz w:val="16"/>
+              </w:rPr>
+              <w:t xml:space="preserve">原文 00:52:55  </w:t>
+            </w:r>
+            <w:r>
+              <w:rPr>
+                <w:rFonts w:ascii="Arial" w:hAnsi="Arial" w:eastAsia="微软雅黑"/>
+                <w:b w:val="0"/>
+                <w:i/>
+                <w:color w:val="1F4E79"/>
+                <w:sz w:val="17"/>
+              </w:rPr>
+              <w:t>“I mean, if you're looking at it, we're using more solvents or lower generation than this. If so, we may still have some buffer based on these Assumption.”</w:t>
+            </w:r>
+          </w:p>
+          <w:p>
+            <w:pPr>
+              <w:spacing w:before="80" w:after="0" w:line="276" w:lineRule="auto"/>
+            </w:pPr>
+            <w:r>
+              <w:rPr>
+                <w:rFonts w:ascii="Arial" w:hAnsi="Arial" w:eastAsia="微软雅黑"/>
+                <w:b/>
+                <w:i w:val="0"/>
+                <w:color w:val="808080"/>
+                <w:sz w:val="16"/>
+              </w:rPr>
+              <w:t xml:space="preserve">原文 00:52:55  </w:t>
+            </w:r>
+            <w:r>
+              <w:rPr>
+                <w:rFonts w:ascii="Arial" w:hAnsi="Arial" w:eastAsia="微软雅黑"/>
+                <w:b w:val="0"/>
+                <w:i/>
+                <w:color w:val="1F4E79"/>
+                <w:sz w:val="17"/>
+              </w:rPr>
+              <w:t>“you can hire if we using 10 times the page and we all pass, which means we must using more solidly.”</w:t>
             </w:r>
           </w:p>
         </w:tc>
         <w:tc>
           <w:tcPr>
-            <w:tcW w:w="4025" w:type="dxa"/>
+            <w:tcW w:w="3345" w:type="dxa"/>
             <w:shd w:val="clear" w:color="auto" w:fill="EAF1F8"/>
           </w:tcPr>
           <w:p>
@@ -972,7 +1147,7 @@
         </w:tc>
         <w:tc>
           <w:tcPr>
-            <w:tcW w:w="1417" w:type="dxa"/>
+            <w:tcW w:w="1361" w:type="dxa"/>
             <w:shd w:val="clear" w:color="auto" w:fill="EAF1F8"/>
           </w:tcPr>
           <w:p>
@@ -1032,10 +1207,10 @@
         </w:tblCellMar>
       </w:tblPr>
       <w:tblGrid>
-        <w:gridCol w:w="624"/>
-        <w:gridCol w:w="3515"/>
-        <w:gridCol w:w="4025"/>
-        <w:gridCol w:w="1417"/>
+        <w:gridCol w:w="652"/>
+        <w:gridCol w:w="4224"/>
+        <w:gridCol w:w="3345"/>
+        <w:gridCol w:w="1360"/>
       </w:tblGrid>
       <w:tr>
         <w:tblPrEx>
@@ -1061,7 +1236,7 @@
         </w:trPr>
         <w:tc>
           <w:tcPr>
-            <w:tcW w:w="624" w:type="dxa"/>
+            <w:tcW w:w="652" w:type="dxa"/>
             <w:shd w:val="clear" w:color="auto" w:fill="1F4E79"/>
           </w:tcPr>
           <w:p>
@@ -1083,7 +1258,7 @@
         </w:tc>
         <w:tc>
           <w:tcPr>
-            <w:tcW w:w="3515" w:type="dxa"/>
+            <w:tcW w:w="4224" w:type="dxa"/>
             <w:shd w:val="clear" w:color="auto" w:fill="1F4E79"/>
           </w:tcPr>
           <w:p>
@@ -1105,7 +1280,7 @@
         </w:tc>
         <w:tc>
           <w:tcPr>
-            <w:tcW w:w="4025" w:type="dxa"/>
+            <w:tcW w:w="3345" w:type="dxa"/>
             <w:shd w:val="clear" w:color="auto" w:fill="1F4E79"/>
           </w:tcPr>
           <w:p>
@@ -1127,7 +1302,7 @@
         </w:tc>
         <w:tc>
           <w:tcPr>
-            <w:tcW w:w="1417" w:type="dxa"/>
+            <w:tcW w:w="1361" w:type="dxa"/>
             <w:shd w:val="clear" w:color="auto" w:fill="1F4E79"/>
           </w:tcPr>
           <w:p>
@@ -1171,7 +1346,7 @@
         </w:trPr>
         <w:tc>
           <w:tcPr>
-            <w:tcW w:w="624" w:type="dxa"/>
+            <w:tcW w:w="652" w:type="dxa"/>
           </w:tcPr>
           <w:p>
             <w:pPr>
@@ -1192,7 +1367,7 @@
         </w:tc>
         <w:tc>
           <w:tcPr>
-            <w:tcW w:w="3515" w:type="dxa"/>
+            <w:tcW w:w="4224" w:type="dxa"/>
           </w:tcPr>
           <w:p>
             <w:pPr>
@@ -1207,12 +1382,62 @@
                 <w:sz w:val="19"/>
               </w:rPr>
               <w:t>客户期望（Cat 4 范围：促生长溶液、水基/碱性溶液、水、产品或清洁接触）：不得有球阀、法兰、死角、难清洁结构，必须可排空。</w:t>
+            </w:r>
+          </w:p>
+          <w:p>
+            <w:pPr>
+              <w:spacing w:before="80" w:after="0" w:line="276" w:lineRule="auto"/>
+            </w:pPr>
+            <w:r>
+              <w:rPr>
+                <w:rFonts w:ascii="Arial" w:hAnsi="Arial" w:eastAsia="微软雅黑"/>
+                <w:b/>
+                <w:i w:val="0"/>
+                <w:color w:val="808080"/>
+                <w:sz w:val="16"/>
+              </w:rPr>
+              <w:t xml:space="preserve">原文 00:25:45  </w:t>
+            </w:r>
+            <w:r>
+              <w:rPr>
+                <w:rFonts w:ascii="Arial" w:hAnsi="Arial" w:eastAsia="微软雅黑"/>
+                <w:b w:val="0"/>
+                <w:i/>
+                <w:color w:val="1F4E79"/>
+                <w:sz w:val="17"/>
+              </w:rPr>
+              <w:t>“when I look at specifically the Category 4 equipment, which I care about the most, but I care about all that media category, but. The category 4 points of growth, rolling apes, base solutions, water and product contact slash clean contact equipment. But again, the expectation would be no ball valves, no flanges, no hard to clean areas, etc.”</w:t>
+            </w:r>
+          </w:p>
+          <w:p>
+            <w:pPr>
+              <w:spacing w:before="80" w:after="0" w:line="276" w:lineRule="auto"/>
+            </w:pPr>
+            <w:r>
+              <w:rPr>
+                <w:rFonts w:ascii="Arial" w:hAnsi="Arial" w:eastAsia="微软雅黑"/>
+                <w:b/>
+                <w:i w:val="0"/>
+                <w:color w:val="808080"/>
+                <w:sz w:val="16"/>
+              </w:rPr>
+              <w:t xml:space="preserve">原文 00:25:45  </w:t>
+            </w:r>
+            <w:r>
+              <w:rPr>
+                <w:rFonts w:ascii="Arial" w:hAnsi="Arial" w:eastAsia="微软雅黑"/>
+                <w:b w:val="0"/>
+                <w:i/>
+                <w:color w:val="1F4E79"/>
+                <w:sz w:val="17"/>
+              </w:rPr>
+              <w:t>“I'll say before I came on site, based on some of the Excel spreadsheets that were shared, flagging what gaps still existed on the equipment, I was expecting to see less gaps out of the floor.”</w:t>
             </w:r>
           </w:p>
         </w:tc>
         <w:tc>
           <w:tcPr>
-            <w:tcW w:w="4025" w:type="dxa"/>
+            <w:tcW w:w="3345" w:type="dxa"/>
           </w:tcPr>
           <w:p>
             <w:pPr>
@@ -1232,7 +1457,7 @@
         </w:tc>
         <w:tc>
           <w:tcPr>
-            <w:tcW w:w="1417" w:type="dxa"/>
+            <w:tcW w:w="1361" w:type="dxa"/>
           </w:tcPr>
           <w:p>
             <w:pPr>
@@ -1291,7 +1516,7 @@
         </w:trPr>
         <w:tc>
           <w:tcPr>
-            <w:tcW w:w="624" w:type="dxa"/>
+            <w:tcW w:w="652" w:type="dxa"/>
             <w:shd w:val="clear" w:color="auto" w:fill="EAF1F8"/>
           </w:tcPr>
           <w:p>
@@ -1313,7 +1538,7 @@
         </w:tc>
         <w:tc>
           <w:tcPr>
-            <w:tcW w:w="3515" w:type="dxa"/>
+            <w:tcW w:w="4224" w:type="dxa"/>
             <w:shd w:val="clear" w:color="auto" w:fill="EAF1F8"/>
           </w:tcPr>
           <w:p>
@@ -1329,12 +1554,37 @@
                 <w:sz w:val="19"/>
               </w:rPr>
               <w:t>纯化水罐 T01 顶部及其供水管线上仍存在球阀，其他位置也有类似情况。</w:t>
+            </w:r>
+          </w:p>
+          <w:p>
+            <w:pPr>
+              <w:spacing w:before="80" w:after="0" w:line="276" w:lineRule="auto"/>
+            </w:pPr>
+            <w:r>
+              <w:rPr>
+                <w:rFonts w:ascii="Arial" w:hAnsi="Arial" w:eastAsia="微软雅黑"/>
+                <w:b/>
+                <w:i w:val="0"/>
+                <w:color w:val="808080"/>
+                <w:sz w:val="16"/>
+              </w:rPr>
+              <w:t xml:space="preserve">原文 00:25:45  </w:t>
+            </w:r>
+            <w:r>
+              <w:rPr>
+                <w:rFonts w:ascii="Arial" w:hAnsi="Arial" w:eastAsia="微软雅黑"/>
+                <w:b w:val="0"/>
+                <w:i/>
+                <w:color w:val="1F4E79"/>
+                <w:sz w:val="17"/>
+              </w:rPr>
+              <w:t>“So again, ball valves. Like we saw ball valve on the top of the E, the purified water tank T01, and ball valves all along its supply line, etc.”</w:t>
             </w:r>
           </w:p>
         </w:tc>
         <w:tc>
           <w:tcPr>
-            <w:tcW w:w="4025" w:type="dxa"/>
+            <w:tcW w:w="3345" w:type="dxa"/>
             <w:shd w:val="clear" w:color="auto" w:fill="EAF1F8"/>
           </w:tcPr>
           <w:p>
@@ -1355,7 +1605,7 @@
         </w:tc>
         <w:tc>
           <w:tcPr>
-            <w:tcW w:w="1417" w:type="dxa"/>
+            <w:tcW w:w="1361" w:type="dxa"/>
             <w:shd w:val="clear" w:color="auto" w:fill="EAF1F8"/>
           </w:tcPr>
           <w:p>
@@ -1415,7 +1665,7 @@
         </w:trPr>
         <w:tc>
           <w:tcPr>
-            <w:tcW w:w="624" w:type="dxa"/>
+            <w:tcW w:w="652" w:type="dxa"/>
           </w:tcPr>
           <w:p>
             <w:pPr>
@@ -1436,7 +1686,7 @@
         </w:tc>
         <w:tc>
           <w:tcPr>
-            <w:tcW w:w="3515" w:type="dxa"/>
+            <w:tcW w:w="4224" w:type="dxa"/>
           </w:tcPr>
           <w:p>
             <w:pPr>
@@ -1451,12 +1701,37 @@
                 <w:sz w:val="19"/>
               </w:rPr>
               <w:t>罐顶接管过长、喷淋球无法覆盖；更差的是长接管上再接仪表三通，形成完全无法覆盖的支管。</w:t>
+            </w:r>
+          </w:p>
+          <w:p>
+            <w:pPr>
+              <w:spacing w:before="80" w:after="0" w:line="276" w:lineRule="auto"/>
+            </w:pPr>
+            <w:r>
+              <w:rPr>
+                <w:rFonts w:ascii="Arial" w:hAnsi="Arial" w:eastAsia="微软雅黑"/>
+                <w:b/>
+                <w:i w:val="0"/>
+                <w:color w:val="808080"/>
+                <w:sz w:val="16"/>
+              </w:rPr>
+              <w:t xml:space="preserve">原文 00:25:45  </w:t>
+            </w:r>
+            <w:r>
+              <w:rPr>
+                <w:rFonts w:ascii="Arial" w:hAnsi="Arial" w:eastAsia="微软雅黑"/>
+                <w:b w:val="0"/>
+                <w:i/>
+                <w:color w:val="1F4E79"/>
+                <w:sz w:val="17"/>
+              </w:rPr>
+              <w:t>“Some examples, long tank nozzles on vessel heads. So again, we talked through other pictures, kind of the ASM standard on what a reasonable nozzle this. Sometimes we have very long nozzles that we don't believe are gonna be covered by sprayers, just too much distance up there. But then 2, sometimes it would get worse for the long nozzle. And on top of that, you would have a t for some other instrument.”</w:t>
             </w:r>
           </w:p>
         </w:tc>
         <w:tc>
           <w:tcPr>
-            <w:tcW w:w="4025" w:type="dxa"/>
+            <w:tcW w:w="3345" w:type="dxa"/>
           </w:tcPr>
           <w:p>
             <w:pPr>
@@ -1476,7 +1751,7 @@
         </w:tc>
         <w:tc>
           <w:tcPr>
-            <w:tcW w:w="1417" w:type="dxa"/>
+            <w:tcW w:w="1361" w:type="dxa"/>
           </w:tcPr>
           <w:p>
             <w:pPr>
@@ -1535,7 +1810,7 @@
         </w:trPr>
         <w:tc>
           <w:tcPr>
-            <w:tcW w:w="624" w:type="dxa"/>
+            <w:tcW w:w="652" w:type="dxa"/>
             <w:shd w:val="clear" w:color="auto" w:fill="EAF1F8"/>
           </w:tcPr>
           <w:p>
@@ -1557,7 +1832,7 @@
         </w:tc>
         <w:tc>
           <w:tcPr>
-            <w:tcW w:w="3515" w:type="dxa"/>
+            <w:tcW w:w="4224" w:type="dxa"/>
             <w:shd w:val="clear" w:color="auto" w:fill="EAF1F8"/>
           </w:tcPr>
           <w:p>
@@ -1573,12 +1848,62 @@
                 <w:sz w:val="19"/>
               </w:rPr>
               <w:t>插入管（dip tube）采用钩式支撑，接触处形成缝隙；顶部温度计使用长开口插入管，内壁无法清洁。</w:t>
+            </w:r>
+          </w:p>
+          <w:p>
+            <w:pPr>
+              <w:spacing w:before="80" w:after="0" w:line="276" w:lineRule="auto"/>
+            </w:pPr>
+            <w:r>
+              <w:rPr>
+                <w:rFonts w:ascii="Arial" w:hAnsi="Arial" w:eastAsia="微软雅黑"/>
+                <w:b/>
+                <w:i w:val="0"/>
+                <w:color w:val="808080"/>
+                <w:sz w:val="16"/>
+              </w:rPr>
+              <w:t xml:space="preserve">原文 00:25:45  </w:t>
+            </w:r>
+            <w:r>
+              <w:rPr>
+                <w:rFonts w:ascii="Arial" w:hAnsi="Arial" w:eastAsia="微软雅黑"/>
+                <w:b w:val="0"/>
+                <w:i/>
+                <w:color w:val="1F4E79"/>
+                <w:sz w:val="17"/>
+              </w:rPr>
+              <w:t>“So about all those dip tubes supported by hooks instead of just like a straight tube valve so that the hook where it grabs the tube creates a crevice”</w:t>
+            </w:r>
+          </w:p>
+          <w:p>
+            <w:pPr>
+              <w:spacing w:before="80" w:after="0" w:line="276" w:lineRule="auto"/>
+            </w:pPr>
+            <w:r>
+              <w:rPr>
+                <w:rFonts w:ascii="Arial" w:hAnsi="Arial" w:eastAsia="微软雅黑"/>
+                <w:b/>
+                <w:i w:val="0"/>
+                <w:color w:val="808080"/>
+                <w:sz w:val="16"/>
+              </w:rPr>
+              <w:t xml:space="preserve">原文 00:29:00  </w:t>
+            </w:r>
+            <w:r>
+              <w:rPr>
+                <w:rFonts w:ascii="Arial" w:hAnsi="Arial" w:eastAsia="微软雅黑"/>
+                <w:b w:val="0"/>
+                <w:i/>
+                <w:color w:val="1F4E79"/>
+                <w:sz w:val="17"/>
+              </w:rPr>
+              <w:t>“where I saw a lot of these vessels is the temperatures at the top of the tank and requires a super long bit tube to bring it down into solution. And I guess it'd be better, it's also that sealed thermal design. Maybe I can get there. It's an open dip tube that like as you fill the tank, that inside surfaces are gonna fill with your product and then you drain, it will empty, then you're spraying only outside the dip tube. You have no way to clean the inside of it.”</w:t>
             </w:r>
           </w:p>
         </w:tc>
         <w:tc>
           <w:tcPr>
-            <w:tcW w:w="4025" w:type="dxa"/>
+            <w:tcW w:w="3345" w:type="dxa"/>
             <w:shd w:val="clear" w:color="auto" w:fill="EAF1F8"/>
           </w:tcPr>
           <w:p>
@@ -1599,7 +1924,7 @@
         </w:tc>
         <w:tc>
           <w:tcPr>
-            <w:tcW w:w="1417" w:type="dxa"/>
+            <w:tcW w:w="1361" w:type="dxa"/>
             <w:shd w:val="clear" w:color="auto" w:fill="EAF1F8"/>
           </w:tcPr>
           <w:p>
@@ -1659,7 +1984,7 @@
         </w:trPr>
         <w:tc>
           <w:tcPr>
-            <w:tcW w:w="624" w:type="dxa"/>
+            <w:tcW w:w="652" w:type="dxa"/>
           </w:tcPr>
           <w:p>
             <w:pPr>
@@ -1680,7 +2005,7 @@
         </w:tc>
         <w:tc>
           <w:tcPr>
-            <w:tcW w:w="3515" w:type="dxa"/>
+            <w:tcW w:w="4224" w:type="dxa"/>
           </w:tcPr>
           <w:p>
             <w:pPr>
@@ -1695,12 +2020,62 @@
                 <w:sz w:val="19"/>
               </w:rPr>
               <w:t>液位差压变送器采用两个水平外接口加膜盒，罐体排空后水平段仍积液。</w:t>
+            </w:r>
+          </w:p>
+          <w:p>
+            <w:pPr>
+              <w:spacing w:before="80" w:after="0" w:line="276" w:lineRule="auto"/>
+            </w:pPr>
+            <w:r>
+              <w:rPr>
+                <w:rFonts w:ascii="Arial" w:hAnsi="Arial" w:eastAsia="微软雅黑"/>
+                <w:b/>
+                <w:i w:val="0"/>
+                <w:color w:val="808080"/>
+                <w:sz w:val="16"/>
+              </w:rPr>
+              <w:t xml:space="preserve">原文 00:25:45  </w:t>
+            </w:r>
+            <w:r>
+              <w:rPr>
+                <w:rFonts w:ascii="Arial" w:hAnsi="Arial" w:eastAsia="微软雅黑"/>
+                <w:b w:val="0"/>
+                <w:i/>
+                <w:color w:val="1F4E79"/>
+                <w:sz w:val="17"/>
+              </w:rPr>
+              <w:t>“Level transmitters, where there's just a horizontal, two horizontal ports coming outside the tank with a paddle, GP paddle on each one. So there's just gonna be a stagnant horizontal liquid sitting there that, you know, when you drain the tank, you're gonna make a puddle on that. So again, we would typically do like non contact radar on the tank where it's just. I had the vessel and it's just a small probe that comes down and measures that never in contact with the liquid. And if we had to use DP or wanted to use DP for some reason, they make those flush mouth hygienic panels for you actually integrate right into the.”</w:t>
+            </w:r>
+          </w:p>
+          <w:p>
+            <w:pPr>
+              <w:spacing w:before="80" w:after="0" w:line="276" w:lineRule="auto"/>
+            </w:pPr>
+            <w:r>
+              <w:rPr>
+                <w:rFonts w:ascii="Arial" w:hAnsi="Arial" w:eastAsia="微软雅黑"/>
+                <w:b/>
+                <w:i w:val="0"/>
+                <w:color w:val="808080"/>
+                <w:sz w:val="16"/>
+              </w:rPr>
+              <w:t xml:space="preserve">原文 00:29:00  </w:t>
+            </w:r>
+            <w:r>
+              <w:rPr>
+                <w:rFonts w:ascii="Arial" w:hAnsi="Arial" w:eastAsia="微软雅黑"/>
+                <w:b w:val="0"/>
+                <w:i/>
+                <w:color w:val="1F4E79"/>
+                <w:sz w:val="17"/>
+              </w:rPr>
+              <w:t>“weld the panel directly to the tank so that it's just like continuous and smooth with the surface of the tank.”</w:t>
             </w:r>
           </w:p>
         </w:tc>
         <w:tc>
           <w:tcPr>
-            <w:tcW w:w="4025" w:type="dxa"/>
+            <w:tcW w:w="3345" w:type="dxa"/>
           </w:tcPr>
           <w:p>
             <w:pPr>
@@ -1720,7 +2095,7 @@
         </w:tc>
         <w:tc>
           <w:tcPr>
-            <w:tcW w:w="1417" w:type="dxa"/>
+            <w:tcW w:w="1361" w:type="dxa"/>
           </w:tcPr>
           <w:p>
             <w:pPr>
@@ -1779,7 +2154,7 @@
         </w:trPr>
         <w:tc>
           <w:tcPr>
-            <w:tcW w:w="624" w:type="dxa"/>
+            <w:tcW w:w="652" w:type="dxa"/>
             <w:shd w:val="clear" w:color="auto" w:fill="EAF1F8"/>
           </w:tcPr>
           <w:p>
@@ -1801,7 +2176,7 @@
         </w:tc>
         <w:tc>
           <w:tcPr>
-            <w:tcW w:w="3515" w:type="dxa"/>
+            <w:tcW w:w="4224" w:type="dxa"/>
             <w:shd w:val="clear" w:color="auto" w:fill="EAF1F8"/>
           </w:tcPr>
           <w:p>
@@ -1817,12 +2192,37 @@
                 <w:sz w:val="19"/>
               </w:rPr>
               <w:t>低点排放缺失或不可用：过滤器进出口两侧无低点（无法反向吹通滤芯）；已有低点阀口径过小，靠表面张力就排不净。</w:t>
+            </w:r>
+          </w:p>
+          <w:p>
+            <w:pPr>
+              <w:spacing w:before="80" w:after="0" w:line="276" w:lineRule="auto"/>
+            </w:pPr>
+            <w:r>
+              <w:rPr>
+                <w:rFonts w:ascii="Arial" w:hAnsi="Arial" w:eastAsia="微软雅黑"/>
+                <w:b/>
+                <w:i w:val="0"/>
+                <w:color w:val="808080"/>
+                <w:sz w:val="16"/>
+              </w:rPr>
+              <w:t xml:space="preserve">原文 00:25:45  </w:t>
+            </w:r>
+            <w:r>
+              <w:rPr>
+                <w:rFonts w:ascii="Arial" w:hAnsi="Arial" w:eastAsia="微软雅黑"/>
+                <w:b w:val="0"/>
+                <w:i/>
+                <w:color w:val="1F4E79"/>
+                <w:sz w:val="17"/>
+              </w:rPr>
+              <w:t>“Filters where you're not gonna get back through the filter element, like just you're not gonna pressure oftentimes to push it and we would have a low point in the filter inlet or outlet on the other. So again, just a key pumping water low point on either side of it. And even if there was a low point, it was often like one of those little valves, very small. A diameter where sometimes, just like surface tension alone, drain ability through those can be difficult for us to like purge through it.”</w:t>
             </w:r>
           </w:p>
         </w:tc>
         <w:tc>
           <w:tcPr>
-            <w:tcW w:w="4025" w:type="dxa"/>
+            <w:tcW w:w="3345" w:type="dxa"/>
             <w:shd w:val="clear" w:color="auto" w:fill="EAF1F8"/>
           </w:tcPr>
           <w:p>
@@ -1843,7 +2243,7 @@
         </w:tc>
         <w:tc>
           <w:tcPr>
-            <w:tcW w:w="1417" w:type="dxa"/>
+            <w:tcW w:w="1361" w:type="dxa"/>
             <w:shd w:val="clear" w:color="auto" w:fill="EAF1F8"/>
           </w:tcPr>
           <w:p>
@@ -1903,7 +2303,7 @@
         </w:trPr>
         <w:tc>
           <w:tcPr>
-            <w:tcW w:w="624" w:type="dxa"/>
+            <w:tcW w:w="652" w:type="dxa"/>
           </w:tcPr>
           <w:p>
             <w:pPr>
@@ -1924,7 +2324,7 @@
         </w:tc>
         <w:tc>
           <w:tcPr>
-            <w:tcW w:w="3515" w:type="dxa"/>
+            <w:tcW w:w="4224" w:type="dxa"/>
           </w:tcPr>
           <w:p>
             <w:pPr>
@@ -1939,12 +2339,37 @@
                 <w:sz w:val="19"/>
               </w:rPr>
               <w:t>多台流量计安装在不可排空方向（水平安装、腹部朝下）。</w:t>
+            </w:r>
+          </w:p>
+          <w:p>
+            <w:pPr>
+              <w:spacing w:before="80" w:after="0" w:line="276" w:lineRule="auto"/>
+            </w:pPr>
+            <w:r>
+              <w:rPr>
+                <w:rFonts w:ascii="Arial" w:hAnsi="Arial" w:eastAsia="微软雅黑"/>
+                <w:b/>
+                <w:i w:val="0"/>
+                <w:color w:val="808080"/>
+                <w:sz w:val="16"/>
+              </w:rPr>
+              <w:t xml:space="preserve">原文 00:30:09  </w:t>
+            </w:r>
+            <w:r>
+              <w:rPr>
+                <w:rFonts w:ascii="Arial" w:hAnsi="Arial" w:eastAsia="微软雅黑"/>
+                <w:b w:val="0"/>
+                <w:i/>
+                <w:color w:val="1F4E79"/>
+                <w:sz w:val="17"/>
+              </w:rPr>
+              <w:t>“Flow meters, several of them were installed in the non drainable orientations. There's horizontal with the belly or the low points low. So best case scenario in the vertical or possible and if not, at least rotate them 90 degrees”</w:t>
             </w:r>
           </w:p>
         </w:tc>
         <w:tc>
           <w:tcPr>
-            <w:tcW w:w="4025" w:type="dxa"/>
+            <w:tcW w:w="3345" w:type="dxa"/>
           </w:tcPr>
           <w:p>
             <w:pPr>
@@ -1964,7 +2389,7 @@
         </w:tc>
         <w:tc>
           <w:tcPr>
-            <w:tcW w:w="1417" w:type="dxa"/>
+            <w:tcW w:w="1361" w:type="dxa"/>
           </w:tcPr>
           <w:p>
             <w:pPr>
@@ -2007,7 +2432,7 @@
         </w:trPr>
         <w:tc>
           <w:tcPr>
-            <w:tcW w:w="624" w:type="dxa"/>
+            <w:tcW w:w="652" w:type="dxa"/>
             <w:shd w:val="clear" w:color="auto" w:fill="EAF1F8"/>
           </w:tcPr>
           <w:p>
@@ -2029,7 +2454,7 @@
         </w:tc>
         <w:tc>
           <w:tcPr>
-            <w:tcW w:w="3515" w:type="dxa"/>
+            <w:tcW w:w="4224" w:type="dxa"/>
             <w:shd w:val="clear" w:color="auto" w:fill="EAF1F8"/>
           </w:tcPr>
           <w:p>
@@ -2045,12 +2470,37 @@
                 <w:sz w:val="19"/>
               </w:rPr>
               <w:t>Cat 3/4 设备上仍有法兰连接，以及螺栓固定的搅拌桨（不止一台罐，多台存在）。</w:t>
+            </w:r>
+          </w:p>
+          <w:p>
+            <w:pPr>
+              <w:spacing w:before="80" w:after="0" w:line="276" w:lineRule="auto"/>
+            </w:pPr>
+            <w:r>
+              <w:rPr>
+                <w:rFonts w:ascii="Arial" w:hAnsi="Arial" w:eastAsia="微软雅黑"/>
+                <w:b/>
+                <w:i w:val="0"/>
+                <w:color w:val="808080"/>
+                <w:sz w:val="16"/>
+              </w:rPr>
+              <w:t xml:space="preserve">原文 00:30:31  </w:t>
+            </w:r>
+            <w:r>
+              <w:rPr>
+                <w:rFonts w:ascii="Arial" w:hAnsi="Arial" w:eastAsia="微软雅黑"/>
+                <w:b w:val="0"/>
+                <w:i/>
+                <w:color w:val="1F4E79"/>
+                <w:sz w:val="17"/>
+              </w:rPr>
+              <w:t>“Flange connections on category 3, category 4 equipment. Still several bolted agitator blades. So first we thought it was just our five and we found it in some of the diso tank ones. And then we didn't need to go look at all the tanks. So I think just a full validation on those would be helpful.”</w:t>
             </w:r>
           </w:p>
         </w:tc>
         <w:tc>
           <w:tcPr>
-            <w:tcW w:w="4025" w:type="dxa"/>
+            <w:tcW w:w="3345" w:type="dxa"/>
             <w:shd w:val="clear" w:color="auto" w:fill="EAF1F8"/>
           </w:tcPr>
           <w:p>
@@ -2071,7 +2521,7 @@
         </w:tc>
         <w:tc>
           <w:tcPr>
-            <w:tcW w:w="1417" w:type="dxa"/>
+            <w:tcW w:w="1361" w:type="dxa"/>
             <w:shd w:val="clear" w:color="auto" w:fill="EAF1F8"/>
           </w:tcPr>
           <w:p>
@@ -2131,7 +2581,7 @@
         </w:trPr>
         <w:tc>
           <w:tcPr>
-            <w:tcW w:w="624" w:type="dxa"/>
+            <w:tcW w:w="652" w:type="dxa"/>
           </w:tcPr>
           <w:p>
             <w:pPr>
@@ -2152,7 +2602,7 @@
         </w:tc>
         <w:tc>
           <w:tcPr>
-            <w:tcW w:w="3515" w:type="dxa"/>
+            <w:tcW w:w="4224" w:type="dxa"/>
           </w:tcPr>
           <w:p>
             <w:pPr>
@@ -2167,12 +2617,62 @@
                 <w:sz w:val="19"/>
               </w:rPr>
               <w:t>死角普遍存在，未使用零死角阀/无支管三通。典型例：沉淀罐底部排放阀支管；分馏出口两路长三通 —— 先走废液的支管会留存废液，切换后可能把废液段推入主流。</w:t>
+            </w:r>
+          </w:p>
+          <w:p>
+            <w:pPr>
+              <w:spacing w:before="80" w:after="0" w:line="276" w:lineRule="auto"/>
+            </w:pPr>
+            <w:r>
+              <w:rPr>
+                <w:rFonts w:ascii="Arial" w:hAnsi="Arial" w:eastAsia="微软雅黑"/>
+                <w:b/>
+                <w:i w:val="0"/>
+                <w:color w:val="808080"/>
+                <w:sz w:val="16"/>
+              </w:rPr>
+              <w:t xml:space="preserve">原文 00:30:31  </w:t>
+            </w:r>
+            <w:r>
+              <w:rPr>
+                <w:rFonts w:ascii="Arial" w:hAnsi="Arial" w:eastAsia="微软雅黑"/>
+                <w:b w:val="0"/>
+                <w:i/>
+                <w:color w:val="1F4E79"/>
+                <w:sz w:val="17"/>
+              </w:rPr>
+              <w:t>“Dead legs in various locations do. So basically not using the non business teas or zero static valves. So like some obvious ones we saw were like bottom of the precipitation tank that go out, those drain valves. Like you have, you come out of your tank, you have your product flow path coming out of one leg of t, but on the bottom leg of t just be a dead leg going to drain valve.”</w:t>
+            </w:r>
+          </w:p>
+          <w:p>
+            <w:pPr>
+              <w:spacing w:before="80" w:after="0" w:line="276" w:lineRule="auto"/>
+            </w:pPr>
+            <w:r>
+              <w:rPr>
+                <w:rFonts w:ascii="Arial" w:hAnsi="Arial" w:eastAsia="微软雅黑"/>
+                <w:b/>
+                <w:i w:val="0"/>
+                <w:color w:val="808080"/>
+                <w:sz w:val="16"/>
+              </w:rPr>
+              <w:t xml:space="preserve">原文 00:30:31  </w:t>
+            </w:r>
+            <w:r>
+              <w:rPr>
+                <w:rFonts w:ascii="Arial" w:hAnsi="Arial" w:eastAsia="微软雅黑"/>
+                <w:b w:val="0"/>
+                <w:i/>
+                <w:color w:val="1F4E79"/>
+                <w:sz w:val="17"/>
+              </w:rPr>
+              <w:t>“The other place I saw it that wasn't on drain valve like concerning it was like fractions and outlets where you have this, you come up on the tank and you have two paths and you go, here you go. Waste or to mainstream. Those both have long t's on them. So let's say fraction 1 of injection 1, let's say that's going to waste. Now you fill that whole bottom animal, including those effects waste material and you know when you go to change that, you're gonna leave a pocket there. And then now you're gonna go around your second junction, let's say, for whatever reason that qualifies for Main Street. Now you're gonna push a slug of that waste material into your main street.”</w:t>
             </w:r>
           </w:p>
         </w:tc>
         <w:tc>
           <w:tcPr>
-            <w:tcW w:w="4025" w:type="dxa"/>
+            <w:tcW w:w="3345" w:type="dxa"/>
           </w:tcPr>
           <w:p>
             <w:pPr>
@@ -2192,7 +2692,7 @@
         </w:tc>
         <w:tc>
           <w:tcPr>
-            <w:tcW w:w="1417" w:type="dxa"/>
+            <w:tcW w:w="1361" w:type="dxa"/>
           </w:tcPr>
           <w:p>
             <w:pPr>
@@ -2251,7 +2751,7 @@
         </w:trPr>
         <w:tc>
           <w:tcPr>
-            <w:tcW w:w="624" w:type="dxa"/>
+            <w:tcW w:w="652" w:type="dxa"/>
             <w:shd w:val="clear" w:color="auto" w:fill="EAF1F8"/>
           </w:tcPr>
           <w:p>
@@ -2273,7 +2773,7 @@
         </w:tc>
         <w:tc>
           <w:tcPr>
-            <w:tcW w:w="3515" w:type="dxa"/>
+            <w:tcW w:w="4224" w:type="dxa"/>
             <w:shd w:val="clear" w:color="auto" w:fill="EAF1F8"/>
           </w:tcPr>
           <w:p>
@@ -2289,12 +2789,62 @@
                 <w:sz w:val="19"/>
               </w:rPr>
               <w:t>隔膜泵（PD pump）用于产品/促生长溶液管线：内部止回结构导致无法完全排空，出口歧管垂直段必然残留。</w:t>
+            </w:r>
+          </w:p>
+          <w:p>
+            <w:pPr>
+              <w:spacing w:before="80" w:after="0" w:line="276" w:lineRule="auto"/>
+            </w:pPr>
+            <w:r>
+              <w:rPr>
+                <w:rFonts w:ascii="Arial" w:hAnsi="Arial" w:eastAsia="微软雅黑"/>
+                <w:b/>
+                <w:i w:val="0"/>
+                <w:color w:val="808080"/>
+                <w:sz w:val="16"/>
+              </w:rPr>
+              <w:t xml:space="preserve">原文 00:22:17  </w:t>
+            </w:r>
+            <w:r>
+              <w:rPr>
+                <w:rFonts w:ascii="Arial" w:hAnsi="Arial" w:eastAsia="微软雅黑"/>
+                <w:b w:val="0"/>
+                <w:i/>
+                <w:color w:val="1F4E79"/>
+                <w:sz w:val="17"/>
+              </w:rPr>
+              <w:t>“We typically wouldn't install a PD pump cuz even some of those specialized PD pumps, they still have internal checks or mechanisms preventing. Backflow through them for efficiency purposes, but that backflow prevention means that you can't get full drain ability.”</w:t>
+            </w:r>
+          </w:p>
+          <w:p>
+            <w:pPr>
+              <w:spacing w:before="80" w:after="0" w:line="276" w:lineRule="auto"/>
+            </w:pPr>
+            <w:r>
+              <w:rPr>
+                <w:rFonts w:ascii="Arial" w:hAnsi="Arial" w:eastAsia="微软雅黑"/>
+                <w:b/>
+                <w:i w:val="0"/>
+                <w:color w:val="808080"/>
+                <w:sz w:val="16"/>
+              </w:rPr>
+              <w:t xml:space="preserve">原文 00:22:48  </w:t>
+            </w:r>
+            <w:r>
+              <w:rPr>
+                <w:rFonts w:ascii="Arial" w:hAnsi="Arial" w:eastAsia="微软雅黑"/>
+                <w:b w:val="0"/>
+                <w:i/>
+                <w:color w:val="1F4E79"/>
+                <w:sz w:val="17"/>
+              </w:rPr>
+              <w:t>“We talked about before making absolutely certain that every one of those pumps has a low point on the inlet and the outlet, so we can drain as much as possible. And then following those draining activities that we make sure all the operational documents. Booking out the low price. Nitrogen source and kind of blowing nitrogen merging through the pump to let those checks lift and cycle to the low point during the outlet so that we can at least show that we made good faith effort to remove any hold up and leave behind as a minimum residual.”</w:t>
             </w:r>
           </w:p>
         </w:tc>
         <w:tc>
           <w:tcPr>
-            <w:tcW w:w="4025" w:type="dxa"/>
+            <w:tcW w:w="3345" w:type="dxa"/>
             <w:shd w:val="clear" w:color="auto" w:fill="EAF1F8"/>
           </w:tcPr>
           <w:p>
@@ -2315,7 +2865,7 @@
         </w:tc>
         <w:tc>
           <w:tcPr>
-            <w:tcW w:w="1417" w:type="dxa"/>
+            <w:tcW w:w="1361" w:type="dxa"/>
             <w:shd w:val="clear" w:color="auto" w:fill="EAF1F8"/>
           </w:tcPr>
           <w:p>
@@ -2375,7 +2925,7 @@
         </w:trPr>
         <w:tc>
           <w:tcPr>
-            <w:tcW w:w="624" w:type="dxa"/>
+            <w:tcW w:w="652" w:type="dxa"/>
           </w:tcPr>
           <w:p>
             <w:pPr>
@@ -2396,7 +2946,7 @@
         </w:tc>
         <w:tc>
           <w:tcPr>
-            <w:tcW w:w="3515" w:type="dxa"/>
+            <w:tcW w:w="4224" w:type="dxa"/>
           </w:tcPr>
           <w:p>
             <w:pPr>
@@ -2411,12 +2961,62 @@
                 <w:sz w:val="19"/>
               </w:rPr>
               <w:t>客户要求逐条逐线走查：凡促生长溶液、产品接触、清洁溶液管线上出现球阀、法兰、死角，一律整改；确因交期/资源无法整改的，必须 100% 可追溯。</w:t>
+            </w:r>
+          </w:p>
+          <w:p>
+            <w:pPr>
+              <w:spacing w:before="80" w:after="0" w:line="276" w:lineRule="auto"/>
+            </w:pPr>
+            <w:r>
+              <w:rPr>
+                <w:rFonts w:ascii="Arial" w:hAnsi="Arial" w:eastAsia="微软雅黑"/>
+                <w:b/>
+                <w:i w:val="0"/>
+                <w:color w:val="808080"/>
+                <w:sz w:val="16"/>
+              </w:rPr>
+              <w:t xml:space="preserve">原文 00:32:21  </w:t>
+            </w:r>
+            <w:r>
+              <w:rPr>
+                <w:rFonts w:ascii="Arial" w:hAnsi="Arial" w:eastAsia="微软雅黑"/>
+                <w:b w:val="0"/>
+                <w:i/>
+                <w:color w:val="1F4E79"/>
+                <w:sz w:val="17"/>
+              </w:rPr>
+              <w:t>“It's just gonna take someone going painstakingly through the equipment and like just walking every single line down and saying, if I have a broking solution, a product containing solution or cleaning solution, if I run across a ball valve, I need to replace it. If I run across a flange, I need to replace it. If I run across a dead leg.”</w:t>
+            </w:r>
+          </w:p>
+          <w:p>
+            <w:pPr>
+              <w:spacing w:before="80" w:after="0" w:line="276" w:lineRule="auto"/>
+            </w:pPr>
+            <w:r>
+              <w:rPr>
+                <w:rFonts w:ascii="Arial" w:hAnsi="Arial" w:eastAsia="微软雅黑"/>
+                <w:b/>
+                <w:i w:val="0"/>
+                <w:color w:val="808080"/>
+                <w:sz w:val="16"/>
+              </w:rPr>
+              <w:t xml:space="preserve">原文 00:33:32  </w:t>
+            </w:r>
+            <w:r>
+              <w:rPr>
+                <w:rFonts w:ascii="Arial" w:hAnsi="Arial" w:eastAsia="微软雅黑"/>
+                <w:b w:val="0"/>
+                <w:i/>
+                <w:color w:val="1F4E79"/>
+                <w:sz w:val="17"/>
+              </w:rPr>
+              <w:t>“the ones that we actually can't do the lead time or resourcing, whatever we need, right, we're gonna need to make sure we have 100% traceability to those”</w:t>
             </w:r>
           </w:p>
         </w:tc>
         <w:tc>
           <w:tcPr>
-            <w:tcW w:w="4025" w:type="dxa"/>
+            <w:tcW w:w="3345" w:type="dxa"/>
           </w:tcPr>
           <w:p>
             <w:pPr>
@@ -2436,7 +3036,7 @@
         </w:tc>
         <w:tc>
           <w:tcPr>
-            <w:tcW w:w="1417" w:type="dxa"/>
+            <w:tcW w:w="1361" w:type="dxa"/>
           </w:tcPr>
           <w:p>
             <w:pPr>
@@ -2495,7 +3095,7 @@
         </w:trPr>
         <w:tc>
           <w:tcPr>
-            <w:tcW w:w="624" w:type="dxa"/>
+            <w:tcW w:w="652" w:type="dxa"/>
             <w:shd w:val="clear" w:color="auto" w:fill="EAF1F8"/>
           </w:tcPr>
           <w:p>
@@ -2517,7 +3117,7 @@
         </w:tc>
         <w:tc>
           <w:tcPr>
-            <w:tcW w:w="3515" w:type="dxa"/>
+            <w:tcW w:w="4224" w:type="dxa"/>
             <w:shd w:val="clear" w:color="auto" w:fill="EAF1F8"/>
           </w:tcPr>
           <w:p>
@@ -2533,12 +3133,62 @@
                 <w:sz w:val="19"/>
               </w:rPr>
               <w:t>范围判定：Cat 4 覆盖促生长、缓冲液/水基、产品与清洁接触；高有机相可适度放宽。客户强调我方是多产品/多客户共线，即使仅缓冲液系统，最佳实践也不应存在低点。</w:t>
+            </w:r>
+          </w:p>
+          <w:p>
+            <w:pPr>
+              <w:spacing w:before="80" w:after="0" w:line="276" w:lineRule="auto"/>
+            </w:pPr>
+            <w:r>
+              <w:rPr>
+                <w:rFonts w:ascii="Arial" w:hAnsi="Arial" w:eastAsia="微软雅黑"/>
+                <w:b/>
+                <w:i w:val="0"/>
+                <w:color w:val="808080"/>
+                <w:sz w:val="16"/>
+              </w:rPr>
+              <w:t xml:space="preserve">原文 00:34:20  </w:t>
+            </w:r>
+            <w:r>
+              <w:rPr>
+                <w:rFonts w:ascii="Arial" w:hAnsi="Arial" w:eastAsia="微软雅黑"/>
+                <w:b w:val="0"/>
+                <w:i/>
+                <w:color w:val="1F4E79"/>
+                <w:sz w:val="17"/>
+              </w:rPr>
+              <w:t>“if there's any confusion on, hey, does this need to be category 3,4,2,1, right?Just email us as we can clarify it”</w:t>
+            </w:r>
+          </w:p>
+          <w:p>
+            <w:pPr>
+              <w:spacing w:before="80" w:after="0" w:line="276" w:lineRule="auto"/>
+            </w:pPr>
+            <w:r>
+              <w:rPr>
+                <w:rFonts w:ascii="Arial" w:hAnsi="Arial" w:eastAsia="微软雅黑"/>
+                <w:b/>
+                <w:i w:val="0"/>
+                <w:color w:val="808080"/>
+                <w:sz w:val="16"/>
+              </w:rPr>
+              <w:t xml:space="preserve">原文 00:34:20  </w:t>
+            </w:r>
+            <w:r>
+              <w:rPr>
+                <w:rFonts w:ascii="Arial" w:hAnsi="Arial" w:eastAsia="微软雅黑"/>
+                <w:b w:val="0"/>
+                <w:i/>
+                <w:color w:val="1F4E79"/>
+                <w:sz w:val="17"/>
+              </w:rPr>
+              <w:t>“as best practice, even on those non growing buffer only systems, you shouldn't have that low points. You can't do anything because of the fact that you guys are a multi product, multi client system or like, let's say today it's ACN, but tomorrow it needs to be something else.”</w:t>
             </w:r>
           </w:p>
         </w:tc>
         <w:tc>
           <w:tcPr>
-            <w:tcW w:w="4025" w:type="dxa"/>
+            <w:tcW w:w="3345" w:type="dxa"/>
             <w:shd w:val="clear" w:color="auto" w:fill="EAF1F8"/>
           </w:tcPr>
           <w:p>
@@ -2559,7 +3209,7 @@
         </w:tc>
         <w:tc>
           <w:tcPr>
-            <w:tcW w:w="1417" w:type="dxa"/>
+            <w:tcW w:w="1361" w:type="dxa"/>
             <w:shd w:val="clear" w:color="auto" w:fill="EAF1F8"/>
           </w:tcPr>
           <w:p>
@@ -2619,7 +3269,7 @@
         </w:trPr>
         <w:tc>
           <w:tcPr>
-            <w:tcW w:w="624" w:type="dxa"/>
+            <w:tcW w:w="652" w:type="dxa"/>
           </w:tcPr>
           <w:p>
             <w:pPr>
@@ -2640,7 +3290,7 @@
         </w:tc>
         <w:tc>
           <w:tcPr>
-            <w:tcW w:w="3515" w:type="dxa"/>
+            <w:tcW w:w="4224" w:type="dxa"/>
           </w:tcPr>
           <w:p>
             <w:pPr>
@@ -2655,12 +3305,37 @@
                 <w:sz w:val="19"/>
               </w:rPr>
               <w:t>部分法兰因压力容器认证等因素短期难以更换。</w:t>
+            </w:r>
+          </w:p>
+          <w:p>
+            <w:pPr>
+              <w:spacing w:before="80" w:after="0" w:line="276" w:lineRule="auto"/>
+            </w:pPr>
+            <w:r>
+              <w:rPr>
+                <w:rFonts w:ascii="Arial" w:hAnsi="Arial" w:eastAsia="微软雅黑"/>
+                <w:b/>
+                <w:i w:val="0"/>
+                <w:color w:val="808080"/>
+                <w:sz w:val="16"/>
+              </w:rPr>
+              <w:t xml:space="preserve">原文 00:38:19  </w:t>
+            </w:r>
+            <w:r>
+              <w:rPr>
+                <w:rFonts w:ascii="Arial" w:hAnsi="Arial" w:eastAsia="微软雅黑"/>
+                <w:b w:val="0"/>
+                <w:i/>
+                <w:color w:val="1F4E79"/>
+                <w:sz w:val="17"/>
+              </w:rPr>
+              <w:t>“it sounds like that one might be some hurdles to getting done quickly because of some pressure vessel certification hurdles. So if that's one that we have to leave there, then like I would expect that when I pull the clean up in, I see name clean instructions for it, like inspections, etc.”</w:t>
             </w:r>
           </w:p>
         </w:tc>
         <w:tc>
           <w:tcPr>
-            <w:tcW w:w="4025" w:type="dxa"/>
+            <w:tcW w:w="3345" w:type="dxa"/>
           </w:tcPr>
           <w:p>
             <w:pPr>
@@ -2680,7 +3355,7 @@
         </w:tc>
         <w:tc>
           <w:tcPr>
-            <w:tcW w:w="1417" w:type="dxa"/>
+            <w:tcW w:w="1361" w:type="dxa"/>
           </w:tcPr>
           <w:p>
             <w:pPr>
@@ -2739,10 +3414,10 @@
         </w:tblCellMar>
       </w:tblPr>
       <w:tblGrid>
-        <w:gridCol w:w="624"/>
-        <w:gridCol w:w="3515"/>
-        <w:gridCol w:w="4025"/>
-        <w:gridCol w:w="1417"/>
+        <w:gridCol w:w="652"/>
+        <w:gridCol w:w="4224"/>
+        <w:gridCol w:w="3345"/>
+        <w:gridCol w:w="1360"/>
       </w:tblGrid>
       <w:tr>
         <w:tblPrEx>
@@ -2768,7 +3443,7 @@
         </w:trPr>
         <w:tc>
           <w:tcPr>
-            <w:tcW w:w="624" w:type="dxa"/>
+            <w:tcW w:w="652" w:type="dxa"/>
             <w:shd w:val="clear" w:color="auto" w:fill="1F4E79"/>
           </w:tcPr>
           <w:p>
@@ -2790,7 +3465,7 @@
         </w:tc>
         <w:tc>
           <w:tcPr>
-            <w:tcW w:w="3515" w:type="dxa"/>
+            <w:tcW w:w="4224" w:type="dxa"/>
             <w:shd w:val="clear" w:color="auto" w:fill="1F4E79"/>
           </w:tcPr>
           <w:p>
@@ -2812,7 +3487,7 @@
         </w:tc>
         <w:tc>
           <w:tcPr>
-            <w:tcW w:w="4025" w:type="dxa"/>
+            <w:tcW w:w="3345" w:type="dxa"/>
             <w:shd w:val="clear" w:color="auto" w:fill="1F4E79"/>
           </w:tcPr>
           <w:p>
@@ -2834,7 +3509,7 @@
         </w:tc>
         <w:tc>
           <w:tcPr>
-            <w:tcW w:w="1417" w:type="dxa"/>
+            <w:tcW w:w="1361" w:type="dxa"/>
             <w:shd w:val="clear" w:color="auto" w:fill="1F4E79"/>
           </w:tcPr>
           <w:p>
@@ -2878,7 +3553,7 @@
         </w:trPr>
         <w:tc>
           <w:tcPr>
-            <w:tcW w:w="624" w:type="dxa"/>
+            <w:tcW w:w="652" w:type="dxa"/>
           </w:tcPr>
           <w:p>
             <w:pPr>
@@ -2899,7 +3574,7 @@
         </w:tc>
         <w:tc>
           <w:tcPr>
-            <w:tcW w:w="3515" w:type="dxa"/>
+            <w:tcW w:w="4224" w:type="dxa"/>
           </w:tcPr>
           <w:p>
             <w:pPr>
@@ -2914,12 +3589,37 @@
                 <w:sz w:val="19"/>
               </w:rPr>
               <w:t>长总管（header）在各用户点无隔离阀：向某个罐送水时，其余支管形成盲段积水且无法排出。</w:t>
+            </w:r>
+          </w:p>
+          <w:p>
+            <w:pPr>
+              <w:spacing w:before="80" w:after="0" w:line="276" w:lineRule="auto"/>
+            </w:pPr>
+            <w:r>
+              <w:rPr>
+                <w:rFonts w:ascii="Arial" w:hAnsi="Arial" w:eastAsia="微软雅黑"/>
+                <w:b/>
+                <w:i w:val="0"/>
+                <w:color w:val="808080"/>
+                <w:sz w:val="16"/>
+              </w:rPr>
+              <w:t xml:space="preserve">原文 00:42:03  </w:t>
+            </w:r>
+            <w:r>
+              <w:rPr>
+                <w:rFonts w:ascii="Arial" w:hAnsi="Arial" w:eastAsia="微软雅黑"/>
+                <w:b w:val="0"/>
+                <w:i/>
+                <w:color w:val="1F4E79"/>
+                <w:sz w:val="17"/>
+              </w:rPr>
+              <w:t>“when we have these large headers. There are sometimes they had multiple client tanks, but we had no isolation on each individual one. So let's say you were trying to feed water to ATO 4 to get ATO 4, it passed a header and there was all these big deadlights down to all the clients. Those will fill with water and you have no way of getting it out right now. So I think at a minimum, we said it is. The headers need to be redesigned to have isolation valves at each client”</w:t>
             </w:r>
           </w:p>
         </w:tc>
         <w:tc>
           <w:tcPr>
-            <w:tcW w:w="4025" w:type="dxa"/>
+            <w:tcW w:w="3345" w:type="dxa"/>
           </w:tcPr>
           <w:p>
             <w:pPr>
@@ -2939,7 +3639,7 @@
         </w:tc>
         <w:tc>
           <w:tcPr>
-            <w:tcW w:w="1417" w:type="dxa"/>
+            <w:tcW w:w="1361" w:type="dxa"/>
           </w:tcPr>
           <w:p>
             <w:pPr>
@@ -2998,7 +3698,7 @@
         </w:trPr>
         <w:tc>
           <w:tcPr>
-            <w:tcW w:w="624" w:type="dxa"/>
+            <w:tcW w:w="652" w:type="dxa"/>
             <w:shd w:val="clear" w:color="auto" w:fill="EAF1F8"/>
           </w:tcPr>
           <w:p>
@@ -3020,7 +3720,7 @@
         </w:tc>
         <w:tc>
           <w:tcPr>
-            <w:tcW w:w="3515" w:type="dxa"/>
+            <w:tcW w:w="4224" w:type="dxa"/>
             <w:shd w:val="clear" w:color="auto" w:fill="EAF1F8"/>
           </w:tcPr>
           <w:p>
@@ -3036,12 +3736,62 @@
                 <w:sz w:val="19"/>
               </w:rPr>
               <w:t>各用户点无排放阀，使用前无法冲洗排废，使用后管内残水长期滞留。</w:t>
+            </w:r>
+          </w:p>
+          <w:p>
+            <w:pPr>
+              <w:spacing w:before="80" w:after="0" w:line="276" w:lineRule="auto"/>
+            </w:pPr>
+            <w:r>
+              <w:rPr>
+                <w:rFonts w:ascii="Arial" w:hAnsi="Arial" w:eastAsia="微软雅黑"/>
+                <w:b/>
+                <w:i w:val="0"/>
+                <w:color w:val="808080"/>
+                <w:sz w:val="16"/>
+              </w:rPr>
+              <w:t xml:space="preserve">原文 00:42:03  </w:t>
+            </w:r>
+            <w:r>
+              <w:rPr>
+                <w:rFonts w:ascii="Arial" w:hAnsi="Arial" w:eastAsia="微软雅黑"/>
+                <w:b w:val="0"/>
+                <w:i/>
+                <w:color w:val="1F4E79"/>
+                <w:sz w:val="17"/>
+              </w:rPr>
+              <w:t>“And then we also said at each client, we need a drain valve where you can do a pre use flush to waste out the drain valve before you supply the tank.”</w:t>
+            </w:r>
+          </w:p>
+          <w:p>
+            <w:pPr>
+              <w:spacing w:before="80" w:after="0" w:line="276" w:lineRule="auto"/>
+            </w:pPr>
+            <w:r>
+              <w:rPr>
+                <w:rFonts w:ascii="Arial" w:hAnsi="Arial" w:eastAsia="微软雅黑"/>
+                <w:b/>
+                <w:i w:val="0"/>
+                <w:color w:val="808080"/>
+                <w:sz w:val="16"/>
+              </w:rPr>
+              <w:t xml:space="preserve">原文 00:44:36  </w:t>
+            </w:r>
+            <w:r>
+              <w:rPr>
+                <w:rFonts w:ascii="Arial" w:hAnsi="Arial" w:eastAsia="微软雅黑"/>
+                <w:b w:val="0"/>
+                <w:i/>
+                <w:color w:val="1F4E79"/>
+                <w:sz w:val="17"/>
+              </w:rPr>
+              <w:t>“Get rid of all the links on the water system. Give yourself a way to do. Reuse, flush and give yourself a way to, when you're done using it and that whole line is just still sitting, for water to blow it to that new drain and empty it out.”</w:t>
             </w:r>
           </w:p>
         </w:tc>
         <w:tc>
           <w:tcPr>
-            <w:tcW w:w="4025" w:type="dxa"/>
+            <w:tcW w:w="3345" w:type="dxa"/>
             <w:shd w:val="clear" w:color="auto" w:fill="EAF1F8"/>
           </w:tcPr>
           <w:p>
@@ -3062,7 +3812,7 @@
         </w:tc>
         <w:tc>
           <w:tcPr>
-            <w:tcW w:w="1417" w:type="dxa"/>
+            <w:tcW w:w="1361" w:type="dxa"/>
             <w:shd w:val="clear" w:color="auto" w:fill="EAF1F8"/>
           </w:tcPr>
           <w:p>
@@ -3122,7 +3872,7 @@
         </w:trPr>
         <w:tc>
           <w:tcPr>
-            <w:tcW w:w="624" w:type="dxa"/>
+            <w:tcW w:w="652" w:type="dxa"/>
           </w:tcPr>
           <w:p>
             <w:pPr>
@@ -3143,7 +3893,7 @@
         </w:tc>
         <w:tc>
           <w:tcPr>
-            <w:tcW w:w="3515" w:type="dxa"/>
+            <w:tcW w:w="4224" w:type="dxa"/>
           </w:tcPr>
           <w:p>
             <w:pPr>
@@ -3158,12 +3908,62 @@
                 <w:sz w:val="19"/>
               </w:rPr>
               <w:t>取样点远离使用点，缺少使用点（point of use）水质数据，无法直接证明供某罐的水符合质量要求。</w:t>
+            </w:r>
+          </w:p>
+          <w:p>
+            <w:pPr>
+              <w:spacing w:before="80" w:after="0" w:line="276" w:lineRule="auto"/>
+            </w:pPr>
+            <w:r>
+              <w:rPr>
+                <w:rFonts w:ascii="Arial" w:hAnsi="Arial" w:eastAsia="微软雅黑"/>
+                <w:b/>
+                <w:i w:val="0"/>
+                <w:color w:val="808080"/>
+                <w:sz w:val="16"/>
+              </w:rPr>
+              <w:t xml:space="preserve">原文 00:42:03  </w:t>
+            </w:r>
+            <w:r>
+              <w:rPr>
+                <w:rFonts w:ascii="Arial" w:hAnsi="Arial" w:eastAsia="微软雅黑"/>
+                <w:b w:val="0"/>
+                <w:i/>
+                <w:color w:val="1F4E79"/>
+                <w:sz w:val="17"/>
+              </w:rPr>
+              <w:t>“purified water, the fact that like our sample point is over here and then we have these super long headers so we don't have actual sample data at the point of use.”</w:t>
+            </w:r>
+          </w:p>
+          <w:p>
+            <w:pPr>
+              <w:spacing w:before="80" w:after="0" w:line="276" w:lineRule="auto"/>
+            </w:pPr>
+            <w:r>
+              <w:rPr>
+                <w:rFonts w:ascii="Arial" w:hAnsi="Arial" w:eastAsia="微软雅黑"/>
+                <w:b/>
+                <w:i w:val="0"/>
+                <w:color w:val="808080"/>
+                <w:sz w:val="16"/>
+              </w:rPr>
+              <w:t xml:space="preserve">原文 00:43:21  </w:t>
+            </w:r>
+            <w:r>
+              <w:rPr>
+                <w:rFonts w:ascii="Arial" w:hAnsi="Arial" w:eastAsia="微软雅黑"/>
+                <w:b w:val="0"/>
+                <w:i/>
+                <w:color w:val="1F4E79"/>
+                <w:sz w:val="17"/>
+              </w:rPr>
+              <w:t>“That is your point of use, that's what's representative of your tank. That's where the purified water validation sample point should be”</w:t>
             </w:r>
           </w:p>
         </w:tc>
         <w:tc>
           <w:tcPr>
-            <w:tcW w:w="4025" w:type="dxa"/>
+            <w:tcW w:w="3345" w:type="dxa"/>
           </w:tcPr>
           <w:p>
             <w:pPr>
@@ -3183,7 +3983,7 @@
         </w:tc>
         <w:tc>
           <w:tcPr>
-            <w:tcW w:w="1417" w:type="dxa"/>
+            <w:tcW w:w="1361" w:type="dxa"/>
           </w:tcPr>
           <w:p>
             <w:pPr>
@@ -3242,7 +4042,7 @@
         </w:trPr>
         <w:tc>
           <w:tcPr>
-            <w:tcW w:w="624" w:type="dxa"/>
+            <w:tcW w:w="652" w:type="dxa"/>
             <w:shd w:val="clear" w:color="auto" w:fill="EAF1F8"/>
           </w:tcPr>
           <w:p>
@@ -3264,7 +4064,7 @@
         </w:tc>
         <w:tc>
           <w:tcPr>
-            <w:tcW w:w="3515" w:type="dxa"/>
+            <w:tcW w:w="4224" w:type="dxa"/>
             <w:shd w:val="clear" w:color="auto" w:fill="EAF1F8"/>
           </w:tcPr>
           <w:p>
@@ -3280,12 +4080,62 @@
                 <w:sz w:val="19"/>
               </w:rPr>
               <w:t>客户介绍其验证方式：三阶段验证（Phase 1/2 每日监测、Phase 3 每周/每月），逐点检测（TOC、电导、内毒素、微生物、硝酸盐等）；日常生产按周期取样，不需每次使用取样。改造后若无法立即完成完整验证，可采用简化验证（数天/数周数据）、抓取样品或同步验证并附论证。</w:t>
+            </w:r>
+          </w:p>
+          <w:p>
+            <w:pPr>
+              <w:spacing w:before="80" w:after="0" w:line="276" w:lineRule="auto"/>
+            </w:pPr>
+            <w:r>
+              <w:rPr>
+                <w:rFonts w:ascii="Arial" w:hAnsi="Arial" w:eastAsia="微软雅黑"/>
+                <w:b/>
+                <w:i w:val="0"/>
+                <w:color w:val="808080"/>
+                <w:sz w:val="16"/>
+              </w:rPr>
+              <w:t xml:space="preserve">原文 00:46:43  </w:t>
+            </w:r>
+            <w:r>
+              <w:rPr>
+                <w:rFonts w:ascii="Arial" w:hAnsi="Arial" w:eastAsia="微软雅黑"/>
+                <w:b w:val="0"/>
+                <w:i/>
+                <w:color w:val="1F4E79"/>
+                <w:sz w:val="17"/>
+              </w:rPr>
+              <w:t>“in the States, it's a three phase approach where you're each phase is a different length and you're monitoring like daily during phase 1 and phase 2. But then you're monitoring weekly or monthly in Phase 3, and you're checking that each sample point meets the purified water specification or GMC, endotoxin connectivity, GOC nitrate, etc. So ideally we'd all time around before we ever made any medicine there you read, I mean, go put the system through a phase 1 and phase 2 validation. Show that each of those sample points passes. And then during routine production, you would just do what you do on every other sample point where it's what monthly, my guess is how much you sample. So you don't have to sample for every single use. You just have to validate use point and sample.”</w:t>
+            </w:r>
+          </w:p>
+          <w:p>
+            <w:pPr>
+              <w:spacing w:before="80" w:after="0" w:line="276" w:lineRule="auto"/>
+            </w:pPr>
+            <w:r>
+              <w:rPr>
+                <w:rFonts w:ascii="Arial" w:hAnsi="Arial" w:eastAsia="微软雅黑"/>
+                <w:b/>
+                <w:i w:val="0"/>
+                <w:color w:val="808080"/>
+                <w:sz w:val="16"/>
+              </w:rPr>
+              <w:t xml:space="preserve">原文 00:48:31  </w:t>
+            </w:r>
+            <w:r>
+              <w:rPr>
+                <w:rFonts w:ascii="Arial" w:hAnsi="Arial" w:eastAsia="微软雅黑"/>
+                <w:b w:val="0"/>
+                <w:i/>
+                <w:color w:val="1F4E79"/>
+                <w:sz w:val="17"/>
+              </w:rPr>
+              <w:t>“For the short term, I was recommending is if you can't get a whole validation done for these new ones. Maybe at least like whole 3 days worth of data or weeks worth of data, some abbreviated validation to give us confidence until we can go do the longer validation or maybe do like a concurrent validation sort of thing.”</w:t>
             </w:r>
           </w:p>
         </w:tc>
         <w:tc>
           <w:tcPr>
-            <w:tcW w:w="4025" w:type="dxa"/>
+            <w:tcW w:w="3345" w:type="dxa"/>
             <w:shd w:val="clear" w:color="auto" w:fill="EAF1F8"/>
           </w:tcPr>
           <w:p>
@@ -3306,7 +4156,7 @@
         </w:tc>
         <w:tc>
           <w:tcPr>
-            <w:tcW w:w="1417" w:type="dxa"/>
+            <w:tcW w:w="1361" w:type="dxa"/>
             <w:shd w:val="clear" w:color="auto" w:fill="EAF1F8"/>
           </w:tcPr>
           <w:p>
@@ -3366,7 +4216,7 @@
         </w:trPr>
         <w:tc>
           <w:tcPr>
-            <w:tcW w:w="624" w:type="dxa"/>
+            <w:tcW w:w="652" w:type="dxa"/>
           </w:tcPr>
           <w:p>
             <w:pPr>
@@ -3387,7 +4237,7 @@
         </w:tc>
         <w:tc>
           <w:tcPr>
-            <w:tcW w:w="3515" w:type="dxa"/>
+            <w:tcW w:w="4224" w:type="dxa"/>
           </w:tcPr>
           <w:p>
             <w:pPr>
@@ -3402,12 +4252,62 @@
                 <w:sz w:val="19"/>
               </w:rPr>
               <w:t>使用点水过滤器：促生长溶液管线（如 R05，软管长期存放在 CNC 区）应设使用点过滤器；非促生长管线不建议设置（过滤器本身带风险）。客户同时质疑过滤器可在线放置多久不更换。</w:t>
+            </w:r>
+          </w:p>
+          <w:p>
+            <w:pPr>
+              <w:spacing w:before="80" w:after="0" w:line="276" w:lineRule="auto"/>
+            </w:pPr>
+            <w:r>
+              <w:rPr>
+                <w:rFonts w:ascii="Arial" w:hAnsi="Arial" w:eastAsia="微软雅黑"/>
+                <w:b/>
+                <w:i w:val="0"/>
+                <w:color w:val="808080"/>
+                <w:sz w:val="16"/>
+              </w:rPr>
+              <w:t xml:space="preserve">原文 00:45:15  </w:t>
+            </w:r>
+            <w:r>
+              <w:rPr>
+                <w:rFonts w:ascii="Arial" w:hAnsi="Arial" w:eastAsia="微软雅黑"/>
+                <w:b w:val="0"/>
+                <w:i/>
+                <w:color w:val="1F4E79"/>
+                <w:sz w:val="17"/>
+              </w:rPr>
+              <w:t>“I was when we were looking at our 0,5, which is a growth promoting solution, there was no point of use water filter on that line. So. I think our practice would be filters on water lines inherently can have some risk associated with them. So we don't want to use them if we're going into a non recording solution. It's not worth the risk. But when we are going into a growth growing solution like that, our 05 time we want to point use over there because you're gonna hook up this hose that's been sitting in a CNC space. And I always want that filter to try to catch whatever we can.”</w:t>
+            </w:r>
+          </w:p>
+          <w:p>
+            <w:pPr>
+              <w:spacing w:before="80" w:after="0" w:line="276" w:lineRule="auto"/>
+            </w:pPr>
+            <w:r>
+              <w:rPr>
+                <w:rFonts w:ascii="Arial" w:hAnsi="Arial" w:eastAsia="微软雅黑"/>
+                <w:b/>
+                <w:i w:val="0"/>
+                <w:color w:val="808080"/>
+                <w:sz w:val="16"/>
+              </w:rPr>
+              <w:t xml:space="preserve">原文 00:45:15  </w:t>
+            </w:r>
+            <w:r>
+              <w:rPr>
+                <w:rFonts w:ascii="Arial" w:hAnsi="Arial" w:eastAsia="微软雅黑"/>
+                <w:b w:val="0"/>
+                <w:i/>
+                <w:color w:val="1F4E79"/>
+                <w:sz w:val="17"/>
+              </w:rPr>
+              <w:t>“we were unclear on like how long can that water filter sit there without being replaced?Because to me it'd be like, you don't want to go any longer than, say, 24 hours”</w:t>
             </w:r>
           </w:p>
         </w:tc>
         <w:tc>
           <w:tcPr>
-            <w:tcW w:w="4025" w:type="dxa"/>
+            <w:tcW w:w="3345" w:type="dxa"/>
           </w:tcPr>
           <w:p>
             <w:pPr>
@@ -3427,7 +4327,7 @@
         </w:tc>
         <w:tc>
           <w:tcPr>
-            <w:tcW w:w="1417" w:type="dxa"/>
+            <w:tcW w:w="1361" w:type="dxa"/>
           </w:tcPr>
           <w:p>
             <w:pPr>
@@ -3486,7 +4386,7 @@
         </w:trPr>
         <w:tc>
           <w:tcPr>
-            <w:tcW w:w="624" w:type="dxa"/>
+            <w:tcW w:w="652" w:type="dxa"/>
             <w:shd w:val="clear" w:color="auto" w:fill="EAF1F8"/>
           </w:tcPr>
           <w:p>
@@ -3508,7 +4408,7 @@
         </w:tc>
         <w:tc>
           <w:tcPr>
-            <w:tcW w:w="3515" w:type="dxa"/>
+            <w:tcW w:w="4224" w:type="dxa"/>
             <w:shd w:val="clear" w:color="auto" w:fill="EAF1F8"/>
           </w:tcPr>
           <w:p>
@@ -3524,12 +4424,37 @@
                 <w:sz w:val="19"/>
               </w:rPr>
               <w:t>客户已提供水系统相关指南文件，其中列有具体期望案例，要求我方对照阅读。</w:t>
+            </w:r>
+          </w:p>
+          <w:p>
+            <w:pPr>
+              <w:spacing w:before="80" w:after="0" w:line="276" w:lineRule="auto"/>
+            </w:pPr>
+            <w:r>
+              <w:rPr>
+                <w:rFonts w:ascii="Arial" w:hAnsi="Arial" w:eastAsia="微软雅黑"/>
+                <w:b/>
+                <w:i w:val="0"/>
+                <w:color w:val="808080"/>
+                <w:sz w:val="16"/>
+              </w:rPr>
+              <w:t xml:space="preserve">原文 00:44:56  </w:t>
+            </w:r>
+            <w:r>
+              <w:rPr>
+                <w:rFonts w:ascii="Arial" w:hAnsi="Arial" w:eastAsia="微软雅黑"/>
+                <w:b w:val="0"/>
+                <w:i/>
+                <w:color w:val="1F4E79"/>
+                <w:sz w:val="17"/>
+              </w:rPr>
+              <w:t>“I shared the highest PE guidance. So if you pull that up and read, that walks through these very specific examples of what they expect.”</w:t>
             </w:r>
           </w:p>
         </w:tc>
         <w:tc>
           <w:tcPr>
-            <w:tcW w:w="4025" w:type="dxa"/>
+            <w:tcW w:w="3345" w:type="dxa"/>
             <w:shd w:val="clear" w:color="auto" w:fill="EAF1F8"/>
           </w:tcPr>
           <w:p>
@@ -3550,7 +4475,7 @@
         </w:tc>
         <w:tc>
           <w:tcPr>
-            <w:tcW w:w="1417" w:type="dxa"/>
+            <w:tcW w:w="1361" w:type="dxa"/>
             <w:shd w:val="clear" w:color="auto" w:fill="EAF1F8"/>
           </w:tcPr>
           <w:p>
@@ -3610,10 +4535,10 @@
         </w:tblCellMar>
       </w:tblPr>
       <w:tblGrid>
-        <w:gridCol w:w="624"/>
-        <w:gridCol w:w="3515"/>
-        <w:gridCol w:w="4025"/>
-        <w:gridCol w:w="1417"/>
+        <w:gridCol w:w="652"/>
+        <w:gridCol w:w="4224"/>
+        <w:gridCol w:w="3345"/>
+        <w:gridCol w:w="1360"/>
       </w:tblGrid>
       <w:tr>
         <w:tblPrEx>
@@ -3639,7 +4564,7 @@
         </w:trPr>
         <w:tc>
           <w:tcPr>
-            <w:tcW w:w="624" w:type="dxa"/>
+            <w:tcW w:w="652" w:type="dxa"/>
             <w:shd w:val="clear" w:color="auto" w:fill="1F4E79"/>
           </w:tcPr>
           <w:p>
@@ -3661,7 +4586,7 @@
         </w:tc>
         <w:tc>
           <w:tcPr>
-            <w:tcW w:w="3515" w:type="dxa"/>
+            <w:tcW w:w="4224" w:type="dxa"/>
             <w:shd w:val="clear" w:color="auto" w:fill="1F4E79"/>
           </w:tcPr>
           <w:p>
@@ -3683,7 +4608,7 @@
         </w:tc>
         <w:tc>
           <w:tcPr>
-            <w:tcW w:w="4025" w:type="dxa"/>
+            <w:tcW w:w="3345" w:type="dxa"/>
             <w:shd w:val="clear" w:color="auto" w:fill="1F4E79"/>
           </w:tcPr>
           <w:p>
@@ -3705,7 +4630,7 @@
         </w:tc>
         <w:tc>
           <w:tcPr>
-            <w:tcW w:w="1417" w:type="dxa"/>
+            <w:tcW w:w="1361" w:type="dxa"/>
             <w:shd w:val="clear" w:color="auto" w:fill="1F4E79"/>
           </w:tcPr>
           <w:p>
@@ -3749,7 +4674,7 @@
         </w:trPr>
         <w:tc>
           <w:tcPr>
-            <w:tcW w:w="624" w:type="dxa"/>
+            <w:tcW w:w="652" w:type="dxa"/>
           </w:tcPr>
           <w:p>
             <w:pPr>
@@ -3770,7 +4695,7 @@
         </w:tc>
         <w:tc>
           <w:tcPr>
-            <w:tcW w:w="3515" w:type="dxa"/>
+            <w:tcW w:w="4224" w:type="dxa"/>
           </w:tcPr>
           <w:p>
             <w:pPr>
@@ -3785,12 +4710,62 @@
                 <w:sz w:val="19"/>
               </w:rPr>
               <w:t>物料进入厂房的路径缺乏控制：存在由室外直接进入 CNC 区的门、无气锁，污染风险高。客户列为较高优先级。</w:t>
+            </w:r>
+          </w:p>
+          <w:p>
+            <w:pPr>
+              <w:spacing w:before="80" w:after="0" w:line="276" w:lineRule="auto"/>
+            </w:pPr>
+            <w:r>
+              <w:rPr>
+                <w:rFonts w:ascii="Arial" w:hAnsi="Arial" w:eastAsia="微软雅黑"/>
+                <w:b/>
+                <w:i w:val="0"/>
+                <w:color w:val="808080"/>
+                <w:sz w:val="16"/>
+              </w:rPr>
+              <w:t xml:space="preserve">原文 00:07:42  </w:t>
+            </w:r>
+            <w:r>
+              <w:rPr>
+                <w:rFonts w:ascii="Arial" w:hAnsi="Arial" w:eastAsia="微软雅黑"/>
+                <w:b w:val="0"/>
+                <w:i/>
+                <w:color w:val="1F4E79"/>
+                <w:sz w:val="17"/>
+              </w:rPr>
+              <w:t>“We were visiting your route for bringing materials in the building, have concerns around the lack of control around management of that material flow. So there's this place, the door to the outside directly in the C C space. That will be offered or airwalk, so there's probably some risk of contamination risk in this place that would be evaluated.”</w:t>
+            </w:r>
+          </w:p>
+          <w:p>
+            <w:pPr>
+              <w:spacing w:before="80" w:after="0" w:line="276" w:lineRule="auto"/>
+            </w:pPr>
+            <w:r>
+              <w:rPr>
+                <w:rFonts w:ascii="Arial" w:hAnsi="Arial" w:eastAsia="微软雅黑"/>
+                <w:b/>
+                <w:i w:val="0"/>
+                <w:color w:val="808080"/>
+                <w:sz w:val="16"/>
+              </w:rPr>
+              <w:t xml:space="preserve">原文 00:08:46  </w:t>
+            </w:r>
+            <w:r>
+              <w:rPr>
+                <w:rFonts w:ascii="Arial" w:hAnsi="Arial" w:eastAsia="微软雅黑"/>
+                <w:b w:val="0"/>
+                <w:i/>
+                <w:color w:val="1F4E79"/>
+                <w:sz w:val="17"/>
+              </w:rPr>
+              <w:t>“I think your new design, you share this be a better design for new building. To have an airline with the pressure.”</w:t>
             </w:r>
           </w:p>
         </w:tc>
         <w:tc>
           <w:tcPr>
-            <w:tcW w:w="4025" w:type="dxa"/>
+            <w:tcW w:w="3345" w:type="dxa"/>
           </w:tcPr>
           <w:p>
             <w:pPr>
@@ -3810,7 +4785,7 @@
         </w:tc>
         <w:tc>
           <w:tcPr>
-            <w:tcW w:w="1417" w:type="dxa"/>
+            <w:tcW w:w="1361" w:type="dxa"/>
           </w:tcPr>
           <w:p>
             <w:pPr>
@@ -3869,7 +4844,7 @@
         </w:trPr>
         <w:tc>
           <w:tcPr>
-            <w:tcW w:w="624" w:type="dxa"/>
+            <w:tcW w:w="652" w:type="dxa"/>
             <w:shd w:val="clear" w:color="auto" w:fill="EAF1F8"/>
           </w:tcPr>
           <w:p>
@@ -3891,7 +4866,7 @@
         </w:tc>
         <w:tc>
           <w:tcPr>
-            <w:tcW w:w="3515" w:type="dxa"/>
+            <w:tcW w:w="4224" w:type="dxa"/>
             <w:shd w:val="clear" w:color="auto" w:fill="EAF1F8"/>
           </w:tcPr>
           <w:p>
@@ -3907,12 +4882,62 @@
                 <w:sz w:val="19"/>
               </w:rPr>
               <w:t>投料方式：客户期望尽可能密闭投料。现状举例 —— R05 加碱液使用扎带固定的敞开料斗接普通蝶阀，投料后料斗残留、蝶阀上侧积粉；位于多产品共用 CNC 区、操作工无防护，散落物可能经气锁带入洁净区。客户强调这更多是环境与交叉污染风险。</w:t>
+            </w:r>
+          </w:p>
+          <w:p>
+            <w:pPr>
+              <w:spacing w:before="80" w:after="0" w:line="276" w:lineRule="auto"/>
+            </w:pPr>
+            <w:r>
+              <w:rPr>
+                <w:rFonts w:ascii="Arial" w:hAnsi="Arial" w:eastAsia="微软雅黑"/>
+                <w:b/>
+                <w:i w:val="0"/>
+                <w:color w:val="808080"/>
+                <w:sz w:val="16"/>
+              </w:rPr>
+              <w:t xml:space="preserve">原文 00:56:58  </w:t>
+            </w:r>
+            <w:r>
+              <w:rPr>
+                <w:rFonts w:ascii="Arial" w:hAnsi="Arial" w:eastAsia="微软雅黑"/>
+                <w:b w:val="0"/>
+                <w:i/>
+                <w:color w:val="1F4E79"/>
+                <w:sz w:val="17"/>
+              </w:rPr>
+              <w:t>“the example of the situation that we used to say was R05. To charge the trust base. That's just gonna be a zip tie with an open try frame on a normal butterfly valve. So after you do that charging, you're gonna go disconnected and any residual in the shoe has a potential. And then you're gonna have the top side of the butterfly valve that's gonna have power just on it. So, and then that's a CNC space where you could be running other products and. It's where the operators don't have any overguard, so that any exposure can land on the ground, which then could have some risk to classified spaces if they bring containing down into those airlocks.”</w:t>
+            </w:r>
+          </w:p>
+          <w:p>
+            <w:pPr>
+              <w:spacing w:before="80" w:after="0" w:line="276" w:lineRule="auto"/>
+            </w:pPr>
+            <w:r>
+              <w:rPr>
+                <w:rFonts w:ascii="Arial" w:hAnsi="Arial" w:eastAsia="微软雅黑"/>
+                <w:b/>
+                <w:i w:val="0"/>
+                <w:color w:val="808080"/>
+                <w:sz w:val="16"/>
+              </w:rPr>
+              <w:t xml:space="preserve">原文 00:55:47  </w:t>
+            </w:r>
+            <w:r>
+              <w:rPr>
+                <w:rFonts w:ascii="Arial" w:hAnsi="Arial" w:eastAsia="微软雅黑"/>
+                <w:b w:val="0"/>
+                <w:i/>
+                <w:color w:val="1F4E79"/>
+                <w:sz w:val="17"/>
+              </w:rPr>
+              <w:t>“definitely product quality concerns, more environment concern, especially given that these are multi product environments.”</w:t>
             </w:r>
           </w:p>
         </w:tc>
         <w:tc>
           <w:tcPr>
-            <w:tcW w:w="4025" w:type="dxa"/>
+            <w:tcW w:w="3345" w:type="dxa"/>
             <w:shd w:val="clear" w:color="auto" w:fill="EAF1F8"/>
           </w:tcPr>
           <w:p>
@@ -3933,7 +4958,7 @@
         </w:tc>
         <w:tc>
           <w:tcPr>
-            <w:tcW w:w="1417" w:type="dxa"/>
+            <w:tcW w:w="1361" w:type="dxa"/>
             <w:shd w:val="clear" w:color="auto" w:fill="EAF1F8"/>
           </w:tcPr>
           <w:p>
@@ -3993,7 +5018,7 @@
         </w:trPr>
         <w:tc>
           <w:tcPr>
-            <w:tcW w:w="624" w:type="dxa"/>
+            <w:tcW w:w="652" w:type="dxa"/>
           </w:tcPr>
           <w:p>
             <w:pPr>
@@ -4014,7 +5039,7 @@
         </w:tc>
         <w:tc>
           <w:tcPr>
-            <w:tcW w:w="3515" w:type="dxa"/>
+            <w:tcW w:w="4224" w:type="dxa"/>
           </w:tcPr>
           <w:p>
             <w:pPr>
@@ -4029,12 +5054,62 @@
                 <w:sz w:val="19"/>
               </w:rPr>
               <w:t>现场目视化与防护不足：软管端头可能落在储存架下方地面；开口/端口缺少统一防护；部分设备防护罩需升级。客户建议在储存架下方离地约 6 英寸处划线，端口使用专用防护材料（客户提到 “Bio Shield”，品名需核实）。</w:t>
+            </w:r>
+          </w:p>
+          <w:p>
+            <w:pPr>
+              <w:spacing w:before="80" w:after="0" w:line="276" w:lineRule="auto"/>
+            </w:pPr>
+            <w:r>
+              <w:rPr>
+                <w:rFonts w:ascii="Arial" w:hAnsi="Arial" w:eastAsia="微软雅黑"/>
+                <w:b/>
+                <w:i w:val="0"/>
+                <w:color w:val="808080"/>
+                <w:sz w:val="16"/>
+              </w:rPr>
+              <w:t xml:space="preserve">原文 00:10:28  </w:t>
+            </w:r>
+            <w:r>
+              <w:rPr>
+                <w:rFonts w:ascii="Arial" w:hAnsi="Arial" w:eastAsia="微软雅黑"/>
+                <w:b w:val="0"/>
+                <w:i/>
+                <w:color w:val="1F4E79"/>
+                <w:sz w:val="17"/>
+              </w:rPr>
+              <w:t>“I was able to find the paper that we use and it's called Bio Shield. It's like the name of it.”</w:t>
+            </w:r>
+          </w:p>
+          <w:p>
+            <w:pPr>
+              <w:spacing w:before="80" w:after="0" w:line="276" w:lineRule="auto"/>
+            </w:pPr>
+            <w:r>
+              <w:rPr>
+                <w:rFonts w:ascii="Arial" w:hAnsi="Arial" w:eastAsia="微软雅黑"/>
+                <w:b/>
+                <w:i w:val="0"/>
+                <w:color w:val="808080"/>
+                <w:sz w:val="16"/>
+              </w:rPr>
+              <w:t xml:space="preserve">原文 00:10:28  </w:t>
+            </w:r>
+            <w:r>
+              <w:rPr>
+                <w:rFonts w:ascii="Arial" w:hAnsi="Arial" w:eastAsia="微软雅黑"/>
+                <w:b w:val="0"/>
+                <w:i/>
+                <w:color w:val="1F4E79"/>
+                <w:sz w:val="17"/>
+              </w:rPr>
+              <w:t>“a lot of people have just like literally painted a black line like underneath the whole storage rack, about 6 inches off the floor. Sometimes the hose is on the storage rack. You can see to the ends fall beneath the black line”</w:t>
             </w:r>
           </w:p>
         </w:tc>
         <w:tc>
           <w:tcPr>
-            <w:tcW w:w="4025" w:type="dxa"/>
+            <w:tcW w:w="3345" w:type="dxa"/>
           </w:tcPr>
           <w:p>
             <w:pPr>
@@ -4054,7 +5129,7 @@
         </w:tc>
         <w:tc>
           <w:tcPr>
-            <w:tcW w:w="1417" w:type="dxa"/>
+            <w:tcW w:w="1361" w:type="dxa"/>
           </w:tcPr>
           <w:p>
             <w:pPr>
@@ -4097,7 +5172,7 @@
         </w:trPr>
         <w:tc>
           <w:tcPr>
-            <w:tcW w:w="624" w:type="dxa"/>
+            <w:tcW w:w="652" w:type="dxa"/>
             <w:shd w:val="clear" w:color="auto" w:fill="EAF1F8"/>
           </w:tcPr>
           <w:p>
@@ -4119,7 +5194,7 @@
         </w:tc>
         <w:tc>
           <w:tcPr>
-            <w:tcW w:w="3515" w:type="dxa"/>
+            <w:tcW w:w="4224" w:type="dxa"/>
             <w:shd w:val="clear" w:color="auto" w:fill="EAF1F8"/>
           </w:tcPr>
           <w:p>
@@ -4135,12 +5210,37 @@
                 <w:sz w:val="19"/>
               </w:rPr>
               <w:t>部分管线坡度背离排放点，未坡向低点。</w:t>
+            </w:r>
+          </w:p>
+          <w:p>
+            <w:pPr>
+              <w:spacing w:before="80" w:after="0" w:line="276" w:lineRule="auto"/>
+            </w:pPr>
+            <w:r>
+              <w:rPr>
+                <w:rFonts w:ascii="Arial" w:hAnsi="Arial" w:eastAsia="微软雅黑"/>
+                <w:b/>
+                <w:i w:val="0"/>
+                <w:color w:val="808080"/>
+                <w:sz w:val="16"/>
+              </w:rPr>
+              <w:t xml:space="preserve">原文 00:06:20  </w:t>
+            </w:r>
+            <w:r>
+              <w:rPr>
+                <w:rFonts w:ascii="Arial" w:hAnsi="Arial" w:eastAsia="微软雅黑"/>
+                <w:b w:val="0"/>
+                <w:i/>
+                <w:color w:val="1F4E79"/>
+                <w:sz w:val="17"/>
+              </w:rPr>
+              <w:t>“I think this one is maybe supposed to pull out around this line sloping. There's least us some lines of the period of these slopes away that they're not supposed to train points over this”</w:t>
             </w:r>
           </w:p>
         </w:tc>
         <w:tc>
           <w:tcPr>
-            <w:tcW w:w="4025" w:type="dxa"/>
+            <w:tcW w:w="3345" w:type="dxa"/>
             <w:shd w:val="clear" w:color="auto" w:fill="EAF1F8"/>
           </w:tcPr>
           <w:p>
@@ -4161,7 +5261,7 @@
         </w:tc>
         <w:tc>
           <w:tcPr>
-            <w:tcW w:w="1417" w:type="dxa"/>
+            <w:tcW w:w="1361" w:type="dxa"/>
             <w:shd w:val="clear" w:color="auto" w:fill="EAF1F8"/>
           </w:tcPr>
           <w:p>
@@ -4221,10 +5321,10 @@
         </w:tblCellMar>
       </w:tblPr>
       <w:tblGrid>
-        <w:gridCol w:w="624"/>
-        <w:gridCol w:w="3515"/>
-        <w:gridCol w:w="4025"/>
-        <w:gridCol w:w="1417"/>
+        <w:gridCol w:w="652"/>
+        <w:gridCol w:w="4224"/>
+        <w:gridCol w:w="3345"/>
+        <w:gridCol w:w="1360"/>
       </w:tblGrid>
       <w:tr>
         <w:tblPrEx>
@@ -4250,7 +5350,7 @@
         </w:trPr>
         <w:tc>
           <w:tcPr>
-            <w:tcW w:w="624" w:type="dxa"/>
+            <w:tcW w:w="652" w:type="dxa"/>
             <w:shd w:val="clear" w:color="auto" w:fill="1F4E79"/>
           </w:tcPr>
           <w:p>
@@ -4272,7 +5372,7 @@
         </w:tc>
         <w:tc>
           <w:tcPr>
-            <w:tcW w:w="3515" w:type="dxa"/>
+            <w:tcW w:w="4224" w:type="dxa"/>
             <w:shd w:val="clear" w:color="auto" w:fill="1F4E79"/>
           </w:tcPr>
           <w:p>
@@ -4294,7 +5394,7 @@
         </w:tc>
         <w:tc>
           <w:tcPr>
-            <w:tcW w:w="4025" w:type="dxa"/>
+            <w:tcW w:w="3345" w:type="dxa"/>
             <w:shd w:val="clear" w:color="auto" w:fill="1F4E79"/>
           </w:tcPr>
           <w:p>
@@ -4316,7 +5416,7 @@
         </w:tc>
         <w:tc>
           <w:tcPr>
-            <w:tcW w:w="1417" w:type="dxa"/>
+            <w:tcW w:w="1361" w:type="dxa"/>
             <w:shd w:val="clear" w:color="auto" w:fill="1F4E79"/>
           </w:tcPr>
           <w:p>
@@ -4360,7 +5460,7 @@
         </w:trPr>
         <w:tc>
           <w:tcPr>
-            <w:tcW w:w="624" w:type="dxa"/>
+            <w:tcW w:w="652" w:type="dxa"/>
           </w:tcPr>
           <w:p>
             <w:pPr>
@@ -4381,7 +5481,7 @@
         </w:tc>
         <w:tc>
           <w:tcPr>
-            <w:tcW w:w="3515" w:type="dxa"/>
+            <w:tcW w:w="4224" w:type="dxa"/>
           </w:tcPr>
           <w:p>
             <w:pPr>
@@ -4396,12 +5496,37 @@
                 <w:sz w:val="19"/>
               </w:rPr>
               <w:t>多处工序使用临时容器储存/转运水（客户举例含 WFI、TFF 用水、标准溶液配制用水等）。客户列为最高优先级，认可我方正在推进。</w:t>
+            </w:r>
+          </w:p>
+          <w:p>
+            <w:pPr>
+              <w:spacing w:before="80" w:after="0" w:line="276" w:lineRule="auto"/>
+            </w:pPr>
+            <w:r>
+              <w:rPr>
+                <w:rFonts w:ascii="Arial" w:hAnsi="Arial" w:eastAsia="微软雅黑"/>
+                <w:b/>
+                <w:i w:val="0"/>
+                <w:color w:val="808080"/>
+                <w:sz w:val="16"/>
+              </w:rPr>
+              <w:t xml:space="preserve">原文 00:54:57  </w:t>
+            </w:r>
+            <w:r>
+              <w:rPr>
+                <w:rFonts w:ascii="Arial" w:hAnsi="Arial" w:eastAsia="微软雅黑"/>
+                <w:b w:val="0"/>
+                <w:i/>
+                <w:color w:val="1F4E79"/>
+                <w:sz w:val="17"/>
+              </w:rPr>
+              <w:t>“We use a temporary vessel to store and transport water. So some examples unify our whippy t f F collaboration water. And if they put on the right investigation, s t d s water or. So we have these, making sure that we're doing old time studies on those to show that, hey, I filled up this container on day 0. How much time do I have where it's still needing my specification before I can drain it, clean it, refill it.”</w:t>
             </w:r>
           </w:p>
         </w:tc>
         <w:tc>
           <w:tcPr>
-            <w:tcW w:w="4025" w:type="dxa"/>
+            <w:tcW w:w="3345" w:type="dxa"/>
           </w:tcPr>
           <w:p>
             <w:pPr>
@@ -4433,7 +5558,7 @@
         </w:tc>
         <w:tc>
           <w:tcPr>
-            <w:tcW w:w="1417" w:type="dxa"/>
+            <w:tcW w:w="1361" w:type="dxa"/>
           </w:tcPr>
           <w:p>
             <w:pPr>
@@ -4492,7 +5617,7 @@
         </w:trPr>
         <w:tc>
           <w:tcPr>
-            <w:tcW w:w="624" w:type="dxa"/>
+            <w:tcW w:w="652" w:type="dxa"/>
             <w:shd w:val="clear" w:color="auto" w:fill="EAF1F8"/>
           </w:tcPr>
           <w:p>
@@ -4514,7 +5639,7 @@
         </w:tc>
         <w:tc>
           <w:tcPr>
-            <w:tcW w:w="3515" w:type="dxa"/>
+            <w:tcW w:w="4224" w:type="dxa"/>
             <w:shd w:val="clear" w:color="auto" w:fill="EAF1F8"/>
           </w:tcPr>
           <w:p>
@@ -4530,12 +5655,37 @@
                 <w:sz w:val="19"/>
               </w:rPr>
               <w:t>客户认为最佳实践是“需要水的地方就有使用点直供”，避免中间容器。</w:t>
+            </w:r>
+          </w:p>
+          <w:p>
+            <w:pPr>
+              <w:spacing w:before="80" w:after="0" w:line="276" w:lineRule="auto"/>
+            </w:pPr>
+            <w:r>
+              <w:rPr>
+                <w:rFonts w:ascii="Arial" w:hAnsi="Arial" w:eastAsia="微软雅黑"/>
+                <w:b/>
+                <w:i w:val="0"/>
+                <w:color w:val="808080"/>
+                <w:sz w:val="16"/>
+              </w:rPr>
+              <w:t xml:space="preserve">原文 00:55:47  </w:t>
+            </w:r>
+            <w:r>
+              <w:rPr>
+                <w:rFonts w:ascii="Arial" w:hAnsi="Arial" w:eastAsia="微软雅黑"/>
+                <w:b w:val="0"/>
+                <w:i/>
+                <w:color w:val="1F4E79"/>
+                <w:sz w:val="17"/>
+              </w:rPr>
+              <w:t>“best practice would be wherever you need water, you have a point of use direct to it. You don't have to put it into something.”</w:t>
             </w:r>
           </w:p>
         </w:tc>
         <w:tc>
           <w:tcPr>
-            <w:tcW w:w="4025" w:type="dxa"/>
+            <w:tcW w:w="3345" w:type="dxa"/>
             <w:shd w:val="clear" w:color="auto" w:fill="EAF1F8"/>
           </w:tcPr>
           <w:p>
@@ -4556,7 +5706,7 @@
         </w:tc>
         <w:tc>
           <w:tcPr>
-            <w:tcW w:w="1417" w:type="dxa"/>
+            <w:tcW w:w="1361" w:type="dxa"/>
             <w:shd w:val="clear" w:color="auto" w:fill="EAF1F8"/>
           </w:tcPr>
           <w:p>
@@ -4616,10 +5766,10 @@
         </w:tblCellMar>
       </w:tblPr>
       <w:tblGrid>
-        <w:gridCol w:w="624"/>
-        <w:gridCol w:w="3515"/>
-        <w:gridCol w:w="4025"/>
-        <w:gridCol w:w="1417"/>
+        <w:gridCol w:w="652"/>
+        <w:gridCol w:w="4224"/>
+        <w:gridCol w:w="3345"/>
+        <w:gridCol w:w="1360"/>
       </w:tblGrid>
       <w:tr>
         <w:tblPrEx>
@@ -4645,7 +5795,7 @@
         </w:trPr>
         <w:tc>
           <w:tcPr>
-            <w:tcW w:w="624" w:type="dxa"/>
+            <w:tcW w:w="652" w:type="dxa"/>
             <w:shd w:val="clear" w:color="auto" w:fill="1F4E79"/>
           </w:tcPr>
           <w:p>
@@ -4667,7 +5817,7 @@
         </w:tc>
         <w:tc>
           <w:tcPr>
-            <w:tcW w:w="3515" w:type="dxa"/>
+            <w:tcW w:w="4224" w:type="dxa"/>
             <w:shd w:val="clear" w:color="auto" w:fill="1F4E79"/>
           </w:tcPr>
           <w:p>
@@ -4689,7 +5839,7 @@
         </w:tc>
         <w:tc>
           <w:tcPr>
-            <w:tcW w:w="4025" w:type="dxa"/>
+            <w:tcW w:w="3345" w:type="dxa"/>
             <w:shd w:val="clear" w:color="auto" w:fill="1F4E79"/>
           </w:tcPr>
           <w:p>
@@ -4711,7 +5861,7 @@
         </w:tc>
         <w:tc>
           <w:tcPr>
-            <w:tcW w:w="1417" w:type="dxa"/>
+            <w:tcW w:w="1361" w:type="dxa"/>
             <w:shd w:val="clear" w:color="auto" w:fill="1F4E79"/>
           </w:tcPr>
           <w:p>
@@ -4755,7 +5905,7 @@
         </w:trPr>
         <w:tc>
           <w:tcPr>
-            <w:tcW w:w="624" w:type="dxa"/>
+            <w:tcW w:w="652" w:type="dxa"/>
           </w:tcPr>
           <w:p>
             <w:pPr>
@@ -4776,7 +5926,7 @@
         </w:tc>
         <w:tc>
           <w:tcPr>
-            <w:tcW w:w="3515" w:type="dxa"/>
+            <w:tcW w:w="4224" w:type="dxa"/>
           </w:tcPr>
           <w:p>
             <w:pPr>
@@ -4791,12 +5941,37 @@
                 <w:sz w:val="19"/>
               </w:rPr>
               <w:t>对于非全新、要用于本项目的设备，客户要求有设备清单和明确的换型方案，证明前一产品残留已被去除；并强调不能只停留在“按清洁限度跑一遍清洁”。风险点包括：未拆卸清洁的管线、软质部件（隔膜）、难清洁部件（过滤器、TFF 膜、可再装填的色谱树脂等）。</w:t>
+            </w:r>
+          </w:p>
+          <w:p>
+            <w:pPr>
+              <w:spacing w:before="80" w:after="0" w:line="276" w:lineRule="auto"/>
+            </w:pPr>
+            <w:r>
+              <w:rPr>
+                <w:rFonts w:ascii="Arial" w:hAnsi="Arial" w:eastAsia="微软雅黑"/>
+                <w:b/>
+                <w:i w:val="0"/>
+                <w:color w:val="808080"/>
+                <w:sz w:val="16"/>
+              </w:rPr>
+              <w:t xml:space="preserve">原文 00:48:31  </w:t>
+            </w:r>
+            <w:r>
+              <w:rPr>
+                <w:rFonts w:ascii="Arial" w:hAnsi="Arial" w:eastAsia="微软雅黑"/>
+                <w:b w:val="0"/>
+                <w:i/>
+                <w:color w:val="1F4E79"/>
+                <w:sz w:val="17"/>
+              </w:rPr>
+              <w:t>“For any equipment that is not brand new but being used in the process, having a list of that equipment and then having a clear changeover approach to understand how we have full confidence that whatever product was in there before is removed before our product. So that's what this one is like. And I think like at the surface level, you would just say, well, we have cleaning limits for it. For the change over, we're gonna run a cleaning cycle or spot prints. I just gave some examples of like things beyond that simple surface level that like maybe you're often missed like that lines for example, that could have seen product a, but you don't go disassemble that line and then we clean it. Or like soft parts like diaphragms, hard to clean components like filters, TFF membranes, repacking column resins, kind of a holistic change over approach for anything that's being used.”</w:t>
             </w:r>
           </w:p>
         </w:tc>
         <w:tc>
           <w:tcPr>
-            <w:tcW w:w="4025" w:type="dxa"/>
+            <w:tcW w:w="3345" w:type="dxa"/>
           </w:tcPr>
           <w:p>
             <w:pPr>
@@ -4816,7 +5991,7 @@
         </w:tc>
         <w:tc>
           <w:tcPr>
-            <w:tcW w:w="1417" w:type="dxa"/>
+            <w:tcW w:w="1361" w:type="dxa"/>
           </w:tcPr>
           <w:p>
             <w:pPr>
@@ -4875,7 +6050,7 @@
         </w:trPr>
         <w:tc>
           <w:tcPr>
-            <w:tcW w:w="624" w:type="dxa"/>
+            <w:tcW w:w="652" w:type="dxa"/>
             <w:shd w:val="clear" w:color="auto" w:fill="EAF1F8"/>
           </w:tcPr>
           <w:p>
@@ -4897,7 +6072,7 @@
         </w:tc>
         <w:tc>
           <w:tcPr>
-            <w:tcW w:w="3515" w:type="dxa"/>
+            <w:tcW w:w="4224" w:type="dxa"/>
             <w:shd w:val="clear" w:color="auto" w:fill="EAF1F8"/>
           </w:tcPr>
           <w:p>
@@ -4913,12 +6088,62 @@
                 <w:sz w:val="19"/>
               </w:rPr>
               <w:t>对于全新设备，风险来自制造安装残留：焊接金属颗粒、遗留吹扫塞（purge plug）、抛光残留等。客户举例其内部做法：清洁后用饱和白布擦拭封头/筒壁各象限确认无残留；出口装筛网/过滤器做一次 CIP 后检查收集物。</w:t>
+            </w:r>
+          </w:p>
+          <w:p>
+            <w:pPr>
+              <w:spacing w:before="80" w:after="0" w:line="276" w:lineRule="auto"/>
+            </w:pPr>
+            <w:r>
+              <w:rPr>
+                <w:rFonts w:ascii="Arial" w:hAnsi="Arial" w:eastAsia="微软雅黑"/>
+                <w:b/>
+                <w:i w:val="0"/>
+                <w:color w:val="808080"/>
+                <w:sz w:val="16"/>
+              </w:rPr>
+              <w:t xml:space="preserve">原文 00:50:33  </w:t>
+            </w:r>
+            <w:r>
+              <w:rPr>
+                <w:rFonts w:ascii="Arial" w:hAnsi="Arial" w:eastAsia="微软雅黑"/>
+                <w:b w:val="0"/>
+                <w:i/>
+                <w:color w:val="1F4E79"/>
+                <w:sz w:val="17"/>
+              </w:rPr>
+              <w:t>“This would be for brand new equipment that has a different risk profile. Now your risk is, hey, I'm carrying over this whole product. Your risk is, did I leave something behind during fabrication or construction?”</w:t>
+            </w:r>
+          </w:p>
+          <w:p>
+            <w:pPr>
+              <w:spacing w:before="80" w:after="0" w:line="276" w:lineRule="auto"/>
+            </w:pPr>
+            <w:r>
+              <w:rPr>
+                <w:rFonts w:ascii="Arial" w:hAnsi="Arial" w:eastAsia="微软雅黑"/>
+                <w:b/>
+                <w:i w:val="0"/>
+                <w:color w:val="808080"/>
+                <w:sz w:val="16"/>
+              </w:rPr>
+              <w:t xml:space="preserve">原文 00:51:14  </w:t>
+            </w:r>
+            <w:r>
+              <w:rPr>
+                <w:rFonts w:ascii="Arial" w:hAnsi="Arial" w:eastAsia="微软雅黑"/>
+                <w:b w:val="0"/>
+                <w:i/>
+                <w:color w:val="1F4E79"/>
+                <w:sz w:val="17"/>
+              </w:rPr>
+              <w:t>“we do like a white test. After we clean the vessel, we go take like a solid saturated white. And white, various regions of the day, sidewall, each quadrant film, each quadrant ditch each quadrant, right and show they all come up perfectly white still that you don't have any polishing residue or metal particulate. We would then screen or a filter on the outlet and do a CIP of the vessel and collect everything out, and then. Pull the screen out afterwards and make sure there's no degree collected, right?”</w:t>
             </w:r>
           </w:p>
         </w:tc>
         <w:tc>
           <w:tcPr>
-            <w:tcW w:w="4025" w:type="dxa"/>
+            <w:tcW w:w="3345" w:type="dxa"/>
             <w:shd w:val="clear" w:color="auto" w:fill="EAF1F8"/>
           </w:tcPr>
           <w:p>
@@ -4939,7 +6164,7 @@
         </w:tc>
         <w:tc>
           <w:tcPr>
-            <w:tcW w:w="1417" w:type="dxa"/>
+            <w:tcW w:w="1361" w:type="dxa"/>
             <w:shd w:val="clear" w:color="auto" w:fill="EAF1F8"/>
           </w:tcPr>
           <w:p>
@@ -5015,10 +6240,10 @@
         </w:tblCellMar>
       </w:tblPr>
       <w:tblGrid>
-        <w:gridCol w:w="624"/>
-        <w:gridCol w:w="3515"/>
-        <w:gridCol w:w="4025"/>
-        <w:gridCol w:w="1417"/>
+        <w:gridCol w:w="652"/>
+        <w:gridCol w:w="4224"/>
+        <w:gridCol w:w="3345"/>
+        <w:gridCol w:w="1360"/>
       </w:tblGrid>
       <w:tr>
         <w:tblPrEx>
@@ -5044,7 +6269,7 @@
         </w:trPr>
         <w:tc>
           <w:tcPr>
-            <w:tcW w:w="624" w:type="dxa"/>
+            <w:tcW w:w="652" w:type="dxa"/>
             <w:shd w:val="clear" w:color="auto" w:fill="1F4E79"/>
           </w:tcPr>
           <w:p>
@@ -5066,7 +6291,7 @@
         </w:tc>
         <w:tc>
           <w:tcPr>
-            <w:tcW w:w="3515" w:type="dxa"/>
+            <w:tcW w:w="4224" w:type="dxa"/>
             <w:shd w:val="clear" w:color="auto" w:fill="1F4E79"/>
           </w:tcPr>
           <w:p>
@@ -5088,7 +6313,7 @@
         </w:tc>
         <w:tc>
           <w:tcPr>
-            <w:tcW w:w="4025" w:type="dxa"/>
+            <w:tcW w:w="3345" w:type="dxa"/>
             <w:shd w:val="clear" w:color="auto" w:fill="1F4E79"/>
           </w:tcPr>
           <w:p>
@@ -5110,7 +6335,7 @@
         </w:tc>
         <w:tc>
           <w:tcPr>
-            <w:tcW w:w="1417" w:type="dxa"/>
+            <w:tcW w:w="1361" w:type="dxa"/>
             <w:shd w:val="clear" w:color="auto" w:fill="1F4E79"/>
           </w:tcPr>
           <w:p>
@@ -5154,7 +6379,7 @@
         </w:trPr>
         <w:tc>
           <w:tcPr>
-            <w:tcW w:w="624" w:type="dxa"/>
+            <w:tcW w:w="652" w:type="dxa"/>
           </w:tcPr>
           <w:p>
             <w:pPr>
@@ -5175,7 +6400,7 @@
         </w:tc>
         <w:tc>
           <w:tcPr>
-            <w:tcW w:w="3515" w:type="dxa"/>
+            <w:tcW w:w="4224" w:type="dxa"/>
           </w:tcPr>
           <w:p>
             <w:pPr>
@@ -5190,12 +6415,37 @@
                 <w:sz w:val="19"/>
               </w:rPr>
               <w:t>液体物料/起始物料投料必须过滤 —— 已明确写入客户批准的策略文件（客户全球评审组批准，属强制要求），客户将此列为最高风险项之一。</w:t>
+            </w:r>
+          </w:p>
+          <w:p>
+            <w:pPr>
+              <w:spacing w:before="80" w:after="0" w:line="276" w:lineRule="auto"/>
+            </w:pPr>
+            <w:r>
+              <w:rPr>
+                <w:rFonts w:ascii="Arial" w:hAnsi="Arial" w:eastAsia="微软雅黑"/>
+                <w:b/>
+                <w:i w:val="0"/>
+                <w:color w:val="808080"/>
+                <w:sz w:val="16"/>
+              </w:rPr>
+              <w:t xml:space="preserve">原文 00:17:32  </w:t>
+            </w:r>
+            <w:r>
+              <w:rPr>
+                <w:rFonts w:ascii="Arial" w:hAnsi="Arial" w:eastAsia="微软雅黑"/>
+                <w:b w:val="0"/>
+                <w:i/>
+                <w:color w:val="1F4E79"/>
+                <w:sz w:val="17"/>
+              </w:rPr>
+              <w:t>“Anything that is specifically stated in that, you know, strategy document that was sent, that those are items are the highest screen because that's like. Approve by the Lily Speed Panel as like a global mandate for us to follow. And like the liquid charging of drop stock materials or raw materials is explicitly stated in there.”</w:t>
             </w:r>
           </w:p>
         </w:tc>
         <w:tc>
           <w:tcPr>
-            <w:tcW w:w="4025" w:type="dxa"/>
+            <w:tcW w:w="3345" w:type="dxa"/>
           </w:tcPr>
           <w:p>
             <w:pPr>
@@ -5215,7 +6465,7 @@
         </w:tc>
         <w:tc>
           <w:tcPr>
-            <w:tcW w:w="1417" w:type="dxa"/>
+            <w:tcW w:w="1361" w:type="dxa"/>
           </w:tcPr>
           <w:p>
             <w:pPr>
@@ -5274,7 +6524,7 @@
         </w:trPr>
         <w:tc>
           <w:tcPr>
-            <w:tcW w:w="624" w:type="dxa"/>
+            <w:tcW w:w="652" w:type="dxa"/>
             <w:shd w:val="clear" w:color="auto" w:fill="EAF1F8"/>
           </w:tcPr>
           <w:p>
@@ -5296,7 +6546,7 @@
         </w:tc>
         <w:tc>
           <w:tcPr>
-            <w:tcW w:w="3515" w:type="dxa"/>
+            <w:tcW w:w="4224" w:type="dxa"/>
             <w:shd w:val="clear" w:color="auto" w:fill="EAF1F8"/>
           </w:tcPr>
           <w:p>
@@ -5312,12 +6562,62 @@
                 <w:sz w:val="19"/>
               </w:rPr>
               <w:t>过滤器位置与更换频次应基于风险：非促生长物流（如流动相）每批更换反而因开系统增加风险，可考虑按时间（3–6 个月）更换。客户同时提醒我方内部程序目前写明一次性使用，不应与自身文件冲突。</w:t>
+            </w:r>
+          </w:p>
+          <w:p>
+            <w:pPr>
+              <w:spacing w:before="80" w:after="0" w:line="276" w:lineRule="auto"/>
+            </w:pPr>
+            <w:r>
+              <w:rPr>
+                <w:rFonts w:ascii="Arial" w:hAnsi="Arial" w:eastAsia="微软雅黑"/>
+                <w:b/>
+                <w:i w:val="0"/>
+                <w:color w:val="808080"/>
+                <w:sz w:val="16"/>
+              </w:rPr>
+              <w:t xml:space="preserve">原文 00:18:14  </w:t>
+            </w:r>
+            <w:r>
+              <w:rPr>
+                <w:rFonts w:ascii="Arial" w:hAnsi="Arial" w:eastAsia="微软雅黑"/>
+                <w:b w:val="0"/>
+                <w:i/>
+                <w:color w:val="1F4E79"/>
+                <w:sz w:val="17"/>
+              </w:rPr>
+              <w:t>“on a risk based approach to the filter placement, like again, just considering that like for a non robotic solution, like a mobile phase, do like you really need to do that every batch or are you actually putting the process at a higher risk by opening the system to replace the filter. Then you would be just like lead that for say three months, six months, some time based duration instead of following the one time use policy across the board.”</w:t>
+            </w:r>
+          </w:p>
+          <w:p>
+            <w:pPr>
+              <w:spacing w:before="80" w:after="0" w:line="276" w:lineRule="auto"/>
+            </w:pPr>
+            <w:r>
+              <w:rPr>
+                <w:rFonts w:ascii="Arial" w:hAnsi="Arial" w:eastAsia="微软雅黑"/>
+                <w:b/>
+                <w:i w:val="0"/>
+                <w:color w:val="808080"/>
+                <w:sz w:val="16"/>
+              </w:rPr>
+              <w:t xml:space="preserve">原文 00:19:06  </w:t>
+            </w:r>
+            <w:r>
+              <w:rPr>
+                <w:rFonts w:ascii="Arial" w:hAnsi="Arial" w:eastAsia="微软雅黑"/>
+                <w:b w:val="0"/>
+                <w:i/>
+                <w:color w:val="1F4E79"/>
+                <w:sz w:val="17"/>
+              </w:rPr>
+              <w:t>“But you guys have internal guidance and procedures that you're talking to. So like, I appreciate the evaluation, but I want to make sure that we're not going to get you guys in trouble for going against like that document”</w:t>
             </w:r>
           </w:p>
         </w:tc>
         <w:tc>
           <w:tcPr>
-            <w:tcW w:w="4025" w:type="dxa"/>
+            <w:tcW w:w="3345" w:type="dxa"/>
             <w:shd w:val="clear" w:color="auto" w:fill="EAF1F8"/>
           </w:tcPr>
           <w:p>
@@ -5338,7 +6638,7 @@
         </w:tc>
         <w:tc>
           <w:tcPr>
-            <w:tcW w:w="1417" w:type="dxa"/>
+            <w:tcW w:w="1361" w:type="dxa"/>
             <w:shd w:val="clear" w:color="auto" w:fill="EAF1F8"/>
           </w:tcPr>
           <w:p>
@@ -5382,7 +6682,7 @@
         </w:trPr>
         <w:tc>
           <w:tcPr>
-            <w:tcW w:w="624" w:type="dxa"/>
+            <w:tcW w:w="652" w:type="dxa"/>
           </w:tcPr>
           <w:p>
             <w:pPr>
@@ -5403,7 +6703,7 @@
         </w:tc>
         <w:tc>
           <w:tcPr>
-            <w:tcW w:w="3515" w:type="dxa"/>
+            <w:tcW w:w="4224" w:type="dxa"/>
           </w:tcPr>
           <w:p>
             <w:pPr>
@@ -5418,12 +6718,37 @@
                 <w:sz w:val="19"/>
               </w:rPr>
               <w:t>客户询问我方如何通过文件控制确保策略/调查文件版本唯一、受控</w:t>
+            </w:r>
+          </w:p>
+          <w:p>
+            <w:pPr>
+              <w:spacing w:before="80" w:after="0" w:line="276" w:lineRule="auto"/>
+            </w:pPr>
+            <w:r>
+              <w:rPr>
+                <w:rFonts w:ascii="Arial" w:hAnsi="Arial" w:eastAsia="微软雅黑"/>
+                <w:b/>
+                <w:i w:val="0"/>
+                <w:color w:val="808080"/>
+                <w:sz w:val="16"/>
+              </w:rPr>
+              <w:t xml:space="preserve">原文 00:15:34  </w:t>
+            </w:r>
+            <w:r>
+              <w:rPr>
+                <w:rFonts w:ascii="Arial" w:hAnsi="Arial" w:eastAsia="微软雅黑"/>
+                <w:b w:val="0"/>
+                <w:i/>
+                <w:color w:val="1F4E79"/>
+                <w:sz w:val="17"/>
+              </w:rPr>
+              <w:t>“Just want to understand how, if you got. Or you get your documentation controls to ensure you want to like sort of setting 1 and that's it.”</w:t>
             </w:r>
           </w:p>
         </w:tc>
         <w:tc>
           <w:tcPr>
-            <w:tcW w:w="4025" w:type="dxa"/>
+            <w:tcW w:w="3345" w:type="dxa"/>
           </w:tcPr>
           <w:p>
             <w:pPr>
@@ -5443,7 +6768,7 @@
         </w:tc>
         <w:tc>
           <w:tcPr>
-            <w:tcW w:w="1417" w:type="dxa"/>
+            <w:tcW w:w="1361" w:type="dxa"/>
           </w:tcPr>
           <w:p>
             <w:pPr>
@@ -5494,7 +6819,7 @@
     <w:tbl>
       <w:tblPr>
         <w:tblStyle w:val="35"/>
-        <w:tblW w:w="7253" w:type="dxa"/>
+        <w:tblW w:w="9582" w:type="dxa"/>
         <w:jc w:val="center"/>
         <w:tblBorders>
           <w:top w:val="single" w:color="auto" w:sz="4" w:space="0"/>
@@ -5513,8 +6838,8 @@
         </w:tblCellMar>
       </w:tblPr>
       <w:tblGrid>
-        <w:gridCol w:w="1794"/>
-        <w:gridCol w:w="5459"/>
+        <w:gridCol w:w="907"/>
+        <w:gridCol w:w="8675"/>
       </w:tblGrid>
       <w:tr>
         <w:tblPrEx>
@@ -5540,7 +6865,7 @@
         </w:trPr>
         <w:tc>
           <w:tcPr>
-            <w:tcW w:w="1794" w:type="dxa"/>
+            <w:tcW w:w="907" w:type="dxa"/>
             <w:shd w:val="clear" w:color="auto" w:fill="1F4E79"/>
           </w:tcPr>
           <w:p>
@@ -5562,7 +6887,7 @@
         </w:tc>
         <w:tc>
           <w:tcPr>
-            <w:tcW w:w="5459" w:type="dxa"/>
+            <w:tcW w:w="8674" w:type="dxa"/>
             <w:shd w:val="clear" w:color="auto" w:fill="1F4E79"/>
           </w:tcPr>
           <w:p>
@@ -5606,7 +6931,7 @@
         </w:trPr>
         <w:tc>
           <w:tcPr>
-            <w:tcW w:w="1794" w:type="dxa"/>
+            <w:tcW w:w="907" w:type="dxa"/>
           </w:tcPr>
           <w:p>
             <w:pPr>
@@ -5627,7 +6952,7 @@
         </w:tc>
         <w:tc>
           <w:tcPr>
-            <w:tcW w:w="5459" w:type="dxa"/>
+            <w:tcW w:w="8674" w:type="dxa"/>
           </w:tcPr>
           <w:p>
             <w:pPr>
@@ -5642,6 +6967,81 @@
                 <w:sz w:val="19"/>
               </w:rPr>
               <w:t>客户将发出约 60 项清单（含优先级与分类），由 AI 工具汇总三位审计人员的记录，可能存在重叠或表述不清；客户要求我方有疑问立即提问（可要求照片/草图），并对照我方自己的记录，凡客户清单遗漏的项主动上报。</w:t>
+            </w:r>
+          </w:p>
+          <w:p>
+            <w:pPr>
+              <w:spacing w:before="80" w:after="0" w:line="276" w:lineRule="auto"/>
+            </w:pPr>
+            <w:r>
+              <w:rPr>
+                <w:rFonts w:ascii="Arial" w:hAnsi="Arial" w:eastAsia="微软雅黑"/>
+                <w:b/>
+                <w:i w:val="0"/>
+                <w:color w:val="808080"/>
+                <w:sz w:val="16"/>
+              </w:rPr>
+              <w:t xml:space="preserve">原文 00:01:21  </w:t>
+            </w:r>
+            <w:r>
+              <w:rPr>
+                <w:rFonts w:ascii="Arial" w:hAnsi="Arial" w:eastAsia="微软雅黑"/>
+                <w:b w:val="0"/>
+                <w:i/>
+                <w:color w:val="1F4E79"/>
+                <w:sz w:val="17"/>
+              </w:rPr>
+              <w:t>“So we compiled our notes here last night. This morning, this is giving you kind of overview, the sense of 60 some odd individual items. Some of them may overlap slightly, but generally there are three items. We try to prioritize these”</w:t>
+            </w:r>
+          </w:p>
+          <w:p>
+            <w:pPr>
+              <w:spacing w:before="80" w:after="0" w:line="276" w:lineRule="auto"/>
+            </w:pPr>
+            <w:r>
+              <w:rPr>
+                <w:rFonts w:ascii="Arial" w:hAnsi="Arial" w:eastAsia="微软雅黑"/>
+                <w:b/>
+                <w:i w:val="0"/>
+                <w:color w:val="808080"/>
+                <w:sz w:val="16"/>
+              </w:rPr>
+              <w:t xml:space="preserve">原文 00:02:45  </w:t>
+            </w:r>
+            <w:r>
+              <w:rPr>
+                <w:rFonts w:ascii="Arial" w:hAnsi="Arial" w:eastAsia="微软雅黑"/>
+                <w:b w:val="0"/>
+                <w:i/>
+                <w:color w:val="1F4E79"/>
+                <w:sz w:val="17"/>
+              </w:rPr>
+              <w:t>“We tried to use some of the AI tools to take all three of our notes and it was trying. So we're gonna try to provide some clarity, but like just the way the AI tool extracted, display the information, some of that may still be a little bit unclear video. So as you're reviewing this after we send it and trying to develop an action plan against it, there's any questions or clarity needed or. Can you send me a picture of this or drawing of that or, you know, feel free and don't waste any time to put their question.”</w:t>
+            </w:r>
+          </w:p>
+          <w:p>
+            <w:pPr>
+              <w:spacing w:before="80" w:after="0" w:line="276" w:lineRule="auto"/>
+            </w:pPr>
+            <w:r>
+              <w:rPr>
+                <w:rFonts w:ascii="Arial" w:hAnsi="Arial" w:eastAsia="微软雅黑"/>
+                <w:b/>
+                <w:i w:val="0"/>
+                <w:color w:val="808080"/>
+                <w:sz w:val="16"/>
+              </w:rPr>
+              <w:t xml:space="preserve">原文 00:03:17  </w:t>
+            </w:r>
+            <w:r>
+              <w:rPr>
+                <w:rFonts w:ascii="Arial" w:hAnsi="Arial" w:eastAsia="微软雅黑"/>
+                <w:b w:val="0"/>
+                <w:i/>
+                <w:color w:val="1F4E79"/>
+                <w:sz w:val="17"/>
+              </w:rPr>
+              <w:t>“if you're reviewing your notes and you don't see something listed, you should escalate that because it may fall through the cracks of AI tool”</w:t>
             </w:r>
           </w:p>
         </w:tc>
@@ -5669,7 +7069,7 @@
         </w:trPr>
         <w:tc>
           <w:tcPr>
-            <w:tcW w:w="1794" w:type="dxa"/>
+            <w:tcW w:w="907" w:type="dxa"/>
             <w:shd w:val="clear" w:color="auto" w:fill="EAF1F8"/>
           </w:tcPr>
           <w:p>
@@ -5691,7 +7091,7 @@
         </w:tc>
         <w:tc>
           <w:tcPr>
-            <w:tcW w:w="5459" w:type="dxa"/>
+            <w:tcW w:w="8674" w:type="dxa"/>
             <w:shd w:val="clear" w:color="auto" w:fill="EAF1F8"/>
           </w:tcPr>
           <w:p>
@@ -5707,6 +7107,31 @@
                 <w:sz w:val="19"/>
               </w:rPr>
               <w:t>客户建议增加专题会：清洁策略专题会（固定频次）、验证（VOA）就绪专题会，与 JPT 工艺技术会分开，避免被工艺讨论挤占。</w:t>
+            </w:r>
+          </w:p>
+          <w:p>
+            <w:pPr>
+              <w:spacing w:before="80" w:after="0" w:line="276" w:lineRule="auto"/>
+            </w:pPr>
+            <w:r>
+              <w:rPr>
+                <w:rFonts w:ascii="Arial" w:hAnsi="Arial" w:eastAsia="微软雅黑"/>
+                <w:b/>
+                <w:i w:val="0"/>
+                <w:color w:val="808080"/>
+                <w:sz w:val="16"/>
+              </w:rPr>
+              <w:t xml:space="preserve">原文 00:05:45  </w:t>
+            </w:r>
+            <w:r>
+              <w:rPr>
+                <w:rFonts w:ascii="Arial" w:hAnsi="Arial" w:eastAsia="微软雅黑"/>
+                <w:b w:val="0"/>
+                <w:i/>
+                <w:color w:val="1F4E79"/>
+                <w:sz w:val="17"/>
+              </w:rPr>
+              <w:t>“But maybe consider more target focus time. Like the jpts usually get kind of absorbed with more process technical discussion, and we don't need a ton of time for like the VOA readiness.”</w:t>
             </w:r>
           </w:p>
         </w:tc>
@@ -5734,7 +7159,7 @@
         </w:trPr>
         <w:tc>
           <w:tcPr>
-            <w:tcW w:w="1794" w:type="dxa"/>
+            <w:tcW w:w="907" w:type="dxa"/>
           </w:tcPr>
           <w:p>
             <w:pPr>
@@ -5755,7 +7180,7 @@
         </w:tc>
         <w:tc>
           <w:tcPr>
-            <w:tcW w:w="5459" w:type="dxa"/>
+            <w:tcW w:w="8674" w:type="dxa"/>
           </w:tcPr>
           <w:p>
             <w:pPr>
@@ -5770,6 +7195,56 @@
                 <w:sz w:val="19"/>
               </w:rPr>
               <w:t>客户要求重大改造在投入人力物力之前先送审方案（如排放阀处理方式、分馏管线设计、水系统总管改造），避免返工。</w:t>
+            </w:r>
+          </w:p>
+          <w:p>
+            <w:pPr>
+              <w:spacing w:before="80" w:after="0" w:line="276" w:lineRule="auto"/>
+            </w:pPr>
+            <w:r>
+              <w:rPr>
+                <w:rFonts w:ascii="Arial" w:hAnsi="Arial" w:eastAsia="微软雅黑"/>
+                <w:b/>
+                <w:i w:val="0"/>
+                <w:color w:val="808080"/>
+                <w:sz w:val="16"/>
+              </w:rPr>
+              <w:t xml:space="preserve">原文 01:01:28  </w:t>
+            </w:r>
+            <w:r>
+              <w:rPr>
+                <w:rFonts w:ascii="Arial" w:hAnsi="Arial" w:eastAsia="微软雅黑"/>
+                <w:b w:val="0"/>
+                <w:i/>
+                <w:color w:val="1F4E79"/>
+                <w:sz w:val="17"/>
+              </w:rPr>
+              <w:t>“if there's anything where you just want to put out before you go and invest a bunch of time and resource reworking it, like. Okay, here's what we're doing for training now. So you draw up and send it to us. We review it, say yes”</w:t>
+            </w:r>
+          </w:p>
+          <w:p>
+            <w:pPr>
+              <w:spacing w:before="80" w:after="0" w:line="276" w:lineRule="auto"/>
+            </w:pPr>
+            <w:r>
+              <w:rPr>
+                <w:rFonts w:ascii="Arial" w:hAnsi="Arial" w:eastAsia="微软雅黑"/>
+                <w:b/>
+                <w:i w:val="0"/>
+                <w:color w:val="808080"/>
+                <w:sz w:val="16"/>
+              </w:rPr>
+              <w:t xml:space="preserve">原文 00:32:21  </w:t>
+            </w:r>
+            <w:r>
+              <w:rPr>
+                <w:rFonts w:ascii="Arial" w:hAnsi="Arial" w:eastAsia="微软雅黑"/>
+                <w:b w:val="0"/>
+                <w:i/>
+                <w:color w:val="1F4E79"/>
+                <w:sz w:val="17"/>
+              </w:rPr>
+              <w:t>“if you want to draw up kind of what you're thinking to handle these drain valves and, you know, and send me a picture of the sketch or something”</w:t>
             </w:r>
           </w:p>
         </w:tc>
@@ -5797,7 +7272,7 @@
         </w:trPr>
         <w:tc>
           <w:tcPr>
-            <w:tcW w:w="1794" w:type="dxa"/>
+            <w:tcW w:w="907" w:type="dxa"/>
             <w:shd w:val="clear" w:color="auto" w:fill="EAF1F8"/>
           </w:tcPr>
           <w:p>
@@ -5819,7 +7294,7 @@
         </w:tc>
         <w:tc>
           <w:tcPr>
-            <w:tcW w:w="5459" w:type="dxa"/>
+            <w:tcW w:w="8674" w:type="dxa"/>
             <w:shd w:val="clear" w:color="auto" w:fill="EAF1F8"/>
           </w:tcPr>
           <w:p>
@@ -5835,6 +7310,56 @@
                 <w:sz w:val="19"/>
               </w:rPr>
               <w:t>客户认可通过详细视频发现问题（其部分发现即来自我方提供的视频），建议增加逐个接口的细节视频、现场直播走查，并改善会议室摄像条件、对设备做清晰标识。</w:t>
+            </w:r>
+          </w:p>
+          <w:p>
+            <w:pPr>
+              <w:spacing w:before="80" w:after="0" w:line="276" w:lineRule="auto"/>
+            </w:pPr>
+            <w:r>
+              <w:rPr>
+                <w:rFonts w:ascii="Arial" w:hAnsi="Arial" w:eastAsia="微软雅黑"/>
+                <w:b/>
+                <w:i w:val="0"/>
+                <w:color w:val="808080"/>
+                <w:sz w:val="16"/>
+              </w:rPr>
+              <w:t xml:space="preserve">原文 00:41:28  </w:t>
+            </w:r>
+            <w:r>
+              <w:rPr>
+                <w:rFonts w:ascii="Arial" w:hAnsi="Arial" w:eastAsia="微软雅黑"/>
+                <w:b w:val="0"/>
+                <w:i/>
+                <w:color w:val="1F4E79"/>
+                <w:sz w:val="17"/>
+              </w:rPr>
+              <w:t>“those videos that you guys shared up. Okay, share videos. Exactly. Like that's where we picked up, like watching a piece of video, that's where we picked up a plan. So he just had someone create a video where, I mean, those were like showing sweet. So they were a little higher level, but you didn't. In specific videos in this. And someone literally just looked at every connection on top, every connection on the bottom. We need to watch those and flag.”</w:t>
+            </w:r>
+          </w:p>
+          <w:p>
+            <w:pPr>
+              <w:spacing w:before="80" w:after="0" w:line="276" w:lineRule="auto"/>
+            </w:pPr>
+            <w:r>
+              <w:rPr>
+                <w:rFonts w:ascii="Arial" w:hAnsi="Arial" w:eastAsia="微软雅黑"/>
+                <w:b/>
+                <w:i w:val="0"/>
+                <w:color w:val="808080"/>
+                <w:sz w:val="16"/>
+              </w:rPr>
+              <w:t xml:space="preserve">原文 00:40:41  </w:t>
+            </w:r>
+            <w:r>
+              <w:rPr>
+                <w:rFonts w:ascii="Arial" w:hAnsi="Arial" w:eastAsia="微软雅黑"/>
+                <w:b w:val="0"/>
+                <w:i/>
+                <w:color w:val="1F4E79"/>
+                <w:sz w:val="17"/>
+              </w:rPr>
+              <w:t>“And I know that we try to sort of do some virtual collaboration, like on this topic where I saw some piano here, but like sometimes I think that was difficult because I mean piano doesn't, yeah, we do outside, we do conference with camera outside. It has a meeting. And we should say maybe that we label those”</w:t>
             </w:r>
           </w:p>
         </w:tc>
@@ -5862,7 +7387,7 @@
         </w:trPr>
         <w:tc>
           <w:tcPr>
-            <w:tcW w:w="1794" w:type="dxa"/>
+            <w:tcW w:w="907" w:type="dxa"/>
           </w:tcPr>
           <w:p>
             <w:pPr>
@@ -5883,7 +7408,7 @@
         </w:tc>
         <w:tc>
           <w:tcPr>
-            <w:tcW w:w="5459" w:type="dxa"/>
+            <w:tcW w:w="8674" w:type="dxa"/>
           </w:tcPr>
           <w:p>
             <w:pPr>
@@ -5898,6 +7423,56 @@
                 <w:sz w:val="19"/>
               </w:rPr>
               <w:t>客户提出在恢复/启动前可能再安排一次现场访问，并强调时间安排是关键关注点。</w:t>
+            </w:r>
+          </w:p>
+          <w:p>
+            <w:pPr>
+              <w:spacing w:before="80" w:after="0" w:line="276" w:lineRule="auto"/>
+            </w:pPr>
+            <w:r>
+              <w:rPr>
+                <w:rFonts w:ascii="Arial" w:hAnsi="Arial" w:eastAsia="微软雅黑"/>
+                <w:b/>
+                <w:i w:val="0"/>
+                <w:color w:val="808080"/>
+                <w:sz w:val="16"/>
+              </w:rPr>
+              <w:t xml:space="preserve">原文 01:00:04  </w:t>
+            </w:r>
+            <w:r>
+              <w:rPr>
+                <w:rFonts w:ascii="Arial" w:hAnsi="Arial" w:eastAsia="微软雅黑"/>
+                <w:b w:val="0"/>
+                <w:i/>
+                <w:color w:val="1F4E79"/>
+                <w:sz w:val="17"/>
+              </w:rPr>
+              <w:t>“Also the discuss like if necessary, like another outside visit down the road before you can start again.”</w:t>
+            </w:r>
+          </w:p>
+          <w:p>
+            <w:pPr>
+              <w:spacing w:before="80" w:after="0" w:line="276" w:lineRule="auto"/>
+            </w:pPr>
+            <w:r>
+              <w:rPr>
+                <w:rFonts w:ascii="Arial" w:hAnsi="Arial" w:eastAsia="微软雅黑"/>
+                <w:b/>
+                <w:i w:val="0"/>
+                <w:color w:val="808080"/>
+                <w:sz w:val="16"/>
+              </w:rPr>
+              <w:t xml:space="preserve">原文 00:59:00  </w:t>
+            </w:r>
+            <w:r>
+              <w:rPr>
+                <w:rFonts w:ascii="Arial" w:hAnsi="Arial" w:eastAsia="微软雅黑"/>
+                <w:b w:val="0"/>
+                <w:i/>
+                <w:color w:val="1F4E79"/>
+                <w:sz w:val="17"/>
+              </w:rPr>
+              <w:t>“some of these are probably much larger, I think, and the timing is one.”</w:t>
             </w:r>
           </w:p>
         </w:tc>

</xml_diff>

<commit_message>
Add responsible-department and due-date columns to the improvement action tables
Co-authored-by: peterli0913 <peterli0913@users.noreply.github.com>
</commit_message>
<xml_diff>
--- a/客户审计跟进会 改进要点总结 09-18-2026.docx
+++ b/客户审计跟进会 改进要点总结 09-18-2026.docx
@@ -405,10 +405,12 @@
         </w:tblCellMar>
       </w:tblPr>
       <w:tblGrid>
-        <w:gridCol w:w="624"/>
-        <w:gridCol w:w="3515"/>
-        <w:gridCol w:w="4025"/>
-        <w:gridCol w:w="1417"/>
+        <w:gridCol w:w="652"/>
+        <w:gridCol w:w="2579"/>
+        <w:gridCol w:w="2920"/>
+        <w:gridCol w:w="1389"/>
+        <w:gridCol w:w="1021"/>
+        <w:gridCol w:w="1021"/>
       </w:tblGrid>
       <w:tr>
         <w:tblPrEx>
@@ -434,7 +436,7 @@
         </w:trPr>
         <w:tc>
           <w:tcPr>
-            <w:tcW w:w="624" w:type="dxa"/>
+            <w:tcW w:w="652" w:type="dxa"/>
             <w:shd w:val="clear" w:color="auto" w:fill="1F4E79"/>
           </w:tcPr>
           <w:p>
@@ -456,7 +458,7 @@
         </w:tc>
         <w:tc>
           <w:tcPr>
-            <w:tcW w:w="3515" w:type="dxa"/>
+            <w:tcW w:w="2579" w:type="dxa"/>
             <w:shd w:val="clear" w:color="auto" w:fill="1F4E79"/>
           </w:tcPr>
           <w:p>
@@ -478,7 +480,7 @@
         </w:tc>
         <w:tc>
           <w:tcPr>
-            <w:tcW w:w="4025" w:type="dxa"/>
+            <w:tcW w:w="2920" w:type="dxa"/>
             <w:shd w:val="clear" w:color="auto" w:fill="1F4E79"/>
           </w:tcPr>
           <w:p>
@@ -500,7 +502,7 @@
         </w:tc>
         <w:tc>
           <w:tcPr>
-            <w:tcW w:w="1417" w:type="dxa"/>
+            <w:tcW w:w="1389" w:type="dxa"/>
             <w:shd w:val="clear" w:color="auto" w:fill="1F4E79"/>
           </w:tcPr>
           <w:p>
@@ -517,6 +519,50 @@
                 <w:sz w:val="19"/>
               </w:rPr>
               <w:t>优先级</w:t>
+            </w:r>
+          </w:p>
+        </w:tc>
+        <w:tc>
+          <w:tcPr>
+            <w:tcW w:w="1021" w:type="dxa"/>
+            <w:shd w:val="clear" w:color="auto" w:fill="1F4E79"/>
+          </w:tcPr>
+          <w:p>
+            <w:pPr>
+              <w:spacing w:before="40" w:after="40" w:line="288" w:lineRule="auto"/>
+              <w:jc w:val="center"/>
+            </w:pPr>
+            <w:r>
+              <w:rPr>
+                <w:rFonts w:ascii="Arial" w:hAnsi="Arial" w:eastAsia="微软雅黑"/>
+                <w:b/>
+                <w:i w:val="0"/>
+                <w:color w:val="FFFFFF"/>
+                <w:sz w:val="19"/>
+              </w:rPr>
+              <w:t xml:space="preserve">责任部门</w:t>
+            </w:r>
+          </w:p>
+        </w:tc>
+        <w:tc>
+          <w:tcPr>
+            <w:tcW w:w="1021" w:type="dxa"/>
+            <w:shd w:val="clear" w:color="auto" w:fill="1F4E79"/>
+          </w:tcPr>
+          <w:p>
+            <w:pPr>
+              <w:spacing w:before="40" w:after="40" w:line="288" w:lineRule="auto"/>
+              <w:jc w:val="center"/>
+            </w:pPr>
+            <w:r>
+              <w:rPr>
+                <w:rFonts w:ascii="Arial" w:hAnsi="Arial" w:eastAsia="微软雅黑"/>
+                <w:b/>
+                <w:i w:val="0"/>
+                <w:color w:val="FFFFFF"/>
+                <w:sz w:val="19"/>
+              </w:rPr>
+              <w:t xml:space="preserve">完成时间</w:t>
             </w:r>
           </w:p>
         </w:tc>
@@ -544,7 +590,7 @@
         </w:trPr>
         <w:tc>
           <w:tcPr>
-            <w:tcW w:w="624" w:type="dxa"/>
+            <w:tcW w:w="652" w:type="dxa"/>
           </w:tcPr>
           <w:p>
             <w:pPr>
@@ -565,7 +611,7 @@
         </w:tc>
         <w:tc>
           <w:tcPr>
-            <w:tcW w:w="3515" w:type="dxa"/>
+            <w:tcW w:w="2579" w:type="dxa"/>
           </w:tcPr>
           <w:p>
             <w:pPr>
@@ -585,7 +631,7 @@
         </w:tc>
         <w:tc>
           <w:tcPr>
-            <w:tcW w:w="4025" w:type="dxa"/>
+            <w:tcW w:w="2920" w:type="dxa"/>
           </w:tcPr>
           <w:p>
             <w:pPr>
@@ -605,7 +651,7 @@
         </w:tc>
         <w:tc>
           <w:tcPr>
-            <w:tcW w:w="1417" w:type="dxa"/>
+            <w:tcW w:w="1389" w:type="dxa"/>
           </w:tcPr>
           <w:p>
             <w:pPr>
@@ -638,6 +684,42 @@
               </w:rPr>
               <w:t>（客户明示）</w:t>
             </w:r>
+          </w:p>
+        </w:tc>
+        <w:tc>
+          <w:tcPr>
+            <w:tcW w:w="1021" w:type="dxa"/>
+          </w:tcPr>
+          <w:p>
+            <w:pPr>
+              <w:spacing w:before="40" w:after="40" w:line="288" w:lineRule="auto"/>
+              <w:jc w:val="center"/>
+              <w:rPr>
+                <w:rFonts w:ascii="Arial" w:hAnsi="Arial" w:eastAsia="微软雅黑"/>
+                <w:b w:val="0"/>
+                <w:i w:val="0"/>
+                <w:color w:val="404040"/>
+                <w:sz w:val="19"/>
+              </w:rPr>
+            </w:pPr>
+          </w:p>
+        </w:tc>
+        <w:tc>
+          <w:tcPr>
+            <w:tcW w:w="1021" w:type="dxa"/>
+          </w:tcPr>
+          <w:p>
+            <w:pPr>
+              <w:spacing w:before="40" w:after="40" w:line="288" w:lineRule="auto"/>
+              <w:jc w:val="center"/>
+              <w:rPr>
+                <w:rFonts w:ascii="Arial" w:hAnsi="Arial" w:eastAsia="微软雅黑"/>
+                <w:b w:val="0"/>
+                <w:i w:val="0"/>
+                <w:color w:val="404040"/>
+                <w:sz w:val="19"/>
+              </w:rPr>
+            </w:pPr>
           </w:p>
         </w:tc>
       </w:tr>
@@ -664,7 +746,7 @@
         </w:trPr>
         <w:tc>
           <w:tcPr>
-            <w:tcW w:w="624" w:type="dxa"/>
+            <w:tcW w:w="652" w:type="dxa"/>
             <w:shd w:val="clear" w:color="auto" w:fill="EAF1F8"/>
           </w:tcPr>
           <w:p>
@@ -686,7 +768,7 @@
         </w:tc>
         <w:tc>
           <w:tcPr>
-            <w:tcW w:w="3515" w:type="dxa"/>
+            <w:tcW w:w="2579" w:type="dxa"/>
             <w:shd w:val="clear" w:color="auto" w:fill="EAF1F8"/>
           </w:tcPr>
           <w:p>
@@ -707,7 +789,7 @@
         </w:tc>
         <w:tc>
           <w:tcPr>
-            <w:tcW w:w="4025" w:type="dxa"/>
+            <w:tcW w:w="2920" w:type="dxa"/>
             <w:shd w:val="clear" w:color="auto" w:fill="EAF1F8"/>
           </w:tcPr>
           <w:p>
@@ -728,7 +810,7 @@
         </w:tc>
         <w:tc>
           <w:tcPr>
-            <w:tcW w:w="1417" w:type="dxa"/>
+            <w:tcW w:w="1389" w:type="dxa"/>
             <w:shd w:val="clear" w:color="auto" w:fill="EAF1F8"/>
           </w:tcPr>
           <w:p>
@@ -762,6 +844,44 @@
               </w:rPr>
               <w:t>（建议）</w:t>
             </w:r>
+          </w:p>
+        </w:tc>
+        <w:tc>
+          <w:tcPr>
+            <w:tcW w:w="1021" w:type="dxa"/>
+            <w:shd w:val="clear" w:color="auto" w:fill="EAF1F8"/>
+          </w:tcPr>
+          <w:p>
+            <w:pPr>
+              <w:spacing w:before="40" w:after="40" w:line="288" w:lineRule="auto"/>
+              <w:jc w:val="center"/>
+              <w:rPr>
+                <w:rFonts w:ascii="Arial" w:hAnsi="Arial" w:eastAsia="微软雅黑"/>
+                <w:b w:val="0"/>
+                <w:i w:val="0"/>
+                <w:color w:val="404040"/>
+                <w:sz w:val="19"/>
+              </w:rPr>
+            </w:pPr>
+          </w:p>
+        </w:tc>
+        <w:tc>
+          <w:tcPr>
+            <w:tcW w:w="1021" w:type="dxa"/>
+            <w:shd w:val="clear" w:color="auto" w:fill="EAF1F8"/>
+          </w:tcPr>
+          <w:p>
+            <w:pPr>
+              <w:spacing w:before="40" w:after="40" w:line="288" w:lineRule="auto"/>
+              <w:jc w:val="center"/>
+              <w:rPr>
+                <w:rFonts w:ascii="Arial" w:hAnsi="Arial" w:eastAsia="微软雅黑"/>
+                <w:b w:val="0"/>
+                <w:i w:val="0"/>
+                <w:color w:val="404040"/>
+                <w:sz w:val="19"/>
+              </w:rPr>
+            </w:pPr>
           </w:p>
         </w:tc>
       </w:tr>
@@ -788,7 +908,7 @@
         </w:trPr>
         <w:tc>
           <w:tcPr>
-            <w:tcW w:w="624" w:type="dxa"/>
+            <w:tcW w:w="652" w:type="dxa"/>
           </w:tcPr>
           <w:p>
             <w:pPr>
@@ -809,7 +929,7 @@
         </w:tc>
         <w:tc>
           <w:tcPr>
-            <w:tcW w:w="3515" w:type="dxa"/>
+            <w:tcW w:w="2579" w:type="dxa"/>
           </w:tcPr>
           <w:p>
             <w:pPr>
@@ -829,7 +949,7 @@
         </w:tc>
         <w:tc>
           <w:tcPr>
-            <w:tcW w:w="4025" w:type="dxa"/>
+            <w:tcW w:w="2920" w:type="dxa"/>
           </w:tcPr>
           <w:p>
             <w:pPr>
@@ -849,7 +969,7 @@
         </w:tc>
         <w:tc>
           <w:tcPr>
-            <w:tcW w:w="1417" w:type="dxa"/>
+            <w:tcW w:w="1389" w:type="dxa"/>
           </w:tcPr>
           <w:p>
             <w:pPr>
@@ -882,6 +1002,42 @@
               </w:rPr>
               <w:t>（建议）</w:t>
             </w:r>
+          </w:p>
+        </w:tc>
+        <w:tc>
+          <w:tcPr>
+            <w:tcW w:w="1021" w:type="dxa"/>
+          </w:tcPr>
+          <w:p>
+            <w:pPr>
+              <w:spacing w:before="40" w:after="40" w:line="288" w:lineRule="auto"/>
+              <w:jc w:val="center"/>
+              <w:rPr>
+                <w:rFonts w:ascii="Arial" w:hAnsi="Arial" w:eastAsia="微软雅黑"/>
+                <w:b w:val="0"/>
+                <w:i w:val="0"/>
+                <w:color w:val="404040"/>
+                <w:sz w:val="19"/>
+              </w:rPr>
+            </w:pPr>
+          </w:p>
+        </w:tc>
+        <w:tc>
+          <w:tcPr>
+            <w:tcW w:w="1021" w:type="dxa"/>
+          </w:tcPr>
+          <w:p>
+            <w:pPr>
+              <w:spacing w:before="40" w:after="40" w:line="288" w:lineRule="auto"/>
+              <w:jc w:val="center"/>
+              <w:rPr>
+                <w:rFonts w:ascii="Arial" w:hAnsi="Arial" w:eastAsia="微软雅黑"/>
+                <w:b w:val="0"/>
+                <w:i w:val="0"/>
+                <w:color w:val="404040"/>
+                <w:sz w:val="19"/>
+              </w:rPr>
+            </w:pPr>
           </w:p>
         </w:tc>
       </w:tr>
@@ -908,7 +1064,7 @@
         </w:trPr>
         <w:tc>
           <w:tcPr>
-            <w:tcW w:w="624" w:type="dxa"/>
+            <w:tcW w:w="652" w:type="dxa"/>
             <w:shd w:val="clear" w:color="auto" w:fill="EAF1F8"/>
           </w:tcPr>
           <w:p>
@@ -930,7 +1086,7 @@
         </w:tc>
         <w:tc>
           <w:tcPr>
-            <w:tcW w:w="3515" w:type="dxa"/>
+            <w:tcW w:w="2579" w:type="dxa"/>
             <w:shd w:val="clear" w:color="auto" w:fill="EAF1F8"/>
           </w:tcPr>
           <w:p>
@@ -951,7 +1107,7 @@
         </w:tc>
         <w:tc>
           <w:tcPr>
-            <w:tcW w:w="4025" w:type="dxa"/>
+            <w:tcW w:w="2920" w:type="dxa"/>
             <w:shd w:val="clear" w:color="auto" w:fill="EAF1F8"/>
           </w:tcPr>
           <w:p>
@@ -972,7 +1128,7 @@
         </w:tc>
         <w:tc>
           <w:tcPr>
-            <w:tcW w:w="1417" w:type="dxa"/>
+            <w:tcW w:w="1389" w:type="dxa"/>
             <w:shd w:val="clear" w:color="auto" w:fill="EAF1F8"/>
           </w:tcPr>
           <w:p>
@@ -990,6 +1146,44 @@
               </w:rPr>
               <w:t>中</w:t>
             </w:r>
+          </w:p>
+        </w:tc>
+        <w:tc>
+          <w:tcPr>
+            <w:tcW w:w="1021" w:type="dxa"/>
+            <w:shd w:val="clear" w:color="auto" w:fill="EAF1F8"/>
+          </w:tcPr>
+          <w:p>
+            <w:pPr>
+              <w:spacing w:before="40" w:after="40" w:line="288" w:lineRule="auto"/>
+              <w:jc w:val="center"/>
+              <w:rPr>
+                <w:rFonts w:ascii="Arial" w:hAnsi="Arial" w:eastAsia="微软雅黑"/>
+                <w:b w:val="0"/>
+                <w:i w:val="0"/>
+                <w:color w:val="404040"/>
+                <w:sz w:val="19"/>
+              </w:rPr>
+            </w:pPr>
+          </w:p>
+        </w:tc>
+        <w:tc>
+          <w:tcPr>
+            <w:tcW w:w="1021" w:type="dxa"/>
+            <w:shd w:val="clear" w:color="auto" w:fill="EAF1F8"/>
+          </w:tcPr>
+          <w:p>
+            <w:pPr>
+              <w:spacing w:before="40" w:after="40" w:line="288" w:lineRule="auto"/>
+              <w:jc w:val="center"/>
+              <w:rPr>
+                <w:rFonts w:ascii="Arial" w:hAnsi="Arial" w:eastAsia="微软雅黑"/>
+                <w:b w:val="0"/>
+                <w:i w:val="0"/>
+                <w:color w:val="404040"/>
+                <w:sz w:val="19"/>
+              </w:rPr>
+            </w:pPr>
           </w:p>
         </w:tc>
       </w:tr>
@@ -1032,10 +1226,12 @@
         </w:tblCellMar>
       </w:tblPr>
       <w:tblGrid>
-        <w:gridCol w:w="624"/>
-        <w:gridCol w:w="3515"/>
-        <w:gridCol w:w="4025"/>
-        <w:gridCol w:w="1417"/>
+        <w:gridCol w:w="652"/>
+        <w:gridCol w:w="2579"/>
+        <w:gridCol w:w="2920"/>
+        <w:gridCol w:w="1389"/>
+        <w:gridCol w:w="1021"/>
+        <w:gridCol w:w="1021"/>
       </w:tblGrid>
       <w:tr>
         <w:tblPrEx>
@@ -1061,7 +1257,7 @@
         </w:trPr>
         <w:tc>
           <w:tcPr>
-            <w:tcW w:w="624" w:type="dxa"/>
+            <w:tcW w:w="652" w:type="dxa"/>
             <w:shd w:val="clear" w:color="auto" w:fill="1F4E79"/>
           </w:tcPr>
           <w:p>
@@ -1083,7 +1279,7 @@
         </w:tc>
         <w:tc>
           <w:tcPr>
-            <w:tcW w:w="3515" w:type="dxa"/>
+            <w:tcW w:w="2579" w:type="dxa"/>
             <w:shd w:val="clear" w:color="auto" w:fill="1F4E79"/>
           </w:tcPr>
           <w:p>
@@ -1105,7 +1301,7 @@
         </w:tc>
         <w:tc>
           <w:tcPr>
-            <w:tcW w:w="4025" w:type="dxa"/>
+            <w:tcW w:w="2920" w:type="dxa"/>
             <w:shd w:val="clear" w:color="auto" w:fill="1F4E79"/>
           </w:tcPr>
           <w:p>
@@ -1127,7 +1323,7 @@
         </w:tc>
         <w:tc>
           <w:tcPr>
-            <w:tcW w:w="1417" w:type="dxa"/>
+            <w:tcW w:w="1389" w:type="dxa"/>
             <w:shd w:val="clear" w:color="auto" w:fill="1F4E79"/>
           </w:tcPr>
           <w:p>
@@ -1144,6 +1340,50 @@
                 <w:sz w:val="19"/>
               </w:rPr>
               <w:t>优先级</w:t>
+            </w:r>
+          </w:p>
+        </w:tc>
+        <w:tc>
+          <w:tcPr>
+            <w:tcW w:w="1021" w:type="dxa"/>
+            <w:shd w:val="clear" w:color="auto" w:fill="1F4E79"/>
+          </w:tcPr>
+          <w:p>
+            <w:pPr>
+              <w:spacing w:before="40" w:after="40" w:line="288" w:lineRule="auto"/>
+              <w:jc w:val="center"/>
+            </w:pPr>
+            <w:r>
+              <w:rPr>
+                <w:rFonts w:ascii="Arial" w:hAnsi="Arial" w:eastAsia="微软雅黑"/>
+                <w:b/>
+                <w:i w:val="0"/>
+                <w:color w:val="FFFFFF"/>
+                <w:sz w:val="19"/>
+              </w:rPr>
+              <w:t xml:space="preserve">责任部门</w:t>
+            </w:r>
+          </w:p>
+        </w:tc>
+        <w:tc>
+          <w:tcPr>
+            <w:tcW w:w="1021" w:type="dxa"/>
+            <w:shd w:val="clear" w:color="auto" w:fill="1F4E79"/>
+          </w:tcPr>
+          <w:p>
+            <w:pPr>
+              <w:spacing w:before="40" w:after="40" w:line="288" w:lineRule="auto"/>
+              <w:jc w:val="center"/>
+            </w:pPr>
+            <w:r>
+              <w:rPr>
+                <w:rFonts w:ascii="Arial" w:hAnsi="Arial" w:eastAsia="微软雅黑"/>
+                <w:b/>
+                <w:i w:val="0"/>
+                <w:color w:val="FFFFFF"/>
+                <w:sz w:val="19"/>
+              </w:rPr>
+              <w:t xml:space="preserve">完成时间</w:t>
             </w:r>
           </w:p>
         </w:tc>
@@ -1171,7 +1411,7 @@
         </w:trPr>
         <w:tc>
           <w:tcPr>
-            <w:tcW w:w="624" w:type="dxa"/>
+            <w:tcW w:w="652" w:type="dxa"/>
           </w:tcPr>
           <w:p>
             <w:pPr>
@@ -1192,7 +1432,7 @@
         </w:tc>
         <w:tc>
           <w:tcPr>
-            <w:tcW w:w="3515" w:type="dxa"/>
+            <w:tcW w:w="2579" w:type="dxa"/>
           </w:tcPr>
           <w:p>
             <w:pPr>
@@ -1212,7 +1452,7 @@
         </w:tc>
         <w:tc>
           <w:tcPr>
-            <w:tcW w:w="4025" w:type="dxa"/>
+            <w:tcW w:w="2920" w:type="dxa"/>
           </w:tcPr>
           <w:p>
             <w:pPr>
@@ -1232,7 +1472,7 @@
         </w:tc>
         <w:tc>
           <w:tcPr>
-            <w:tcW w:w="1417" w:type="dxa"/>
+            <w:tcW w:w="1389" w:type="dxa"/>
           </w:tcPr>
           <w:p>
             <w:pPr>
@@ -1265,6 +1505,42 @@
               </w:rPr>
               <w:t>（客户明示）</w:t>
             </w:r>
+          </w:p>
+        </w:tc>
+        <w:tc>
+          <w:tcPr>
+            <w:tcW w:w="1021" w:type="dxa"/>
+          </w:tcPr>
+          <w:p>
+            <w:pPr>
+              <w:spacing w:before="40" w:after="40" w:line="288" w:lineRule="auto"/>
+              <w:jc w:val="center"/>
+              <w:rPr>
+                <w:rFonts w:ascii="Arial" w:hAnsi="Arial" w:eastAsia="微软雅黑"/>
+                <w:b w:val="0"/>
+                <w:i w:val="0"/>
+                <w:color w:val="404040"/>
+                <w:sz w:val="19"/>
+              </w:rPr>
+            </w:pPr>
+          </w:p>
+        </w:tc>
+        <w:tc>
+          <w:tcPr>
+            <w:tcW w:w="1021" w:type="dxa"/>
+          </w:tcPr>
+          <w:p>
+            <w:pPr>
+              <w:spacing w:before="40" w:after="40" w:line="288" w:lineRule="auto"/>
+              <w:jc w:val="center"/>
+              <w:rPr>
+                <w:rFonts w:ascii="Arial" w:hAnsi="Arial" w:eastAsia="微软雅黑"/>
+                <w:b w:val="0"/>
+                <w:i w:val="0"/>
+                <w:color w:val="404040"/>
+                <w:sz w:val="19"/>
+              </w:rPr>
+            </w:pPr>
           </w:p>
         </w:tc>
       </w:tr>
@@ -1291,7 +1567,7 @@
         </w:trPr>
         <w:tc>
           <w:tcPr>
-            <w:tcW w:w="624" w:type="dxa"/>
+            <w:tcW w:w="652" w:type="dxa"/>
             <w:shd w:val="clear" w:color="auto" w:fill="EAF1F8"/>
           </w:tcPr>
           <w:p>
@@ -1313,7 +1589,7 @@
         </w:tc>
         <w:tc>
           <w:tcPr>
-            <w:tcW w:w="3515" w:type="dxa"/>
+            <w:tcW w:w="2579" w:type="dxa"/>
             <w:shd w:val="clear" w:color="auto" w:fill="EAF1F8"/>
           </w:tcPr>
           <w:p>
@@ -1334,7 +1610,7 @@
         </w:tc>
         <w:tc>
           <w:tcPr>
-            <w:tcW w:w="4025" w:type="dxa"/>
+            <w:tcW w:w="2920" w:type="dxa"/>
             <w:shd w:val="clear" w:color="auto" w:fill="EAF1F8"/>
           </w:tcPr>
           <w:p>
@@ -1355,7 +1631,7 @@
         </w:tc>
         <w:tc>
           <w:tcPr>
-            <w:tcW w:w="1417" w:type="dxa"/>
+            <w:tcW w:w="1389" w:type="dxa"/>
             <w:shd w:val="clear" w:color="auto" w:fill="EAF1F8"/>
           </w:tcPr>
           <w:p>
@@ -1389,6 +1665,44 @@
               </w:rPr>
               <w:t>（客户明示）</w:t>
             </w:r>
+          </w:p>
+        </w:tc>
+        <w:tc>
+          <w:tcPr>
+            <w:tcW w:w="1021" w:type="dxa"/>
+            <w:shd w:val="clear" w:color="auto" w:fill="EAF1F8"/>
+          </w:tcPr>
+          <w:p>
+            <w:pPr>
+              <w:spacing w:before="40" w:after="40" w:line="288" w:lineRule="auto"/>
+              <w:jc w:val="center"/>
+              <w:rPr>
+                <w:rFonts w:ascii="Arial" w:hAnsi="Arial" w:eastAsia="微软雅黑"/>
+                <w:b w:val="0"/>
+                <w:i w:val="0"/>
+                <w:color w:val="404040"/>
+                <w:sz w:val="19"/>
+              </w:rPr>
+            </w:pPr>
+          </w:p>
+        </w:tc>
+        <w:tc>
+          <w:tcPr>
+            <w:tcW w:w="1021" w:type="dxa"/>
+            <w:shd w:val="clear" w:color="auto" w:fill="EAF1F8"/>
+          </w:tcPr>
+          <w:p>
+            <w:pPr>
+              <w:spacing w:before="40" w:after="40" w:line="288" w:lineRule="auto"/>
+              <w:jc w:val="center"/>
+              <w:rPr>
+                <w:rFonts w:ascii="Arial" w:hAnsi="Arial" w:eastAsia="微软雅黑"/>
+                <w:b w:val="0"/>
+                <w:i w:val="0"/>
+                <w:color w:val="404040"/>
+                <w:sz w:val="19"/>
+              </w:rPr>
+            </w:pPr>
           </w:p>
         </w:tc>
       </w:tr>
@@ -1415,7 +1729,7 @@
         </w:trPr>
         <w:tc>
           <w:tcPr>
-            <w:tcW w:w="624" w:type="dxa"/>
+            <w:tcW w:w="652" w:type="dxa"/>
           </w:tcPr>
           <w:p>
             <w:pPr>
@@ -1436,7 +1750,7 @@
         </w:tc>
         <w:tc>
           <w:tcPr>
-            <w:tcW w:w="3515" w:type="dxa"/>
+            <w:tcW w:w="2579" w:type="dxa"/>
           </w:tcPr>
           <w:p>
             <w:pPr>
@@ -1456,7 +1770,7 @@
         </w:tc>
         <w:tc>
           <w:tcPr>
-            <w:tcW w:w="4025" w:type="dxa"/>
+            <w:tcW w:w="2920" w:type="dxa"/>
           </w:tcPr>
           <w:p>
             <w:pPr>
@@ -1476,7 +1790,7 @@
         </w:tc>
         <w:tc>
           <w:tcPr>
-            <w:tcW w:w="1417" w:type="dxa"/>
+            <w:tcW w:w="1389" w:type="dxa"/>
           </w:tcPr>
           <w:p>
             <w:pPr>
@@ -1509,6 +1823,42 @@
               </w:rPr>
               <w:t>（客户明示）</w:t>
             </w:r>
+          </w:p>
+        </w:tc>
+        <w:tc>
+          <w:tcPr>
+            <w:tcW w:w="1021" w:type="dxa"/>
+          </w:tcPr>
+          <w:p>
+            <w:pPr>
+              <w:spacing w:before="40" w:after="40" w:line="288" w:lineRule="auto"/>
+              <w:jc w:val="center"/>
+              <w:rPr>
+                <w:rFonts w:ascii="Arial" w:hAnsi="Arial" w:eastAsia="微软雅黑"/>
+                <w:b w:val="0"/>
+                <w:i w:val="0"/>
+                <w:color w:val="404040"/>
+                <w:sz w:val="19"/>
+              </w:rPr>
+            </w:pPr>
+          </w:p>
+        </w:tc>
+        <w:tc>
+          <w:tcPr>
+            <w:tcW w:w="1021" w:type="dxa"/>
+          </w:tcPr>
+          <w:p>
+            <w:pPr>
+              <w:spacing w:before="40" w:after="40" w:line="288" w:lineRule="auto"/>
+              <w:jc w:val="center"/>
+              <w:rPr>
+                <w:rFonts w:ascii="Arial" w:hAnsi="Arial" w:eastAsia="微软雅黑"/>
+                <w:b w:val="0"/>
+                <w:i w:val="0"/>
+                <w:color w:val="404040"/>
+                <w:sz w:val="19"/>
+              </w:rPr>
+            </w:pPr>
           </w:p>
         </w:tc>
       </w:tr>
@@ -1535,7 +1885,7 @@
         </w:trPr>
         <w:tc>
           <w:tcPr>
-            <w:tcW w:w="624" w:type="dxa"/>
+            <w:tcW w:w="652" w:type="dxa"/>
             <w:shd w:val="clear" w:color="auto" w:fill="EAF1F8"/>
           </w:tcPr>
           <w:p>
@@ -1557,7 +1907,7 @@
         </w:tc>
         <w:tc>
           <w:tcPr>
-            <w:tcW w:w="3515" w:type="dxa"/>
+            <w:tcW w:w="2579" w:type="dxa"/>
             <w:shd w:val="clear" w:color="auto" w:fill="EAF1F8"/>
           </w:tcPr>
           <w:p>
@@ -1578,7 +1928,7 @@
         </w:tc>
         <w:tc>
           <w:tcPr>
-            <w:tcW w:w="4025" w:type="dxa"/>
+            <w:tcW w:w="2920" w:type="dxa"/>
             <w:shd w:val="clear" w:color="auto" w:fill="EAF1F8"/>
           </w:tcPr>
           <w:p>
@@ -1599,7 +1949,7 @@
         </w:tc>
         <w:tc>
           <w:tcPr>
-            <w:tcW w:w="1417" w:type="dxa"/>
+            <w:tcW w:w="1389" w:type="dxa"/>
             <w:shd w:val="clear" w:color="auto" w:fill="EAF1F8"/>
           </w:tcPr>
           <w:p>
@@ -1633,6 +1983,44 @@
               </w:rPr>
               <w:t>（客户明示）</w:t>
             </w:r>
+          </w:p>
+        </w:tc>
+        <w:tc>
+          <w:tcPr>
+            <w:tcW w:w="1021" w:type="dxa"/>
+            <w:shd w:val="clear" w:color="auto" w:fill="EAF1F8"/>
+          </w:tcPr>
+          <w:p>
+            <w:pPr>
+              <w:spacing w:before="40" w:after="40" w:line="288" w:lineRule="auto"/>
+              <w:jc w:val="center"/>
+              <w:rPr>
+                <w:rFonts w:ascii="Arial" w:hAnsi="Arial" w:eastAsia="微软雅黑"/>
+                <w:b w:val="0"/>
+                <w:i w:val="0"/>
+                <w:color w:val="404040"/>
+                <w:sz w:val="19"/>
+              </w:rPr>
+            </w:pPr>
+          </w:p>
+        </w:tc>
+        <w:tc>
+          <w:tcPr>
+            <w:tcW w:w="1021" w:type="dxa"/>
+            <w:shd w:val="clear" w:color="auto" w:fill="EAF1F8"/>
+          </w:tcPr>
+          <w:p>
+            <w:pPr>
+              <w:spacing w:before="40" w:after="40" w:line="288" w:lineRule="auto"/>
+              <w:jc w:val="center"/>
+              <w:rPr>
+                <w:rFonts w:ascii="Arial" w:hAnsi="Arial" w:eastAsia="微软雅黑"/>
+                <w:b w:val="0"/>
+                <w:i w:val="0"/>
+                <w:color w:val="404040"/>
+                <w:sz w:val="19"/>
+              </w:rPr>
+            </w:pPr>
           </w:p>
         </w:tc>
       </w:tr>
@@ -1659,7 +2047,7 @@
         </w:trPr>
         <w:tc>
           <w:tcPr>
-            <w:tcW w:w="624" w:type="dxa"/>
+            <w:tcW w:w="652" w:type="dxa"/>
           </w:tcPr>
           <w:p>
             <w:pPr>
@@ -1680,7 +2068,7 @@
         </w:tc>
         <w:tc>
           <w:tcPr>
-            <w:tcW w:w="3515" w:type="dxa"/>
+            <w:tcW w:w="2579" w:type="dxa"/>
           </w:tcPr>
           <w:p>
             <w:pPr>
@@ -1700,7 +2088,7 @@
         </w:tc>
         <w:tc>
           <w:tcPr>
-            <w:tcW w:w="4025" w:type="dxa"/>
+            <w:tcW w:w="2920" w:type="dxa"/>
           </w:tcPr>
           <w:p>
             <w:pPr>
@@ -1720,7 +2108,7 @@
         </w:tc>
         <w:tc>
           <w:tcPr>
-            <w:tcW w:w="1417" w:type="dxa"/>
+            <w:tcW w:w="1389" w:type="dxa"/>
           </w:tcPr>
           <w:p>
             <w:pPr>
@@ -1753,6 +2141,42 @@
               </w:rPr>
               <w:t>（客户明示）</w:t>
             </w:r>
+          </w:p>
+        </w:tc>
+        <w:tc>
+          <w:tcPr>
+            <w:tcW w:w="1021" w:type="dxa"/>
+          </w:tcPr>
+          <w:p>
+            <w:pPr>
+              <w:spacing w:before="40" w:after="40" w:line="288" w:lineRule="auto"/>
+              <w:jc w:val="center"/>
+              <w:rPr>
+                <w:rFonts w:ascii="Arial" w:hAnsi="Arial" w:eastAsia="微软雅黑"/>
+                <w:b w:val="0"/>
+                <w:i w:val="0"/>
+                <w:color w:val="404040"/>
+                <w:sz w:val="19"/>
+              </w:rPr>
+            </w:pPr>
+          </w:p>
+        </w:tc>
+        <w:tc>
+          <w:tcPr>
+            <w:tcW w:w="1021" w:type="dxa"/>
+          </w:tcPr>
+          <w:p>
+            <w:pPr>
+              <w:spacing w:before="40" w:after="40" w:line="288" w:lineRule="auto"/>
+              <w:jc w:val="center"/>
+              <w:rPr>
+                <w:rFonts w:ascii="Arial" w:hAnsi="Arial" w:eastAsia="微软雅黑"/>
+                <w:b w:val="0"/>
+                <w:i w:val="0"/>
+                <w:color w:val="404040"/>
+                <w:sz w:val="19"/>
+              </w:rPr>
+            </w:pPr>
           </w:p>
         </w:tc>
       </w:tr>
@@ -1779,7 +2203,7 @@
         </w:trPr>
         <w:tc>
           <w:tcPr>
-            <w:tcW w:w="624" w:type="dxa"/>
+            <w:tcW w:w="652" w:type="dxa"/>
             <w:shd w:val="clear" w:color="auto" w:fill="EAF1F8"/>
           </w:tcPr>
           <w:p>
@@ -1801,7 +2225,7 @@
         </w:tc>
         <w:tc>
           <w:tcPr>
-            <w:tcW w:w="3515" w:type="dxa"/>
+            <w:tcW w:w="2579" w:type="dxa"/>
             <w:shd w:val="clear" w:color="auto" w:fill="EAF1F8"/>
           </w:tcPr>
           <w:p>
@@ -1822,7 +2246,7 @@
         </w:tc>
         <w:tc>
           <w:tcPr>
-            <w:tcW w:w="4025" w:type="dxa"/>
+            <w:tcW w:w="2920" w:type="dxa"/>
             <w:shd w:val="clear" w:color="auto" w:fill="EAF1F8"/>
           </w:tcPr>
           <w:p>
@@ -1843,7 +2267,7 @@
         </w:tc>
         <w:tc>
           <w:tcPr>
-            <w:tcW w:w="1417" w:type="dxa"/>
+            <w:tcW w:w="1389" w:type="dxa"/>
             <w:shd w:val="clear" w:color="auto" w:fill="EAF1F8"/>
           </w:tcPr>
           <w:p>
@@ -1877,6 +2301,44 @@
               </w:rPr>
               <w:t>（客户明示）</w:t>
             </w:r>
+          </w:p>
+        </w:tc>
+        <w:tc>
+          <w:tcPr>
+            <w:tcW w:w="1021" w:type="dxa"/>
+            <w:shd w:val="clear" w:color="auto" w:fill="EAF1F8"/>
+          </w:tcPr>
+          <w:p>
+            <w:pPr>
+              <w:spacing w:before="40" w:after="40" w:line="288" w:lineRule="auto"/>
+              <w:jc w:val="center"/>
+              <w:rPr>
+                <w:rFonts w:ascii="Arial" w:hAnsi="Arial" w:eastAsia="微软雅黑"/>
+                <w:b w:val="0"/>
+                <w:i w:val="0"/>
+                <w:color w:val="404040"/>
+                <w:sz w:val="19"/>
+              </w:rPr>
+            </w:pPr>
+          </w:p>
+        </w:tc>
+        <w:tc>
+          <w:tcPr>
+            <w:tcW w:w="1021" w:type="dxa"/>
+            <w:shd w:val="clear" w:color="auto" w:fill="EAF1F8"/>
+          </w:tcPr>
+          <w:p>
+            <w:pPr>
+              <w:spacing w:before="40" w:after="40" w:line="288" w:lineRule="auto"/>
+              <w:jc w:val="center"/>
+              <w:rPr>
+                <w:rFonts w:ascii="Arial" w:hAnsi="Arial" w:eastAsia="微软雅黑"/>
+                <w:b w:val="0"/>
+                <w:i w:val="0"/>
+                <w:color w:val="404040"/>
+                <w:sz w:val="19"/>
+              </w:rPr>
+            </w:pPr>
           </w:p>
         </w:tc>
       </w:tr>
@@ -1903,7 +2365,7 @@
         </w:trPr>
         <w:tc>
           <w:tcPr>
-            <w:tcW w:w="624" w:type="dxa"/>
+            <w:tcW w:w="652" w:type="dxa"/>
           </w:tcPr>
           <w:p>
             <w:pPr>
@@ -1924,7 +2386,7 @@
         </w:tc>
         <w:tc>
           <w:tcPr>
-            <w:tcW w:w="3515" w:type="dxa"/>
+            <w:tcW w:w="2579" w:type="dxa"/>
           </w:tcPr>
           <w:p>
             <w:pPr>
@@ -1944,7 +2406,7 @@
         </w:tc>
         <w:tc>
           <w:tcPr>
-            <w:tcW w:w="4025" w:type="dxa"/>
+            <w:tcW w:w="2920" w:type="dxa"/>
           </w:tcPr>
           <w:p>
             <w:pPr>
@@ -1964,7 +2426,7 @@
         </w:tc>
         <w:tc>
           <w:tcPr>
-            <w:tcW w:w="1417" w:type="dxa"/>
+            <w:tcW w:w="1389" w:type="dxa"/>
           </w:tcPr>
           <w:p>
             <w:pPr>
@@ -1981,6 +2443,42 @@
               </w:rPr>
               <w:t>中</w:t>
             </w:r>
+          </w:p>
+        </w:tc>
+        <w:tc>
+          <w:tcPr>
+            <w:tcW w:w="1021" w:type="dxa"/>
+          </w:tcPr>
+          <w:p>
+            <w:pPr>
+              <w:spacing w:before="40" w:after="40" w:line="288" w:lineRule="auto"/>
+              <w:jc w:val="center"/>
+              <w:rPr>
+                <w:rFonts w:ascii="Arial" w:hAnsi="Arial" w:eastAsia="微软雅黑"/>
+                <w:b w:val="0"/>
+                <w:i w:val="0"/>
+                <w:color w:val="404040"/>
+                <w:sz w:val="19"/>
+              </w:rPr>
+            </w:pPr>
+          </w:p>
+        </w:tc>
+        <w:tc>
+          <w:tcPr>
+            <w:tcW w:w="1021" w:type="dxa"/>
+          </w:tcPr>
+          <w:p>
+            <w:pPr>
+              <w:spacing w:before="40" w:after="40" w:line="288" w:lineRule="auto"/>
+              <w:jc w:val="center"/>
+              <w:rPr>
+                <w:rFonts w:ascii="Arial" w:hAnsi="Arial" w:eastAsia="微软雅黑"/>
+                <w:b w:val="0"/>
+                <w:i w:val="0"/>
+                <w:color w:val="404040"/>
+                <w:sz w:val="19"/>
+              </w:rPr>
+            </w:pPr>
           </w:p>
         </w:tc>
       </w:tr>
@@ -2007,7 +2505,7 @@
         </w:trPr>
         <w:tc>
           <w:tcPr>
-            <w:tcW w:w="624" w:type="dxa"/>
+            <w:tcW w:w="652" w:type="dxa"/>
             <w:shd w:val="clear" w:color="auto" w:fill="EAF1F8"/>
           </w:tcPr>
           <w:p>
@@ -2029,7 +2527,7 @@
         </w:tc>
         <w:tc>
           <w:tcPr>
-            <w:tcW w:w="3515" w:type="dxa"/>
+            <w:tcW w:w="2579" w:type="dxa"/>
             <w:shd w:val="clear" w:color="auto" w:fill="EAF1F8"/>
           </w:tcPr>
           <w:p>
@@ -2050,7 +2548,7 @@
         </w:tc>
         <w:tc>
           <w:tcPr>
-            <w:tcW w:w="4025" w:type="dxa"/>
+            <w:tcW w:w="2920" w:type="dxa"/>
             <w:shd w:val="clear" w:color="auto" w:fill="EAF1F8"/>
           </w:tcPr>
           <w:p>
@@ -2071,7 +2569,7 @@
         </w:tc>
         <w:tc>
           <w:tcPr>
-            <w:tcW w:w="1417" w:type="dxa"/>
+            <w:tcW w:w="1389" w:type="dxa"/>
             <w:shd w:val="clear" w:color="auto" w:fill="EAF1F8"/>
           </w:tcPr>
           <w:p>
@@ -2105,6 +2603,44 @@
               </w:rPr>
               <w:t>（客户明示）</w:t>
             </w:r>
+          </w:p>
+        </w:tc>
+        <w:tc>
+          <w:tcPr>
+            <w:tcW w:w="1021" w:type="dxa"/>
+            <w:shd w:val="clear" w:color="auto" w:fill="EAF1F8"/>
+          </w:tcPr>
+          <w:p>
+            <w:pPr>
+              <w:spacing w:before="40" w:after="40" w:line="288" w:lineRule="auto"/>
+              <w:jc w:val="center"/>
+              <w:rPr>
+                <w:rFonts w:ascii="Arial" w:hAnsi="Arial" w:eastAsia="微软雅黑"/>
+                <w:b w:val="0"/>
+                <w:i w:val="0"/>
+                <w:color w:val="404040"/>
+                <w:sz w:val="19"/>
+              </w:rPr>
+            </w:pPr>
+          </w:p>
+        </w:tc>
+        <w:tc>
+          <w:tcPr>
+            <w:tcW w:w="1021" w:type="dxa"/>
+            <w:shd w:val="clear" w:color="auto" w:fill="EAF1F8"/>
+          </w:tcPr>
+          <w:p>
+            <w:pPr>
+              <w:spacing w:before="40" w:after="40" w:line="288" w:lineRule="auto"/>
+              <w:jc w:val="center"/>
+              <w:rPr>
+                <w:rFonts w:ascii="Arial" w:hAnsi="Arial" w:eastAsia="微软雅黑"/>
+                <w:b w:val="0"/>
+                <w:i w:val="0"/>
+                <w:color w:val="404040"/>
+                <w:sz w:val="19"/>
+              </w:rPr>
+            </w:pPr>
           </w:p>
         </w:tc>
       </w:tr>
@@ -2131,7 +2667,7 @@
         </w:trPr>
         <w:tc>
           <w:tcPr>
-            <w:tcW w:w="624" w:type="dxa"/>
+            <w:tcW w:w="652" w:type="dxa"/>
           </w:tcPr>
           <w:p>
             <w:pPr>
@@ -2152,7 +2688,7 @@
         </w:tc>
         <w:tc>
           <w:tcPr>
-            <w:tcW w:w="3515" w:type="dxa"/>
+            <w:tcW w:w="2579" w:type="dxa"/>
           </w:tcPr>
           <w:p>
             <w:pPr>
@@ -2172,7 +2708,7 @@
         </w:tc>
         <w:tc>
           <w:tcPr>
-            <w:tcW w:w="4025" w:type="dxa"/>
+            <w:tcW w:w="2920" w:type="dxa"/>
           </w:tcPr>
           <w:p>
             <w:pPr>
@@ -2192,7 +2728,7 @@
         </w:tc>
         <w:tc>
           <w:tcPr>
-            <w:tcW w:w="1417" w:type="dxa"/>
+            <w:tcW w:w="1389" w:type="dxa"/>
           </w:tcPr>
           <w:p>
             <w:pPr>
@@ -2225,6 +2761,42 @@
               </w:rPr>
               <w:t>（客户明示）</w:t>
             </w:r>
+          </w:p>
+        </w:tc>
+        <w:tc>
+          <w:tcPr>
+            <w:tcW w:w="1021" w:type="dxa"/>
+          </w:tcPr>
+          <w:p>
+            <w:pPr>
+              <w:spacing w:before="40" w:after="40" w:line="288" w:lineRule="auto"/>
+              <w:jc w:val="center"/>
+              <w:rPr>
+                <w:rFonts w:ascii="Arial" w:hAnsi="Arial" w:eastAsia="微软雅黑"/>
+                <w:b w:val="0"/>
+                <w:i w:val="0"/>
+                <w:color w:val="404040"/>
+                <w:sz w:val="19"/>
+              </w:rPr>
+            </w:pPr>
+          </w:p>
+        </w:tc>
+        <w:tc>
+          <w:tcPr>
+            <w:tcW w:w="1021" w:type="dxa"/>
+          </w:tcPr>
+          <w:p>
+            <w:pPr>
+              <w:spacing w:before="40" w:after="40" w:line="288" w:lineRule="auto"/>
+              <w:jc w:val="center"/>
+              <w:rPr>
+                <w:rFonts w:ascii="Arial" w:hAnsi="Arial" w:eastAsia="微软雅黑"/>
+                <w:b w:val="0"/>
+                <w:i w:val="0"/>
+                <w:color w:val="404040"/>
+                <w:sz w:val="19"/>
+              </w:rPr>
+            </w:pPr>
           </w:p>
         </w:tc>
       </w:tr>
@@ -2251,7 +2823,7 @@
         </w:trPr>
         <w:tc>
           <w:tcPr>
-            <w:tcW w:w="624" w:type="dxa"/>
+            <w:tcW w:w="652" w:type="dxa"/>
             <w:shd w:val="clear" w:color="auto" w:fill="EAF1F8"/>
           </w:tcPr>
           <w:p>
@@ -2273,7 +2845,7 @@
         </w:tc>
         <w:tc>
           <w:tcPr>
-            <w:tcW w:w="3515" w:type="dxa"/>
+            <w:tcW w:w="2579" w:type="dxa"/>
             <w:shd w:val="clear" w:color="auto" w:fill="EAF1F8"/>
           </w:tcPr>
           <w:p>
@@ -2294,7 +2866,7 @@
         </w:tc>
         <w:tc>
           <w:tcPr>
-            <w:tcW w:w="4025" w:type="dxa"/>
+            <w:tcW w:w="2920" w:type="dxa"/>
             <w:shd w:val="clear" w:color="auto" w:fill="EAF1F8"/>
           </w:tcPr>
           <w:p>
@@ -2315,7 +2887,7 @@
         </w:tc>
         <w:tc>
           <w:tcPr>
-            <w:tcW w:w="1417" w:type="dxa"/>
+            <w:tcW w:w="1389" w:type="dxa"/>
             <w:shd w:val="clear" w:color="auto" w:fill="EAF1F8"/>
           </w:tcPr>
           <w:p>
@@ -2349,6 +2921,44 @@
               </w:rPr>
               <w:t>（客户明示）</w:t>
             </w:r>
+          </w:p>
+        </w:tc>
+        <w:tc>
+          <w:tcPr>
+            <w:tcW w:w="1021" w:type="dxa"/>
+            <w:shd w:val="clear" w:color="auto" w:fill="EAF1F8"/>
+          </w:tcPr>
+          <w:p>
+            <w:pPr>
+              <w:spacing w:before="40" w:after="40" w:line="288" w:lineRule="auto"/>
+              <w:jc w:val="center"/>
+              <w:rPr>
+                <w:rFonts w:ascii="Arial" w:hAnsi="Arial" w:eastAsia="微软雅黑"/>
+                <w:b w:val="0"/>
+                <w:i w:val="0"/>
+                <w:color w:val="404040"/>
+                <w:sz w:val="19"/>
+              </w:rPr>
+            </w:pPr>
+          </w:p>
+        </w:tc>
+        <w:tc>
+          <w:tcPr>
+            <w:tcW w:w="1021" w:type="dxa"/>
+            <w:shd w:val="clear" w:color="auto" w:fill="EAF1F8"/>
+          </w:tcPr>
+          <w:p>
+            <w:pPr>
+              <w:spacing w:before="40" w:after="40" w:line="288" w:lineRule="auto"/>
+              <w:jc w:val="center"/>
+              <w:rPr>
+                <w:rFonts w:ascii="Arial" w:hAnsi="Arial" w:eastAsia="微软雅黑"/>
+                <w:b w:val="0"/>
+                <w:i w:val="0"/>
+                <w:color w:val="404040"/>
+                <w:sz w:val="19"/>
+              </w:rPr>
+            </w:pPr>
           </w:p>
         </w:tc>
       </w:tr>
@@ -2375,7 +2985,7 @@
         </w:trPr>
         <w:tc>
           <w:tcPr>
-            <w:tcW w:w="624" w:type="dxa"/>
+            <w:tcW w:w="652" w:type="dxa"/>
           </w:tcPr>
           <w:p>
             <w:pPr>
@@ -2396,7 +3006,7 @@
         </w:tc>
         <w:tc>
           <w:tcPr>
-            <w:tcW w:w="3515" w:type="dxa"/>
+            <w:tcW w:w="2579" w:type="dxa"/>
           </w:tcPr>
           <w:p>
             <w:pPr>
@@ -2416,7 +3026,7 @@
         </w:tc>
         <w:tc>
           <w:tcPr>
-            <w:tcW w:w="4025" w:type="dxa"/>
+            <w:tcW w:w="2920" w:type="dxa"/>
           </w:tcPr>
           <w:p>
             <w:pPr>
@@ -2436,7 +3046,7 @@
         </w:tc>
         <w:tc>
           <w:tcPr>
-            <w:tcW w:w="1417" w:type="dxa"/>
+            <w:tcW w:w="1389" w:type="dxa"/>
           </w:tcPr>
           <w:p>
             <w:pPr>
@@ -2469,6 +3079,42 @@
               </w:rPr>
               <w:t>（客户明示）</w:t>
             </w:r>
+          </w:p>
+        </w:tc>
+        <w:tc>
+          <w:tcPr>
+            <w:tcW w:w="1021" w:type="dxa"/>
+          </w:tcPr>
+          <w:p>
+            <w:pPr>
+              <w:spacing w:before="40" w:after="40" w:line="288" w:lineRule="auto"/>
+              <w:jc w:val="center"/>
+              <w:rPr>
+                <w:rFonts w:ascii="Arial" w:hAnsi="Arial" w:eastAsia="微软雅黑"/>
+                <w:b w:val="0"/>
+                <w:i w:val="0"/>
+                <w:color w:val="404040"/>
+                <w:sz w:val="19"/>
+              </w:rPr>
+            </w:pPr>
+          </w:p>
+        </w:tc>
+        <w:tc>
+          <w:tcPr>
+            <w:tcW w:w="1021" w:type="dxa"/>
+          </w:tcPr>
+          <w:p>
+            <w:pPr>
+              <w:spacing w:before="40" w:after="40" w:line="288" w:lineRule="auto"/>
+              <w:jc w:val="center"/>
+              <w:rPr>
+                <w:rFonts w:ascii="Arial" w:hAnsi="Arial" w:eastAsia="微软雅黑"/>
+                <w:b w:val="0"/>
+                <w:i w:val="0"/>
+                <w:color w:val="404040"/>
+                <w:sz w:val="19"/>
+              </w:rPr>
+            </w:pPr>
           </w:p>
         </w:tc>
       </w:tr>
@@ -2495,7 +3141,7 @@
         </w:trPr>
         <w:tc>
           <w:tcPr>
-            <w:tcW w:w="624" w:type="dxa"/>
+            <w:tcW w:w="652" w:type="dxa"/>
             <w:shd w:val="clear" w:color="auto" w:fill="EAF1F8"/>
           </w:tcPr>
           <w:p>
@@ -2517,7 +3163,7 @@
         </w:tc>
         <w:tc>
           <w:tcPr>
-            <w:tcW w:w="3515" w:type="dxa"/>
+            <w:tcW w:w="2579" w:type="dxa"/>
             <w:shd w:val="clear" w:color="auto" w:fill="EAF1F8"/>
           </w:tcPr>
           <w:p>
@@ -2538,7 +3184,7 @@
         </w:tc>
         <w:tc>
           <w:tcPr>
-            <w:tcW w:w="4025" w:type="dxa"/>
+            <w:tcW w:w="2920" w:type="dxa"/>
             <w:shd w:val="clear" w:color="auto" w:fill="EAF1F8"/>
           </w:tcPr>
           <w:p>
@@ -2559,7 +3205,7 @@
         </w:tc>
         <w:tc>
           <w:tcPr>
-            <w:tcW w:w="1417" w:type="dxa"/>
+            <w:tcW w:w="1389" w:type="dxa"/>
             <w:shd w:val="clear" w:color="auto" w:fill="EAF1F8"/>
           </w:tcPr>
           <w:p>
@@ -2593,6 +3239,44 @@
               </w:rPr>
               <w:t>（客户明示）</w:t>
             </w:r>
+          </w:p>
+        </w:tc>
+        <w:tc>
+          <w:tcPr>
+            <w:tcW w:w="1021" w:type="dxa"/>
+            <w:shd w:val="clear" w:color="auto" w:fill="EAF1F8"/>
+          </w:tcPr>
+          <w:p>
+            <w:pPr>
+              <w:spacing w:before="40" w:after="40" w:line="288" w:lineRule="auto"/>
+              <w:jc w:val="center"/>
+              <w:rPr>
+                <w:rFonts w:ascii="Arial" w:hAnsi="Arial" w:eastAsia="微软雅黑"/>
+                <w:b w:val="0"/>
+                <w:i w:val="0"/>
+                <w:color w:val="404040"/>
+                <w:sz w:val="19"/>
+              </w:rPr>
+            </w:pPr>
+          </w:p>
+        </w:tc>
+        <w:tc>
+          <w:tcPr>
+            <w:tcW w:w="1021" w:type="dxa"/>
+            <w:shd w:val="clear" w:color="auto" w:fill="EAF1F8"/>
+          </w:tcPr>
+          <w:p>
+            <w:pPr>
+              <w:spacing w:before="40" w:after="40" w:line="288" w:lineRule="auto"/>
+              <w:jc w:val="center"/>
+              <w:rPr>
+                <w:rFonts w:ascii="Arial" w:hAnsi="Arial" w:eastAsia="微软雅黑"/>
+                <w:b w:val="0"/>
+                <w:i w:val="0"/>
+                <w:color w:val="404040"/>
+                <w:sz w:val="19"/>
+              </w:rPr>
+            </w:pPr>
           </w:p>
         </w:tc>
       </w:tr>
@@ -2619,7 +3303,7 @@
         </w:trPr>
         <w:tc>
           <w:tcPr>
-            <w:tcW w:w="624" w:type="dxa"/>
+            <w:tcW w:w="652" w:type="dxa"/>
           </w:tcPr>
           <w:p>
             <w:pPr>
@@ -2640,7 +3324,7 @@
         </w:tc>
         <w:tc>
           <w:tcPr>
-            <w:tcW w:w="3515" w:type="dxa"/>
+            <w:tcW w:w="2579" w:type="dxa"/>
           </w:tcPr>
           <w:p>
             <w:pPr>
@@ -2660,7 +3344,7 @@
         </w:tc>
         <w:tc>
           <w:tcPr>
-            <w:tcW w:w="4025" w:type="dxa"/>
+            <w:tcW w:w="2920" w:type="dxa"/>
           </w:tcPr>
           <w:p>
             <w:pPr>
@@ -2680,7 +3364,7 @@
         </w:tc>
         <w:tc>
           <w:tcPr>
-            <w:tcW w:w="1417" w:type="dxa"/>
+            <w:tcW w:w="1389" w:type="dxa"/>
           </w:tcPr>
           <w:p>
             <w:pPr>
@@ -2697,6 +3381,42 @@
               </w:rPr>
               <w:t>中</w:t>
             </w:r>
+          </w:p>
+        </w:tc>
+        <w:tc>
+          <w:tcPr>
+            <w:tcW w:w="1021" w:type="dxa"/>
+          </w:tcPr>
+          <w:p>
+            <w:pPr>
+              <w:spacing w:before="40" w:after="40" w:line="288" w:lineRule="auto"/>
+              <w:jc w:val="center"/>
+              <w:rPr>
+                <w:rFonts w:ascii="Arial" w:hAnsi="Arial" w:eastAsia="微软雅黑"/>
+                <w:b w:val="0"/>
+                <w:i w:val="0"/>
+                <w:color w:val="404040"/>
+                <w:sz w:val="19"/>
+              </w:rPr>
+            </w:pPr>
+          </w:p>
+        </w:tc>
+        <w:tc>
+          <w:tcPr>
+            <w:tcW w:w="1021" w:type="dxa"/>
+          </w:tcPr>
+          <w:p>
+            <w:pPr>
+              <w:spacing w:before="40" w:after="40" w:line="288" w:lineRule="auto"/>
+              <w:jc w:val="center"/>
+              <w:rPr>
+                <w:rFonts w:ascii="Arial" w:hAnsi="Arial" w:eastAsia="微软雅黑"/>
+                <w:b w:val="0"/>
+                <w:i w:val="0"/>
+                <w:color w:val="404040"/>
+                <w:sz w:val="19"/>
+              </w:rPr>
+            </w:pPr>
           </w:p>
         </w:tc>
       </w:tr>
@@ -2739,10 +3459,12 @@
         </w:tblCellMar>
       </w:tblPr>
       <w:tblGrid>
-        <w:gridCol w:w="624"/>
-        <w:gridCol w:w="3515"/>
-        <w:gridCol w:w="4025"/>
-        <w:gridCol w:w="1417"/>
+        <w:gridCol w:w="652"/>
+        <w:gridCol w:w="2579"/>
+        <w:gridCol w:w="2920"/>
+        <w:gridCol w:w="1389"/>
+        <w:gridCol w:w="1021"/>
+        <w:gridCol w:w="1021"/>
       </w:tblGrid>
       <w:tr>
         <w:tblPrEx>
@@ -2768,7 +3490,7 @@
         </w:trPr>
         <w:tc>
           <w:tcPr>
-            <w:tcW w:w="624" w:type="dxa"/>
+            <w:tcW w:w="652" w:type="dxa"/>
             <w:shd w:val="clear" w:color="auto" w:fill="1F4E79"/>
           </w:tcPr>
           <w:p>
@@ -2790,7 +3512,7 @@
         </w:tc>
         <w:tc>
           <w:tcPr>
-            <w:tcW w:w="3515" w:type="dxa"/>
+            <w:tcW w:w="2579" w:type="dxa"/>
             <w:shd w:val="clear" w:color="auto" w:fill="1F4E79"/>
           </w:tcPr>
           <w:p>
@@ -2812,7 +3534,7 @@
         </w:tc>
         <w:tc>
           <w:tcPr>
-            <w:tcW w:w="4025" w:type="dxa"/>
+            <w:tcW w:w="2920" w:type="dxa"/>
             <w:shd w:val="clear" w:color="auto" w:fill="1F4E79"/>
           </w:tcPr>
           <w:p>
@@ -2834,7 +3556,7 @@
         </w:tc>
         <w:tc>
           <w:tcPr>
-            <w:tcW w:w="1417" w:type="dxa"/>
+            <w:tcW w:w="1389" w:type="dxa"/>
             <w:shd w:val="clear" w:color="auto" w:fill="1F4E79"/>
           </w:tcPr>
           <w:p>
@@ -2851,6 +3573,50 @@
                 <w:sz w:val="19"/>
               </w:rPr>
               <w:t>优先级</w:t>
+            </w:r>
+          </w:p>
+        </w:tc>
+        <w:tc>
+          <w:tcPr>
+            <w:tcW w:w="1021" w:type="dxa"/>
+            <w:shd w:val="clear" w:color="auto" w:fill="1F4E79"/>
+          </w:tcPr>
+          <w:p>
+            <w:pPr>
+              <w:spacing w:before="40" w:after="40" w:line="288" w:lineRule="auto"/>
+              <w:jc w:val="center"/>
+            </w:pPr>
+            <w:r>
+              <w:rPr>
+                <w:rFonts w:ascii="Arial" w:hAnsi="Arial" w:eastAsia="微软雅黑"/>
+                <w:b/>
+                <w:i w:val="0"/>
+                <w:color w:val="FFFFFF"/>
+                <w:sz w:val="19"/>
+              </w:rPr>
+              <w:t xml:space="preserve">责任部门</w:t>
+            </w:r>
+          </w:p>
+        </w:tc>
+        <w:tc>
+          <w:tcPr>
+            <w:tcW w:w="1021" w:type="dxa"/>
+            <w:shd w:val="clear" w:color="auto" w:fill="1F4E79"/>
+          </w:tcPr>
+          <w:p>
+            <w:pPr>
+              <w:spacing w:before="40" w:after="40" w:line="288" w:lineRule="auto"/>
+              <w:jc w:val="center"/>
+            </w:pPr>
+            <w:r>
+              <w:rPr>
+                <w:rFonts w:ascii="Arial" w:hAnsi="Arial" w:eastAsia="微软雅黑"/>
+                <w:b/>
+                <w:i w:val="0"/>
+                <w:color w:val="FFFFFF"/>
+                <w:sz w:val="19"/>
+              </w:rPr>
+              <w:t xml:space="preserve">完成时间</w:t>
             </w:r>
           </w:p>
         </w:tc>
@@ -2878,7 +3644,7 @@
         </w:trPr>
         <w:tc>
           <w:tcPr>
-            <w:tcW w:w="624" w:type="dxa"/>
+            <w:tcW w:w="652" w:type="dxa"/>
           </w:tcPr>
           <w:p>
             <w:pPr>
@@ -2899,7 +3665,7 @@
         </w:tc>
         <w:tc>
           <w:tcPr>
-            <w:tcW w:w="3515" w:type="dxa"/>
+            <w:tcW w:w="2579" w:type="dxa"/>
           </w:tcPr>
           <w:p>
             <w:pPr>
@@ -2919,7 +3685,7 @@
         </w:tc>
         <w:tc>
           <w:tcPr>
-            <w:tcW w:w="4025" w:type="dxa"/>
+            <w:tcW w:w="2920" w:type="dxa"/>
           </w:tcPr>
           <w:p>
             <w:pPr>
@@ -2939,7 +3705,7 @@
         </w:tc>
         <w:tc>
           <w:tcPr>
-            <w:tcW w:w="1417" w:type="dxa"/>
+            <w:tcW w:w="1389" w:type="dxa"/>
           </w:tcPr>
           <w:p>
             <w:pPr>
@@ -2972,6 +3738,42 @@
               </w:rPr>
               <w:t>（客户明示）</w:t>
             </w:r>
+          </w:p>
+        </w:tc>
+        <w:tc>
+          <w:tcPr>
+            <w:tcW w:w="1021" w:type="dxa"/>
+          </w:tcPr>
+          <w:p>
+            <w:pPr>
+              <w:spacing w:before="40" w:after="40" w:line="288" w:lineRule="auto"/>
+              <w:jc w:val="center"/>
+              <w:rPr>
+                <w:rFonts w:ascii="Arial" w:hAnsi="Arial" w:eastAsia="微软雅黑"/>
+                <w:b w:val="0"/>
+                <w:i w:val="0"/>
+                <w:color w:val="404040"/>
+                <w:sz w:val="19"/>
+              </w:rPr>
+            </w:pPr>
+          </w:p>
+        </w:tc>
+        <w:tc>
+          <w:tcPr>
+            <w:tcW w:w="1021" w:type="dxa"/>
+          </w:tcPr>
+          <w:p>
+            <w:pPr>
+              <w:spacing w:before="40" w:after="40" w:line="288" w:lineRule="auto"/>
+              <w:jc w:val="center"/>
+              <w:rPr>
+                <w:rFonts w:ascii="Arial" w:hAnsi="Arial" w:eastAsia="微软雅黑"/>
+                <w:b w:val="0"/>
+                <w:i w:val="0"/>
+                <w:color w:val="404040"/>
+                <w:sz w:val="19"/>
+              </w:rPr>
+            </w:pPr>
           </w:p>
         </w:tc>
       </w:tr>
@@ -2998,7 +3800,7 @@
         </w:trPr>
         <w:tc>
           <w:tcPr>
-            <w:tcW w:w="624" w:type="dxa"/>
+            <w:tcW w:w="652" w:type="dxa"/>
             <w:shd w:val="clear" w:color="auto" w:fill="EAF1F8"/>
           </w:tcPr>
           <w:p>
@@ -3020,7 +3822,7 @@
         </w:tc>
         <w:tc>
           <w:tcPr>
-            <w:tcW w:w="3515" w:type="dxa"/>
+            <w:tcW w:w="2579" w:type="dxa"/>
             <w:shd w:val="clear" w:color="auto" w:fill="EAF1F8"/>
           </w:tcPr>
           <w:p>
@@ -3041,7 +3843,7 @@
         </w:tc>
         <w:tc>
           <w:tcPr>
-            <w:tcW w:w="4025" w:type="dxa"/>
+            <w:tcW w:w="2920" w:type="dxa"/>
             <w:shd w:val="clear" w:color="auto" w:fill="EAF1F8"/>
           </w:tcPr>
           <w:p>
@@ -3062,7 +3864,7 @@
         </w:tc>
         <w:tc>
           <w:tcPr>
-            <w:tcW w:w="1417" w:type="dxa"/>
+            <w:tcW w:w="1389" w:type="dxa"/>
             <w:shd w:val="clear" w:color="auto" w:fill="EAF1F8"/>
           </w:tcPr>
           <w:p>
@@ -3096,6 +3898,44 @@
               </w:rPr>
               <w:t>（客户明示）</w:t>
             </w:r>
+          </w:p>
+        </w:tc>
+        <w:tc>
+          <w:tcPr>
+            <w:tcW w:w="1021" w:type="dxa"/>
+            <w:shd w:val="clear" w:color="auto" w:fill="EAF1F8"/>
+          </w:tcPr>
+          <w:p>
+            <w:pPr>
+              <w:spacing w:before="40" w:after="40" w:line="288" w:lineRule="auto"/>
+              <w:jc w:val="center"/>
+              <w:rPr>
+                <w:rFonts w:ascii="Arial" w:hAnsi="Arial" w:eastAsia="微软雅黑"/>
+                <w:b w:val="0"/>
+                <w:i w:val="0"/>
+                <w:color w:val="404040"/>
+                <w:sz w:val="19"/>
+              </w:rPr>
+            </w:pPr>
+          </w:p>
+        </w:tc>
+        <w:tc>
+          <w:tcPr>
+            <w:tcW w:w="1021" w:type="dxa"/>
+            <w:shd w:val="clear" w:color="auto" w:fill="EAF1F8"/>
+          </w:tcPr>
+          <w:p>
+            <w:pPr>
+              <w:spacing w:before="40" w:after="40" w:line="288" w:lineRule="auto"/>
+              <w:jc w:val="center"/>
+              <w:rPr>
+                <w:rFonts w:ascii="Arial" w:hAnsi="Arial" w:eastAsia="微软雅黑"/>
+                <w:b w:val="0"/>
+                <w:i w:val="0"/>
+                <w:color w:val="404040"/>
+                <w:sz w:val="19"/>
+              </w:rPr>
+            </w:pPr>
           </w:p>
         </w:tc>
       </w:tr>
@@ -3122,7 +3962,7 @@
         </w:trPr>
         <w:tc>
           <w:tcPr>
-            <w:tcW w:w="624" w:type="dxa"/>
+            <w:tcW w:w="652" w:type="dxa"/>
           </w:tcPr>
           <w:p>
             <w:pPr>
@@ -3143,7 +3983,7 @@
         </w:tc>
         <w:tc>
           <w:tcPr>
-            <w:tcW w:w="3515" w:type="dxa"/>
+            <w:tcW w:w="2579" w:type="dxa"/>
           </w:tcPr>
           <w:p>
             <w:pPr>
@@ -3163,7 +4003,7 @@
         </w:tc>
         <w:tc>
           <w:tcPr>
-            <w:tcW w:w="4025" w:type="dxa"/>
+            <w:tcW w:w="2920" w:type="dxa"/>
           </w:tcPr>
           <w:p>
             <w:pPr>
@@ -3183,7 +4023,7 @@
         </w:tc>
         <w:tc>
           <w:tcPr>
-            <w:tcW w:w="1417" w:type="dxa"/>
+            <w:tcW w:w="1389" w:type="dxa"/>
           </w:tcPr>
           <w:p>
             <w:pPr>
@@ -3216,6 +4056,42 @@
               </w:rPr>
               <w:t>（客户明示）</w:t>
             </w:r>
+          </w:p>
+        </w:tc>
+        <w:tc>
+          <w:tcPr>
+            <w:tcW w:w="1021" w:type="dxa"/>
+          </w:tcPr>
+          <w:p>
+            <w:pPr>
+              <w:spacing w:before="40" w:after="40" w:line="288" w:lineRule="auto"/>
+              <w:jc w:val="center"/>
+              <w:rPr>
+                <w:rFonts w:ascii="Arial" w:hAnsi="Arial" w:eastAsia="微软雅黑"/>
+                <w:b w:val="0"/>
+                <w:i w:val="0"/>
+                <w:color w:val="404040"/>
+                <w:sz w:val="19"/>
+              </w:rPr>
+            </w:pPr>
+          </w:p>
+        </w:tc>
+        <w:tc>
+          <w:tcPr>
+            <w:tcW w:w="1021" w:type="dxa"/>
+          </w:tcPr>
+          <w:p>
+            <w:pPr>
+              <w:spacing w:before="40" w:after="40" w:line="288" w:lineRule="auto"/>
+              <w:jc w:val="center"/>
+              <w:rPr>
+                <w:rFonts w:ascii="Arial" w:hAnsi="Arial" w:eastAsia="微软雅黑"/>
+                <w:b w:val="0"/>
+                <w:i w:val="0"/>
+                <w:color w:val="404040"/>
+                <w:sz w:val="19"/>
+              </w:rPr>
+            </w:pPr>
           </w:p>
         </w:tc>
       </w:tr>
@@ -3242,7 +4118,7 @@
         </w:trPr>
         <w:tc>
           <w:tcPr>
-            <w:tcW w:w="624" w:type="dxa"/>
+            <w:tcW w:w="652" w:type="dxa"/>
             <w:shd w:val="clear" w:color="auto" w:fill="EAF1F8"/>
           </w:tcPr>
           <w:p>
@@ -3264,7 +4140,7 @@
         </w:tc>
         <w:tc>
           <w:tcPr>
-            <w:tcW w:w="3515" w:type="dxa"/>
+            <w:tcW w:w="2579" w:type="dxa"/>
             <w:shd w:val="clear" w:color="auto" w:fill="EAF1F8"/>
           </w:tcPr>
           <w:p>
@@ -3285,7 +4161,7 @@
         </w:tc>
         <w:tc>
           <w:tcPr>
-            <w:tcW w:w="4025" w:type="dxa"/>
+            <w:tcW w:w="2920" w:type="dxa"/>
             <w:shd w:val="clear" w:color="auto" w:fill="EAF1F8"/>
           </w:tcPr>
           <w:p>
@@ -3306,7 +4182,7 @@
         </w:tc>
         <w:tc>
           <w:tcPr>
-            <w:tcW w:w="1417" w:type="dxa"/>
+            <w:tcW w:w="1389" w:type="dxa"/>
             <w:shd w:val="clear" w:color="auto" w:fill="EAF1F8"/>
           </w:tcPr>
           <w:p>
@@ -3340,6 +4216,44 @@
               </w:rPr>
               <w:t>（客户明示）</w:t>
             </w:r>
+          </w:p>
+        </w:tc>
+        <w:tc>
+          <w:tcPr>
+            <w:tcW w:w="1021" w:type="dxa"/>
+            <w:shd w:val="clear" w:color="auto" w:fill="EAF1F8"/>
+          </w:tcPr>
+          <w:p>
+            <w:pPr>
+              <w:spacing w:before="40" w:after="40" w:line="288" w:lineRule="auto"/>
+              <w:jc w:val="center"/>
+              <w:rPr>
+                <w:rFonts w:ascii="Arial" w:hAnsi="Arial" w:eastAsia="微软雅黑"/>
+                <w:b w:val="0"/>
+                <w:i w:val="0"/>
+                <w:color w:val="404040"/>
+                <w:sz w:val="19"/>
+              </w:rPr>
+            </w:pPr>
+          </w:p>
+        </w:tc>
+        <w:tc>
+          <w:tcPr>
+            <w:tcW w:w="1021" w:type="dxa"/>
+            <w:shd w:val="clear" w:color="auto" w:fill="EAF1F8"/>
+          </w:tcPr>
+          <w:p>
+            <w:pPr>
+              <w:spacing w:before="40" w:after="40" w:line="288" w:lineRule="auto"/>
+              <w:jc w:val="center"/>
+              <w:rPr>
+                <w:rFonts w:ascii="Arial" w:hAnsi="Arial" w:eastAsia="微软雅黑"/>
+                <w:b w:val="0"/>
+                <w:i w:val="0"/>
+                <w:color w:val="404040"/>
+                <w:sz w:val="19"/>
+              </w:rPr>
+            </w:pPr>
           </w:p>
         </w:tc>
       </w:tr>
@@ -3366,7 +4280,7 @@
         </w:trPr>
         <w:tc>
           <w:tcPr>
-            <w:tcW w:w="624" w:type="dxa"/>
+            <w:tcW w:w="652" w:type="dxa"/>
           </w:tcPr>
           <w:p>
             <w:pPr>
@@ -3387,7 +4301,7 @@
         </w:tc>
         <w:tc>
           <w:tcPr>
-            <w:tcW w:w="3515" w:type="dxa"/>
+            <w:tcW w:w="2579" w:type="dxa"/>
           </w:tcPr>
           <w:p>
             <w:pPr>
@@ -3407,7 +4321,7 @@
         </w:tc>
         <w:tc>
           <w:tcPr>
-            <w:tcW w:w="4025" w:type="dxa"/>
+            <w:tcW w:w="2920" w:type="dxa"/>
           </w:tcPr>
           <w:p>
             <w:pPr>
@@ -3427,7 +4341,7 @@
         </w:tc>
         <w:tc>
           <w:tcPr>
-            <w:tcW w:w="1417" w:type="dxa"/>
+            <w:tcW w:w="1389" w:type="dxa"/>
           </w:tcPr>
           <w:p>
             <w:pPr>
@@ -3460,6 +4374,42 @@
               </w:rPr>
               <w:t>（客户明示）</w:t>
             </w:r>
+          </w:p>
+        </w:tc>
+        <w:tc>
+          <w:tcPr>
+            <w:tcW w:w="1021" w:type="dxa"/>
+          </w:tcPr>
+          <w:p>
+            <w:pPr>
+              <w:spacing w:before="40" w:after="40" w:line="288" w:lineRule="auto"/>
+              <w:jc w:val="center"/>
+              <w:rPr>
+                <w:rFonts w:ascii="Arial" w:hAnsi="Arial" w:eastAsia="微软雅黑"/>
+                <w:b w:val="0"/>
+                <w:i w:val="0"/>
+                <w:color w:val="404040"/>
+                <w:sz w:val="19"/>
+              </w:rPr>
+            </w:pPr>
+          </w:p>
+        </w:tc>
+        <w:tc>
+          <w:tcPr>
+            <w:tcW w:w="1021" w:type="dxa"/>
+          </w:tcPr>
+          <w:p>
+            <w:pPr>
+              <w:spacing w:before="40" w:after="40" w:line="288" w:lineRule="auto"/>
+              <w:jc w:val="center"/>
+              <w:rPr>
+                <w:rFonts w:ascii="Arial" w:hAnsi="Arial" w:eastAsia="微软雅黑"/>
+                <w:b w:val="0"/>
+                <w:i w:val="0"/>
+                <w:color w:val="404040"/>
+                <w:sz w:val="19"/>
+              </w:rPr>
+            </w:pPr>
           </w:p>
         </w:tc>
       </w:tr>
@@ -3486,7 +4436,7 @@
         </w:trPr>
         <w:tc>
           <w:tcPr>
-            <w:tcW w:w="624" w:type="dxa"/>
+            <w:tcW w:w="652" w:type="dxa"/>
             <w:shd w:val="clear" w:color="auto" w:fill="EAF1F8"/>
           </w:tcPr>
           <w:p>
@@ -3508,7 +4458,7 @@
         </w:tc>
         <w:tc>
           <w:tcPr>
-            <w:tcW w:w="3515" w:type="dxa"/>
+            <w:tcW w:w="2579" w:type="dxa"/>
             <w:shd w:val="clear" w:color="auto" w:fill="EAF1F8"/>
           </w:tcPr>
           <w:p>
@@ -3529,7 +4479,7 @@
         </w:tc>
         <w:tc>
           <w:tcPr>
-            <w:tcW w:w="4025" w:type="dxa"/>
+            <w:tcW w:w="2920" w:type="dxa"/>
             <w:shd w:val="clear" w:color="auto" w:fill="EAF1F8"/>
           </w:tcPr>
           <w:p>
@@ -3550,7 +4500,7 @@
         </w:tc>
         <w:tc>
           <w:tcPr>
-            <w:tcW w:w="1417" w:type="dxa"/>
+            <w:tcW w:w="1389" w:type="dxa"/>
             <w:shd w:val="clear" w:color="auto" w:fill="EAF1F8"/>
           </w:tcPr>
           <w:p>
@@ -3568,6 +4518,44 @@
               </w:rPr>
               <w:t>中</w:t>
             </w:r>
+          </w:p>
+        </w:tc>
+        <w:tc>
+          <w:tcPr>
+            <w:tcW w:w="1021" w:type="dxa"/>
+            <w:shd w:val="clear" w:color="auto" w:fill="EAF1F8"/>
+          </w:tcPr>
+          <w:p>
+            <w:pPr>
+              <w:spacing w:before="40" w:after="40" w:line="288" w:lineRule="auto"/>
+              <w:jc w:val="center"/>
+              <w:rPr>
+                <w:rFonts w:ascii="Arial" w:hAnsi="Arial" w:eastAsia="微软雅黑"/>
+                <w:b w:val="0"/>
+                <w:i w:val="0"/>
+                <w:color w:val="404040"/>
+                <w:sz w:val="19"/>
+              </w:rPr>
+            </w:pPr>
+          </w:p>
+        </w:tc>
+        <w:tc>
+          <w:tcPr>
+            <w:tcW w:w="1021" w:type="dxa"/>
+            <w:shd w:val="clear" w:color="auto" w:fill="EAF1F8"/>
+          </w:tcPr>
+          <w:p>
+            <w:pPr>
+              <w:spacing w:before="40" w:after="40" w:line="288" w:lineRule="auto"/>
+              <w:jc w:val="center"/>
+              <w:rPr>
+                <w:rFonts w:ascii="Arial" w:hAnsi="Arial" w:eastAsia="微软雅黑"/>
+                <w:b w:val="0"/>
+                <w:i w:val="0"/>
+                <w:color w:val="404040"/>
+                <w:sz w:val="19"/>
+              </w:rPr>
+            </w:pPr>
           </w:p>
         </w:tc>
       </w:tr>
@@ -3610,10 +4598,12 @@
         </w:tblCellMar>
       </w:tblPr>
       <w:tblGrid>
-        <w:gridCol w:w="624"/>
-        <w:gridCol w:w="3515"/>
-        <w:gridCol w:w="4025"/>
-        <w:gridCol w:w="1417"/>
+        <w:gridCol w:w="652"/>
+        <w:gridCol w:w="2579"/>
+        <w:gridCol w:w="2920"/>
+        <w:gridCol w:w="1389"/>
+        <w:gridCol w:w="1021"/>
+        <w:gridCol w:w="1021"/>
       </w:tblGrid>
       <w:tr>
         <w:tblPrEx>
@@ -3639,7 +4629,7 @@
         </w:trPr>
         <w:tc>
           <w:tcPr>
-            <w:tcW w:w="624" w:type="dxa"/>
+            <w:tcW w:w="652" w:type="dxa"/>
             <w:shd w:val="clear" w:color="auto" w:fill="1F4E79"/>
           </w:tcPr>
           <w:p>
@@ -3661,7 +4651,7 @@
         </w:tc>
         <w:tc>
           <w:tcPr>
-            <w:tcW w:w="3515" w:type="dxa"/>
+            <w:tcW w:w="2579" w:type="dxa"/>
             <w:shd w:val="clear" w:color="auto" w:fill="1F4E79"/>
           </w:tcPr>
           <w:p>
@@ -3683,7 +4673,7 @@
         </w:tc>
         <w:tc>
           <w:tcPr>
-            <w:tcW w:w="4025" w:type="dxa"/>
+            <w:tcW w:w="2920" w:type="dxa"/>
             <w:shd w:val="clear" w:color="auto" w:fill="1F4E79"/>
           </w:tcPr>
           <w:p>
@@ -3705,7 +4695,7 @@
         </w:tc>
         <w:tc>
           <w:tcPr>
-            <w:tcW w:w="1417" w:type="dxa"/>
+            <w:tcW w:w="1389" w:type="dxa"/>
             <w:shd w:val="clear" w:color="auto" w:fill="1F4E79"/>
           </w:tcPr>
           <w:p>
@@ -3722,6 +4712,50 @@
                 <w:sz w:val="19"/>
               </w:rPr>
               <w:t>优先级</w:t>
+            </w:r>
+          </w:p>
+        </w:tc>
+        <w:tc>
+          <w:tcPr>
+            <w:tcW w:w="1021" w:type="dxa"/>
+            <w:shd w:val="clear" w:color="auto" w:fill="1F4E79"/>
+          </w:tcPr>
+          <w:p>
+            <w:pPr>
+              <w:spacing w:before="40" w:after="40" w:line="288" w:lineRule="auto"/>
+              <w:jc w:val="center"/>
+            </w:pPr>
+            <w:r>
+              <w:rPr>
+                <w:rFonts w:ascii="Arial" w:hAnsi="Arial" w:eastAsia="微软雅黑"/>
+                <w:b/>
+                <w:i w:val="0"/>
+                <w:color w:val="FFFFFF"/>
+                <w:sz w:val="19"/>
+              </w:rPr>
+              <w:t xml:space="preserve">责任部门</w:t>
+            </w:r>
+          </w:p>
+        </w:tc>
+        <w:tc>
+          <w:tcPr>
+            <w:tcW w:w="1021" w:type="dxa"/>
+            <w:shd w:val="clear" w:color="auto" w:fill="1F4E79"/>
+          </w:tcPr>
+          <w:p>
+            <w:pPr>
+              <w:spacing w:before="40" w:after="40" w:line="288" w:lineRule="auto"/>
+              <w:jc w:val="center"/>
+            </w:pPr>
+            <w:r>
+              <w:rPr>
+                <w:rFonts w:ascii="Arial" w:hAnsi="Arial" w:eastAsia="微软雅黑"/>
+                <w:b/>
+                <w:i w:val="0"/>
+                <w:color w:val="FFFFFF"/>
+                <w:sz w:val="19"/>
+              </w:rPr>
+              <w:t xml:space="preserve">完成时间</w:t>
             </w:r>
           </w:p>
         </w:tc>
@@ -3749,7 +4783,7 @@
         </w:trPr>
         <w:tc>
           <w:tcPr>
-            <w:tcW w:w="624" w:type="dxa"/>
+            <w:tcW w:w="652" w:type="dxa"/>
           </w:tcPr>
           <w:p>
             <w:pPr>
@@ -3770,7 +4804,7 @@
         </w:tc>
         <w:tc>
           <w:tcPr>
-            <w:tcW w:w="3515" w:type="dxa"/>
+            <w:tcW w:w="2579" w:type="dxa"/>
           </w:tcPr>
           <w:p>
             <w:pPr>
@@ -3790,7 +4824,7 @@
         </w:tc>
         <w:tc>
           <w:tcPr>
-            <w:tcW w:w="4025" w:type="dxa"/>
+            <w:tcW w:w="2920" w:type="dxa"/>
           </w:tcPr>
           <w:p>
             <w:pPr>
@@ -3810,7 +4844,7 @@
         </w:tc>
         <w:tc>
           <w:tcPr>
-            <w:tcW w:w="1417" w:type="dxa"/>
+            <w:tcW w:w="1389" w:type="dxa"/>
           </w:tcPr>
           <w:p>
             <w:pPr>
@@ -3843,6 +4877,42 @@
               </w:rPr>
               <w:t>（客户明示）</w:t>
             </w:r>
+          </w:p>
+        </w:tc>
+        <w:tc>
+          <w:tcPr>
+            <w:tcW w:w="1021" w:type="dxa"/>
+          </w:tcPr>
+          <w:p>
+            <w:pPr>
+              <w:spacing w:before="40" w:after="40" w:line="288" w:lineRule="auto"/>
+              <w:jc w:val="center"/>
+              <w:rPr>
+                <w:rFonts w:ascii="Arial" w:hAnsi="Arial" w:eastAsia="微软雅黑"/>
+                <w:b w:val="0"/>
+                <w:i w:val="0"/>
+                <w:color w:val="404040"/>
+                <w:sz w:val="19"/>
+              </w:rPr>
+            </w:pPr>
+          </w:p>
+        </w:tc>
+        <w:tc>
+          <w:tcPr>
+            <w:tcW w:w="1021" w:type="dxa"/>
+          </w:tcPr>
+          <w:p>
+            <w:pPr>
+              <w:spacing w:before="40" w:after="40" w:line="288" w:lineRule="auto"/>
+              <w:jc w:val="center"/>
+              <w:rPr>
+                <w:rFonts w:ascii="Arial" w:hAnsi="Arial" w:eastAsia="微软雅黑"/>
+                <w:b w:val="0"/>
+                <w:i w:val="0"/>
+                <w:color w:val="404040"/>
+                <w:sz w:val="19"/>
+              </w:rPr>
+            </w:pPr>
           </w:p>
         </w:tc>
       </w:tr>
@@ -3869,7 +4939,7 @@
         </w:trPr>
         <w:tc>
           <w:tcPr>
-            <w:tcW w:w="624" w:type="dxa"/>
+            <w:tcW w:w="652" w:type="dxa"/>
             <w:shd w:val="clear" w:color="auto" w:fill="EAF1F8"/>
           </w:tcPr>
           <w:p>
@@ -3891,7 +4961,7 @@
         </w:tc>
         <w:tc>
           <w:tcPr>
-            <w:tcW w:w="3515" w:type="dxa"/>
+            <w:tcW w:w="2579" w:type="dxa"/>
             <w:shd w:val="clear" w:color="auto" w:fill="EAF1F8"/>
           </w:tcPr>
           <w:p>
@@ -3912,7 +4982,7 @@
         </w:tc>
         <w:tc>
           <w:tcPr>
-            <w:tcW w:w="4025" w:type="dxa"/>
+            <w:tcW w:w="2920" w:type="dxa"/>
             <w:shd w:val="clear" w:color="auto" w:fill="EAF1F8"/>
           </w:tcPr>
           <w:p>
@@ -3933,7 +5003,7 @@
         </w:tc>
         <w:tc>
           <w:tcPr>
-            <w:tcW w:w="1417" w:type="dxa"/>
+            <w:tcW w:w="1389" w:type="dxa"/>
             <w:shd w:val="clear" w:color="auto" w:fill="EAF1F8"/>
           </w:tcPr>
           <w:p>
@@ -3967,6 +5037,44 @@
               </w:rPr>
               <w:t>（客户明示）</w:t>
             </w:r>
+          </w:p>
+        </w:tc>
+        <w:tc>
+          <w:tcPr>
+            <w:tcW w:w="1021" w:type="dxa"/>
+            <w:shd w:val="clear" w:color="auto" w:fill="EAF1F8"/>
+          </w:tcPr>
+          <w:p>
+            <w:pPr>
+              <w:spacing w:before="40" w:after="40" w:line="288" w:lineRule="auto"/>
+              <w:jc w:val="center"/>
+              <w:rPr>
+                <w:rFonts w:ascii="Arial" w:hAnsi="Arial" w:eastAsia="微软雅黑"/>
+                <w:b w:val="0"/>
+                <w:i w:val="0"/>
+                <w:color w:val="404040"/>
+                <w:sz w:val="19"/>
+              </w:rPr>
+            </w:pPr>
+          </w:p>
+        </w:tc>
+        <w:tc>
+          <w:tcPr>
+            <w:tcW w:w="1021" w:type="dxa"/>
+            <w:shd w:val="clear" w:color="auto" w:fill="EAF1F8"/>
+          </w:tcPr>
+          <w:p>
+            <w:pPr>
+              <w:spacing w:before="40" w:after="40" w:line="288" w:lineRule="auto"/>
+              <w:jc w:val="center"/>
+              <w:rPr>
+                <w:rFonts w:ascii="Arial" w:hAnsi="Arial" w:eastAsia="微软雅黑"/>
+                <w:b w:val="0"/>
+                <w:i w:val="0"/>
+                <w:color w:val="404040"/>
+                <w:sz w:val="19"/>
+              </w:rPr>
+            </w:pPr>
           </w:p>
         </w:tc>
       </w:tr>
@@ -3993,7 +5101,7 @@
         </w:trPr>
         <w:tc>
           <w:tcPr>
-            <w:tcW w:w="624" w:type="dxa"/>
+            <w:tcW w:w="652" w:type="dxa"/>
           </w:tcPr>
           <w:p>
             <w:pPr>
@@ -4014,7 +5122,7 @@
         </w:tc>
         <w:tc>
           <w:tcPr>
-            <w:tcW w:w="3515" w:type="dxa"/>
+            <w:tcW w:w="2579" w:type="dxa"/>
           </w:tcPr>
           <w:p>
             <w:pPr>
@@ -4034,7 +5142,7 @@
         </w:tc>
         <w:tc>
           <w:tcPr>
-            <w:tcW w:w="4025" w:type="dxa"/>
+            <w:tcW w:w="2920" w:type="dxa"/>
           </w:tcPr>
           <w:p>
             <w:pPr>
@@ -4054,7 +5162,7 @@
         </w:tc>
         <w:tc>
           <w:tcPr>
-            <w:tcW w:w="1417" w:type="dxa"/>
+            <w:tcW w:w="1389" w:type="dxa"/>
           </w:tcPr>
           <w:p>
             <w:pPr>
@@ -4071,6 +5179,42 @@
               </w:rPr>
               <w:t>中</w:t>
             </w:r>
+          </w:p>
+        </w:tc>
+        <w:tc>
+          <w:tcPr>
+            <w:tcW w:w="1021" w:type="dxa"/>
+          </w:tcPr>
+          <w:p>
+            <w:pPr>
+              <w:spacing w:before="40" w:after="40" w:line="288" w:lineRule="auto"/>
+              <w:jc w:val="center"/>
+              <w:rPr>
+                <w:rFonts w:ascii="Arial" w:hAnsi="Arial" w:eastAsia="微软雅黑"/>
+                <w:b w:val="0"/>
+                <w:i w:val="0"/>
+                <w:color w:val="404040"/>
+                <w:sz w:val="19"/>
+              </w:rPr>
+            </w:pPr>
+          </w:p>
+        </w:tc>
+        <w:tc>
+          <w:tcPr>
+            <w:tcW w:w="1021" w:type="dxa"/>
+          </w:tcPr>
+          <w:p>
+            <w:pPr>
+              <w:spacing w:before="40" w:after="40" w:line="288" w:lineRule="auto"/>
+              <w:jc w:val="center"/>
+              <w:rPr>
+                <w:rFonts w:ascii="Arial" w:hAnsi="Arial" w:eastAsia="微软雅黑"/>
+                <w:b w:val="0"/>
+                <w:i w:val="0"/>
+                <w:color w:val="404040"/>
+                <w:sz w:val="19"/>
+              </w:rPr>
+            </w:pPr>
           </w:p>
         </w:tc>
       </w:tr>
@@ -4097,7 +5241,7 @@
         </w:trPr>
         <w:tc>
           <w:tcPr>
-            <w:tcW w:w="624" w:type="dxa"/>
+            <w:tcW w:w="652" w:type="dxa"/>
             <w:shd w:val="clear" w:color="auto" w:fill="EAF1F8"/>
           </w:tcPr>
           <w:p>
@@ -4119,7 +5263,7 @@
         </w:tc>
         <w:tc>
           <w:tcPr>
-            <w:tcW w:w="3515" w:type="dxa"/>
+            <w:tcW w:w="2579" w:type="dxa"/>
             <w:shd w:val="clear" w:color="auto" w:fill="EAF1F8"/>
           </w:tcPr>
           <w:p>
@@ -4140,7 +5284,7 @@
         </w:tc>
         <w:tc>
           <w:tcPr>
-            <w:tcW w:w="4025" w:type="dxa"/>
+            <w:tcW w:w="2920" w:type="dxa"/>
             <w:shd w:val="clear" w:color="auto" w:fill="EAF1F8"/>
           </w:tcPr>
           <w:p>
@@ -4161,7 +5305,7 @@
         </w:tc>
         <w:tc>
           <w:tcPr>
-            <w:tcW w:w="1417" w:type="dxa"/>
+            <w:tcW w:w="1389" w:type="dxa"/>
             <w:shd w:val="clear" w:color="auto" w:fill="EAF1F8"/>
           </w:tcPr>
           <w:p>
@@ -4179,6 +5323,44 @@
               </w:rPr>
               <w:t>中</w:t>
             </w:r>
+          </w:p>
+        </w:tc>
+        <w:tc>
+          <w:tcPr>
+            <w:tcW w:w="1021" w:type="dxa"/>
+            <w:shd w:val="clear" w:color="auto" w:fill="EAF1F8"/>
+          </w:tcPr>
+          <w:p>
+            <w:pPr>
+              <w:spacing w:before="40" w:after="40" w:line="288" w:lineRule="auto"/>
+              <w:jc w:val="center"/>
+              <w:rPr>
+                <w:rFonts w:ascii="Arial" w:hAnsi="Arial" w:eastAsia="微软雅黑"/>
+                <w:b w:val="0"/>
+                <w:i w:val="0"/>
+                <w:color w:val="404040"/>
+                <w:sz w:val="19"/>
+              </w:rPr>
+            </w:pPr>
+          </w:p>
+        </w:tc>
+        <w:tc>
+          <w:tcPr>
+            <w:tcW w:w="1021" w:type="dxa"/>
+            <w:shd w:val="clear" w:color="auto" w:fill="EAF1F8"/>
+          </w:tcPr>
+          <w:p>
+            <w:pPr>
+              <w:spacing w:before="40" w:after="40" w:line="288" w:lineRule="auto"/>
+              <w:jc w:val="center"/>
+              <w:rPr>
+                <w:rFonts w:ascii="Arial" w:hAnsi="Arial" w:eastAsia="微软雅黑"/>
+                <w:b w:val="0"/>
+                <w:i w:val="0"/>
+                <w:color w:val="404040"/>
+                <w:sz w:val="19"/>
+              </w:rPr>
+            </w:pPr>
           </w:p>
         </w:tc>
       </w:tr>
@@ -4221,10 +5403,12 @@
         </w:tblCellMar>
       </w:tblPr>
       <w:tblGrid>
-        <w:gridCol w:w="624"/>
-        <w:gridCol w:w="3515"/>
-        <w:gridCol w:w="4025"/>
-        <w:gridCol w:w="1417"/>
+        <w:gridCol w:w="652"/>
+        <w:gridCol w:w="2579"/>
+        <w:gridCol w:w="2920"/>
+        <w:gridCol w:w="1389"/>
+        <w:gridCol w:w="1021"/>
+        <w:gridCol w:w="1021"/>
       </w:tblGrid>
       <w:tr>
         <w:tblPrEx>
@@ -4250,7 +5434,7 @@
         </w:trPr>
         <w:tc>
           <w:tcPr>
-            <w:tcW w:w="624" w:type="dxa"/>
+            <w:tcW w:w="652" w:type="dxa"/>
             <w:shd w:val="clear" w:color="auto" w:fill="1F4E79"/>
           </w:tcPr>
           <w:p>
@@ -4272,7 +5456,7 @@
         </w:tc>
         <w:tc>
           <w:tcPr>
-            <w:tcW w:w="3515" w:type="dxa"/>
+            <w:tcW w:w="2579" w:type="dxa"/>
             <w:shd w:val="clear" w:color="auto" w:fill="1F4E79"/>
           </w:tcPr>
           <w:p>
@@ -4294,7 +5478,7 @@
         </w:tc>
         <w:tc>
           <w:tcPr>
-            <w:tcW w:w="4025" w:type="dxa"/>
+            <w:tcW w:w="2920" w:type="dxa"/>
             <w:shd w:val="clear" w:color="auto" w:fill="1F4E79"/>
           </w:tcPr>
           <w:p>
@@ -4316,7 +5500,7 @@
         </w:tc>
         <w:tc>
           <w:tcPr>
-            <w:tcW w:w="1417" w:type="dxa"/>
+            <w:tcW w:w="1389" w:type="dxa"/>
             <w:shd w:val="clear" w:color="auto" w:fill="1F4E79"/>
           </w:tcPr>
           <w:p>
@@ -4333,6 +5517,50 @@
                 <w:sz w:val="19"/>
               </w:rPr>
               <w:t>优先级</w:t>
+            </w:r>
+          </w:p>
+        </w:tc>
+        <w:tc>
+          <w:tcPr>
+            <w:tcW w:w="1021" w:type="dxa"/>
+            <w:shd w:val="clear" w:color="auto" w:fill="1F4E79"/>
+          </w:tcPr>
+          <w:p>
+            <w:pPr>
+              <w:spacing w:before="40" w:after="40" w:line="288" w:lineRule="auto"/>
+              <w:jc w:val="center"/>
+            </w:pPr>
+            <w:r>
+              <w:rPr>
+                <w:rFonts w:ascii="Arial" w:hAnsi="Arial" w:eastAsia="微软雅黑"/>
+                <w:b/>
+                <w:i w:val="0"/>
+                <w:color w:val="FFFFFF"/>
+                <w:sz w:val="19"/>
+              </w:rPr>
+              <w:t xml:space="preserve">责任部门</w:t>
+            </w:r>
+          </w:p>
+        </w:tc>
+        <w:tc>
+          <w:tcPr>
+            <w:tcW w:w="1021" w:type="dxa"/>
+            <w:shd w:val="clear" w:color="auto" w:fill="1F4E79"/>
+          </w:tcPr>
+          <w:p>
+            <w:pPr>
+              <w:spacing w:before="40" w:after="40" w:line="288" w:lineRule="auto"/>
+              <w:jc w:val="center"/>
+            </w:pPr>
+            <w:r>
+              <w:rPr>
+                <w:rFonts w:ascii="Arial" w:hAnsi="Arial" w:eastAsia="微软雅黑"/>
+                <w:b/>
+                <w:i w:val="0"/>
+                <w:color w:val="FFFFFF"/>
+                <w:sz w:val="19"/>
+              </w:rPr>
+              <w:t xml:space="preserve">完成时间</w:t>
             </w:r>
           </w:p>
         </w:tc>
@@ -4360,7 +5588,7 @@
         </w:trPr>
         <w:tc>
           <w:tcPr>
-            <w:tcW w:w="624" w:type="dxa"/>
+            <w:tcW w:w="652" w:type="dxa"/>
           </w:tcPr>
           <w:p>
             <w:pPr>
@@ -4381,7 +5609,7 @@
         </w:tc>
         <w:tc>
           <w:tcPr>
-            <w:tcW w:w="3515" w:type="dxa"/>
+            <w:tcW w:w="2579" w:type="dxa"/>
           </w:tcPr>
           <w:p>
             <w:pPr>
@@ -4401,7 +5629,7 @@
         </w:tc>
         <w:tc>
           <w:tcPr>
-            <w:tcW w:w="4025" w:type="dxa"/>
+            <w:tcW w:w="2920" w:type="dxa"/>
           </w:tcPr>
           <w:p>
             <w:pPr>
@@ -4433,7 +5661,7 @@
         </w:tc>
         <w:tc>
           <w:tcPr>
-            <w:tcW w:w="1417" w:type="dxa"/>
+            <w:tcW w:w="1389" w:type="dxa"/>
           </w:tcPr>
           <w:p>
             <w:pPr>
@@ -4466,6 +5694,42 @@
               </w:rPr>
               <w:t>（客户明示）</w:t>
             </w:r>
+          </w:p>
+        </w:tc>
+        <w:tc>
+          <w:tcPr>
+            <w:tcW w:w="1021" w:type="dxa"/>
+          </w:tcPr>
+          <w:p>
+            <w:pPr>
+              <w:spacing w:before="40" w:after="40" w:line="288" w:lineRule="auto"/>
+              <w:jc w:val="center"/>
+              <w:rPr>
+                <w:rFonts w:ascii="Arial" w:hAnsi="Arial" w:eastAsia="微软雅黑"/>
+                <w:b w:val="0"/>
+                <w:i w:val="0"/>
+                <w:color w:val="404040"/>
+                <w:sz w:val="19"/>
+              </w:rPr>
+            </w:pPr>
+          </w:p>
+        </w:tc>
+        <w:tc>
+          <w:tcPr>
+            <w:tcW w:w="1021" w:type="dxa"/>
+          </w:tcPr>
+          <w:p>
+            <w:pPr>
+              <w:spacing w:before="40" w:after="40" w:line="288" w:lineRule="auto"/>
+              <w:jc w:val="center"/>
+              <w:rPr>
+                <w:rFonts w:ascii="Arial" w:hAnsi="Arial" w:eastAsia="微软雅黑"/>
+                <w:b w:val="0"/>
+                <w:i w:val="0"/>
+                <w:color w:val="404040"/>
+                <w:sz w:val="19"/>
+              </w:rPr>
+            </w:pPr>
           </w:p>
         </w:tc>
       </w:tr>
@@ -4492,7 +5756,7 @@
         </w:trPr>
         <w:tc>
           <w:tcPr>
-            <w:tcW w:w="624" w:type="dxa"/>
+            <w:tcW w:w="652" w:type="dxa"/>
             <w:shd w:val="clear" w:color="auto" w:fill="EAF1F8"/>
           </w:tcPr>
           <w:p>
@@ -4514,7 +5778,7 @@
         </w:tc>
         <w:tc>
           <w:tcPr>
-            <w:tcW w:w="3515" w:type="dxa"/>
+            <w:tcW w:w="2579" w:type="dxa"/>
             <w:shd w:val="clear" w:color="auto" w:fill="EAF1F8"/>
           </w:tcPr>
           <w:p>
@@ -4535,7 +5799,7 @@
         </w:tc>
         <w:tc>
           <w:tcPr>
-            <w:tcW w:w="4025" w:type="dxa"/>
+            <w:tcW w:w="2920" w:type="dxa"/>
             <w:shd w:val="clear" w:color="auto" w:fill="EAF1F8"/>
           </w:tcPr>
           <w:p>
@@ -4556,7 +5820,7 @@
         </w:tc>
         <w:tc>
           <w:tcPr>
-            <w:tcW w:w="1417" w:type="dxa"/>
+            <w:tcW w:w="1389" w:type="dxa"/>
             <w:shd w:val="clear" w:color="auto" w:fill="EAF1F8"/>
           </w:tcPr>
           <w:p>
@@ -4574,6 +5838,44 @@
               </w:rPr>
               <w:t>中</w:t>
             </w:r>
+          </w:p>
+        </w:tc>
+        <w:tc>
+          <w:tcPr>
+            <w:tcW w:w="1021" w:type="dxa"/>
+            <w:shd w:val="clear" w:color="auto" w:fill="EAF1F8"/>
+          </w:tcPr>
+          <w:p>
+            <w:pPr>
+              <w:spacing w:before="40" w:after="40" w:line="288" w:lineRule="auto"/>
+              <w:jc w:val="center"/>
+              <w:rPr>
+                <w:rFonts w:ascii="Arial" w:hAnsi="Arial" w:eastAsia="微软雅黑"/>
+                <w:b w:val="0"/>
+                <w:i w:val="0"/>
+                <w:color w:val="404040"/>
+                <w:sz w:val="19"/>
+              </w:rPr>
+            </w:pPr>
+          </w:p>
+        </w:tc>
+        <w:tc>
+          <w:tcPr>
+            <w:tcW w:w="1021" w:type="dxa"/>
+            <w:shd w:val="clear" w:color="auto" w:fill="EAF1F8"/>
+          </w:tcPr>
+          <w:p>
+            <w:pPr>
+              <w:spacing w:before="40" w:after="40" w:line="288" w:lineRule="auto"/>
+              <w:jc w:val="center"/>
+              <w:rPr>
+                <w:rFonts w:ascii="Arial" w:hAnsi="Arial" w:eastAsia="微软雅黑"/>
+                <w:b w:val="0"/>
+                <w:i w:val="0"/>
+                <w:color w:val="404040"/>
+                <w:sz w:val="19"/>
+              </w:rPr>
+            </w:pPr>
           </w:p>
         </w:tc>
       </w:tr>
@@ -4616,10 +5918,12 @@
         </w:tblCellMar>
       </w:tblPr>
       <w:tblGrid>
-        <w:gridCol w:w="624"/>
-        <w:gridCol w:w="3515"/>
-        <w:gridCol w:w="4025"/>
-        <w:gridCol w:w="1417"/>
+        <w:gridCol w:w="652"/>
+        <w:gridCol w:w="2579"/>
+        <w:gridCol w:w="2920"/>
+        <w:gridCol w:w="1389"/>
+        <w:gridCol w:w="1021"/>
+        <w:gridCol w:w="1021"/>
       </w:tblGrid>
       <w:tr>
         <w:tblPrEx>
@@ -4645,7 +5949,7 @@
         </w:trPr>
         <w:tc>
           <w:tcPr>
-            <w:tcW w:w="624" w:type="dxa"/>
+            <w:tcW w:w="652" w:type="dxa"/>
             <w:shd w:val="clear" w:color="auto" w:fill="1F4E79"/>
           </w:tcPr>
           <w:p>
@@ -4667,7 +5971,7 @@
         </w:tc>
         <w:tc>
           <w:tcPr>
-            <w:tcW w:w="3515" w:type="dxa"/>
+            <w:tcW w:w="2579" w:type="dxa"/>
             <w:shd w:val="clear" w:color="auto" w:fill="1F4E79"/>
           </w:tcPr>
           <w:p>
@@ -4689,7 +5993,7 @@
         </w:tc>
         <w:tc>
           <w:tcPr>
-            <w:tcW w:w="4025" w:type="dxa"/>
+            <w:tcW w:w="2920" w:type="dxa"/>
             <w:shd w:val="clear" w:color="auto" w:fill="1F4E79"/>
           </w:tcPr>
           <w:p>
@@ -4711,7 +6015,7 @@
         </w:tc>
         <w:tc>
           <w:tcPr>
-            <w:tcW w:w="1417" w:type="dxa"/>
+            <w:tcW w:w="1389" w:type="dxa"/>
             <w:shd w:val="clear" w:color="auto" w:fill="1F4E79"/>
           </w:tcPr>
           <w:p>
@@ -4728,6 +6032,50 @@
                 <w:sz w:val="19"/>
               </w:rPr>
               <w:t>优先级</w:t>
+            </w:r>
+          </w:p>
+        </w:tc>
+        <w:tc>
+          <w:tcPr>
+            <w:tcW w:w="1021" w:type="dxa"/>
+            <w:shd w:val="clear" w:color="auto" w:fill="1F4E79"/>
+          </w:tcPr>
+          <w:p>
+            <w:pPr>
+              <w:spacing w:before="40" w:after="40" w:line="288" w:lineRule="auto"/>
+              <w:jc w:val="center"/>
+            </w:pPr>
+            <w:r>
+              <w:rPr>
+                <w:rFonts w:ascii="Arial" w:hAnsi="Arial" w:eastAsia="微软雅黑"/>
+                <w:b/>
+                <w:i w:val="0"/>
+                <w:color w:val="FFFFFF"/>
+                <w:sz w:val="19"/>
+              </w:rPr>
+              <w:t xml:space="preserve">责任部门</w:t>
+            </w:r>
+          </w:p>
+        </w:tc>
+        <w:tc>
+          <w:tcPr>
+            <w:tcW w:w="1021" w:type="dxa"/>
+            <w:shd w:val="clear" w:color="auto" w:fill="1F4E79"/>
+          </w:tcPr>
+          <w:p>
+            <w:pPr>
+              <w:spacing w:before="40" w:after="40" w:line="288" w:lineRule="auto"/>
+              <w:jc w:val="center"/>
+            </w:pPr>
+            <w:r>
+              <w:rPr>
+                <w:rFonts w:ascii="Arial" w:hAnsi="Arial" w:eastAsia="微软雅黑"/>
+                <w:b/>
+                <w:i w:val="0"/>
+                <w:color w:val="FFFFFF"/>
+                <w:sz w:val="19"/>
+              </w:rPr>
+              <w:t xml:space="preserve">完成时间</w:t>
             </w:r>
           </w:p>
         </w:tc>
@@ -4755,7 +6103,7 @@
         </w:trPr>
         <w:tc>
           <w:tcPr>
-            <w:tcW w:w="624" w:type="dxa"/>
+            <w:tcW w:w="652" w:type="dxa"/>
           </w:tcPr>
           <w:p>
             <w:pPr>
@@ -4776,7 +6124,7 @@
         </w:tc>
         <w:tc>
           <w:tcPr>
-            <w:tcW w:w="3515" w:type="dxa"/>
+            <w:tcW w:w="2579" w:type="dxa"/>
           </w:tcPr>
           <w:p>
             <w:pPr>
@@ -4796,7 +6144,7 @@
         </w:tc>
         <w:tc>
           <w:tcPr>
-            <w:tcW w:w="4025" w:type="dxa"/>
+            <w:tcW w:w="2920" w:type="dxa"/>
           </w:tcPr>
           <w:p>
             <w:pPr>
@@ -4816,7 +6164,7 @@
         </w:tc>
         <w:tc>
           <w:tcPr>
-            <w:tcW w:w="1417" w:type="dxa"/>
+            <w:tcW w:w="1389" w:type="dxa"/>
           </w:tcPr>
           <w:p>
             <w:pPr>
@@ -4849,6 +6197,42 @@
               </w:rPr>
               <w:t>（客户明示）</w:t>
             </w:r>
+          </w:p>
+        </w:tc>
+        <w:tc>
+          <w:tcPr>
+            <w:tcW w:w="1021" w:type="dxa"/>
+          </w:tcPr>
+          <w:p>
+            <w:pPr>
+              <w:spacing w:before="40" w:after="40" w:line="288" w:lineRule="auto"/>
+              <w:jc w:val="center"/>
+              <w:rPr>
+                <w:rFonts w:ascii="Arial" w:hAnsi="Arial" w:eastAsia="微软雅黑"/>
+                <w:b w:val="0"/>
+                <w:i w:val="0"/>
+                <w:color w:val="404040"/>
+                <w:sz w:val="19"/>
+              </w:rPr>
+            </w:pPr>
+          </w:p>
+        </w:tc>
+        <w:tc>
+          <w:tcPr>
+            <w:tcW w:w="1021" w:type="dxa"/>
+          </w:tcPr>
+          <w:p>
+            <w:pPr>
+              <w:spacing w:before="40" w:after="40" w:line="288" w:lineRule="auto"/>
+              <w:jc w:val="center"/>
+              <w:rPr>
+                <w:rFonts w:ascii="Arial" w:hAnsi="Arial" w:eastAsia="微软雅黑"/>
+                <w:b w:val="0"/>
+                <w:i w:val="0"/>
+                <w:color w:val="404040"/>
+                <w:sz w:val="19"/>
+              </w:rPr>
+            </w:pPr>
           </w:p>
         </w:tc>
       </w:tr>
@@ -4875,7 +6259,7 @@
         </w:trPr>
         <w:tc>
           <w:tcPr>
-            <w:tcW w:w="624" w:type="dxa"/>
+            <w:tcW w:w="652" w:type="dxa"/>
             <w:shd w:val="clear" w:color="auto" w:fill="EAF1F8"/>
           </w:tcPr>
           <w:p>
@@ -4897,7 +6281,7 @@
         </w:tc>
         <w:tc>
           <w:tcPr>
-            <w:tcW w:w="3515" w:type="dxa"/>
+            <w:tcW w:w="2579" w:type="dxa"/>
             <w:shd w:val="clear" w:color="auto" w:fill="EAF1F8"/>
           </w:tcPr>
           <w:p>
@@ -4918,7 +6302,7 @@
         </w:tc>
         <w:tc>
           <w:tcPr>
-            <w:tcW w:w="4025" w:type="dxa"/>
+            <w:tcW w:w="2920" w:type="dxa"/>
             <w:shd w:val="clear" w:color="auto" w:fill="EAF1F8"/>
           </w:tcPr>
           <w:p>
@@ -4939,7 +6323,7 @@
         </w:tc>
         <w:tc>
           <w:tcPr>
-            <w:tcW w:w="1417" w:type="dxa"/>
+            <w:tcW w:w="1389" w:type="dxa"/>
             <w:shd w:val="clear" w:color="auto" w:fill="EAF1F8"/>
           </w:tcPr>
           <w:p>
@@ -4973,6 +6357,44 @@
               </w:rPr>
               <w:t>（客户明示）</w:t>
             </w:r>
+          </w:p>
+        </w:tc>
+        <w:tc>
+          <w:tcPr>
+            <w:tcW w:w="1021" w:type="dxa"/>
+            <w:shd w:val="clear" w:color="auto" w:fill="EAF1F8"/>
+          </w:tcPr>
+          <w:p>
+            <w:pPr>
+              <w:spacing w:before="40" w:after="40" w:line="288" w:lineRule="auto"/>
+              <w:jc w:val="center"/>
+              <w:rPr>
+                <w:rFonts w:ascii="Arial" w:hAnsi="Arial" w:eastAsia="微软雅黑"/>
+                <w:b w:val="0"/>
+                <w:i w:val="0"/>
+                <w:color w:val="404040"/>
+                <w:sz w:val="19"/>
+              </w:rPr>
+            </w:pPr>
+          </w:p>
+        </w:tc>
+        <w:tc>
+          <w:tcPr>
+            <w:tcW w:w="1021" w:type="dxa"/>
+            <w:shd w:val="clear" w:color="auto" w:fill="EAF1F8"/>
+          </w:tcPr>
+          <w:p>
+            <w:pPr>
+              <w:spacing w:before="40" w:after="40" w:line="288" w:lineRule="auto"/>
+              <w:jc w:val="center"/>
+              <w:rPr>
+                <w:rFonts w:ascii="Arial" w:hAnsi="Arial" w:eastAsia="微软雅黑"/>
+                <w:b w:val="0"/>
+                <w:i w:val="0"/>
+                <w:color w:val="404040"/>
+                <w:sz w:val="19"/>
+              </w:rPr>
+            </w:pPr>
           </w:p>
         </w:tc>
       </w:tr>
@@ -5015,10 +6437,12 @@
         </w:tblCellMar>
       </w:tblPr>
       <w:tblGrid>
-        <w:gridCol w:w="624"/>
-        <w:gridCol w:w="3515"/>
-        <w:gridCol w:w="4025"/>
-        <w:gridCol w:w="1417"/>
+        <w:gridCol w:w="652"/>
+        <w:gridCol w:w="2579"/>
+        <w:gridCol w:w="2920"/>
+        <w:gridCol w:w="1389"/>
+        <w:gridCol w:w="1021"/>
+        <w:gridCol w:w="1021"/>
       </w:tblGrid>
       <w:tr>
         <w:tblPrEx>
@@ -5044,7 +6468,7 @@
         </w:trPr>
         <w:tc>
           <w:tcPr>
-            <w:tcW w:w="624" w:type="dxa"/>
+            <w:tcW w:w="652" w:type="dxa"/>
             <w:shd w:val="clear" w:color="auto" w:fill="1F4E79"/>
           </w:tcPr>
           <w:p>
@@ -5066,7 +6490,7 @@
         </w:tc>
         <w:tc>
           <w:tcPr>
-            <w:tcW w:w="3515" w:type="dxa"/>
+            <w:tcW w:w="2579" w:type="dxa"/>
             <w:shd w:val="clear" w:color="auto" w:fill="1F4E79"/>
           </w:tcPr>
           <w:p>
@@ -5088,7 +6512,7 @@
         </w:tc>
         <w:tc>
           <w:tcPr>
-            <w:tcW w:w="4025" w:type="dxa"/>
+            <w:tcW w:w="2920" w:type="dxa"/>
             <w:shd w:val="clear" w:color="auto" w:fill="1F4E79"/>
           </w:tcPr>
           <w:p>
@@ -5110,7 +6534,7 @@
         </w:tc>
         <w:tc>
           <w:tcPr>
-            <w:tcW w:w="1417" w:type="dxa"/>
+            <w:tcW w:w="1389" w:type="dxa"/>
             <w:shd w:val="clear" w:color="auto" w:fill="1F4E79"/>
           </w:tcPr>
           <w:p>
@@ -5127,6 +6551,50 @@
                 <w:sz w:val="19"/>
               </w:rPr>
               <w:t>优先级</w:t>
+            </w:r>
+          </w:p>
+        </w:tc>
+        <w:tc>
+          <w:tcPr>
+            <w:tcW w:w="1021" w:type="dxa"/>
+            <w:shd w:val="clear" w:color="auto" w:fill="1F4E79"/>
+          </w:tcPr>
+          <w:p>
+            <w:pPr>
+              <w:spacing w:before="40" w:after="40" w:line="288" w:lineRule="auto"/>
+              <w:jc w:val="center"/>
+            </w:pPr>
+            <w:r>
+              <w:rPr>
+                <w:rFonts w:ascii="Arial" w:hAnsi="Arial" w:eastAsia="微软雅黑"/>
+                <w:b/>
+                <w:i w:val="0"/>
+                <w:color w:val="FFFFFF"/>
+                <w:sz w:val="19"/>
+              </w:rPr>
+              <w:t xml:space="preserve">责任部门</w:t>
+            </w:r>
+          </w:p>
+        </w:tc>
+        <w:tc>
+          <w:tcPr>
+            <w:tcW w:w="1021" w:type="dxa"/>
+            <w:shd w:val="clear" w:color="auto" w:fill="1F4E79"/>
+          </w:tcPr>
+          <w:p>
+            <w:pPr>
+              <w:spacing w:before="40" w:after="40" w:line="288" w:lineRule="auto"/>
+              <w:jc w:val="center"/>
+            </w:pPr>
+            <w:r>
+              <w:rPr>
+                <w:rFonts w:ascii="Arial" w:hAnsi="Arial" w:eastAsia="微软雅黑"/>
+                <w:b/>
+                <w:i w:val="0"/>
+                <w:color w:val="FFFFFF"/>
+                <w:sz w:val="19"/>
+              </w:rPr>
+              <w:t xml:space="preserve">完成时间</w:t>
             </w:r>
           </w:p>
         </w:tc>
@@ -5154,7 +6622,7 @@
         </w:trPr>
         <w:tc>
           <w:tcPr>
-            <w:tcW w:w="624" w:type="dxa"/>
+            <w:tcW w:w="652" w:type="dxa"/>
           </w:tcPr>
           <w:p>
             <w:pPr>
@@ -5175,7 +6643,7 @@
         </w:tc>
         <w:tc>
           <w:tcPr>
-            <w:tcW w:w="3515" w:type="dxa"/>
+            <w:tcW w:w="2579" w:type="dxa"/>
           </w:tcPr>
           <w:p>
             <w:pPr>
@@ -5195,7 +6663,7 @@
         </w:tc>
         <w:tc>
           <w:tcPr>
-            <w:tcW w:w="4025" w:type="dxa"/>
+            <w:tcW w:w="2920" w:type="dxa"/>
           </w:tcPr>
           <w:p>
             <w:pPr>
@@ -5215,7 +6683,7 @@
         </w:tc>
         <w:tc>
           <w:tcPr>
-            <w:tcW w:w="1417" w:type="dxa"/>
+            <w:tcW w:w="1389" w:type="dxa"/>
           </w:tcPr>
           <w:p>
             <w:pPr>
@@ -5248,6 +6716,42 @@
               </w:rPr>
               <w:t>（客户明示）</w:t>
             </w:r>
+          </w:p>
+        </w:tc>
+        <w:tc>
+          <w:tcPr>
+            <w:tcW w:w="1021" w:type="dxa"/>
+          </w:tcPr>
+          <w:p>
+            <w:pPr>
+              <w:spacing w:before="40" w:after="40" w:line="288" w:lineRule="auto"/>
+              <w:jc w:val="center"/>
+              <w:rPr>
+                <w:rFonts w:ascii="Arial" w:hAnsi="Arial" w:eastAsia="微软雅黑"/>
+                <w:b w:val="0"/>
+                <w:i w:val="0"/>
+                <w:color w:val="404040"/>
+                <w:sz w:val="19"/>
+              </w:rPr>
+            </w:pPr>
+          </w:p>
+        </w:tc>
+        <w:tc>
+          <w:tcPr>
+            <w:tcW w:w="1021" w:type="dxa"/>
+          </w:tcPr>
+          <w:p>
+            <w:pPr>
+              <w:spacing w:before="40" w:after="40" w:line="288" w:lineRule="auto"/>
+              <w:jc w:val="center"/>
+              <w:rPr>
+                <w:rFonts w:ascii="Arial" w:hAnsi="Arial" w:eastAsia="微软雅黑"/>
+                <w:b w:val="0"/>
+                <w:i w:val="0"/>
+                <w:color w:val="404040"/>
+                <w:sz w:val="19"/>
+              </w:rPr>
+            </w:pPr>
           </w:p>
         </w:tc>
       </w:tr>
@@ -5274,7 +6778,7 @@
         </w:trPr>
         <w:tc>
           <w:tcPr>
-            <w:tcW w:w="624" w:type="dxa"/>
+            <w:tcW w:w="652" w:type="dxa"/>
             <w:shd w:val="clear" w:color="auto" w:fill="EAF1F8"/>
           </w:tcPr>
           <w:p>
@@ -5296,7 +6800,7 @@
         </w:tc>
         <w:tc>
           <w:tcPr>
-            <w:tcW w:w="3515" w:type="dxa"/>
+            <w:tcW w:w="2579" w:type="dxa"/>
             <w:shd w:val="clear" w:color="auto" w:fill="EAF1F8"/>
           </w:tcPr>
           <w:p>
@@ -5317,7 +6821,7 @@
         </w:tc>
         <w:tc>
           <w:tcPr>
-            <w:tcW w:w="4025" w:type="dxa"/>
+            <w:tcW w:w="2920" w:type="dxa"/>
             <w:shd w:val="clear" w:color="auto" w:fill="EAF1F8"/>
           </w:tcPr>
           <w:p>
@@ -5338,7 +6842,7 @@
         </w:tc>
         <w:tc>
           <w:tcPr>
-            <w:tcW w:w="1417" w:type="dxa"/>
+            <w:tcW w:w="1389" w:type="dxa"/>
             <w:shd w:val="clear" w:color="auto" w:fill="EAF1F8"/>
           </w:tcPr>
           <w:p>
@@ -5356,6 +6860,44 @@
               </w:rPr>
               <w:t>中</w:t>
             </w:r>
+          </w:p>
+        </w:tc>
+        <w:tc>
+          <w:tcPr>
+            <w:tcW w:w="1021" w:type="dxa"/>
+            <w:shd w:val="clear" w:color="auto" w:fill="EAF1F8"/>
+          </w:tcPr>
+          <w:p>
+            <w:pPr>
+              <w:spacing w:before="40" w:after="40" w:line="288" w:lineRule="auto"/>
+              <w:jc w:val="center"/>
+              <w:rPr>
+                <w:rFonts w:ascii="Arial" w:hAnsi="Arial" w:eastAsia="微软雅黑"/>
+                <w:b w:val="0"/>
+                <w:i w:val="0"/>
+                <w:color w:val="404040"/>
+                <w:sz w:val="19"/>
+              </w:rPr>
+            </w:pPr>
+          </w:p>
+        </w:tc>
+        <w:tc>
+          <w:tcPr>
+            <w:tcW w:w="1021" w:type="dxa"/>
+            <w:shd w:val="clear" w:color="auto" w:fill="EAF1F8"/>
+          </w:tcPr>
+          <w:p>
+            <w:pPr>
+              <w:spacing w:before="40" w:after="40" w:line="288" w:lineRule="auto"/>
+              <w:jc w:val="center"/>
+              <w:rPr>
+                <w:rFonts w:ascii="Arial" w:hAnsi="Arial" w:eastAsia="微软雅黑"/>
+                <w:b w:val="0"/>
+                <w:i w:val="0"/>
+                <w:color w:val="404040"/>
+                <w:sz w:val="19"/>
+              </w:rPr>
+            </w:pPr>
           </w:p>
         </w:tc>
       </w:tr>
@@ -5382,7 +6924,7 @@
         </w:trPr>
         <w:tc>
           <w:tcPr>
-            <w:tcW w:w="624" w:type="dxa"/>
+            <w:tcW w:w="652" w:type="dxa"/>
           </w:tcPr>
           <w:p>
             <w:pPr>
@@ -5403,7 +6945,7 @@
         </w:tc>
         <w:tc>
           <w:tcPr>
-            <w:tcW w:w="3515" w:type="dxa"/>
+            <w:tcW w:w="2579" w:type="dxa"/>
           </w:tcPr>
           <w:p>
             <w:pPr>
@@ -5423,7 +6965,7 @@
         </w:tc>
         <w:tc>
           <w:tcPr>
-            <w:tcW w:w="4025" w:type="dxa"/>
+            <w:tcW w:w="2920" w:type="dxa"/>
           </w:tcPr>
           <w:p>
             <w:pPr>
@@ -5443,7 +6985,7 @@
         </w:tc>
         <w:tc>
           <w:tcPr>
-            <w:tcW w:w="1417" w:type="dxa"/>
+            <w:tcW w:w="1389" w:type="dxa"/>
           </w:tcPr>
           <w:p>
             <w:pPr>
@@ -5460,6 +7002,42 @@
               </w:rPr>
               <w:t>中</w:t>
             </w:r>
+          </w:p>
+        </w:tc>
+        <w:tc>
+          <w:tcPr>
+            <w:tcW w:w="1021" w:type="dxa"/>
+          </w:tcPr>
+          <w:p>
+            <w:pPr>
+              <w:spacing w:before="40" w:after="40" w:line="288" w:lineRule="auto"/>
+              <w:jc w:val="center"/>
+              <w:rPr>
+                <w:rFonts w:ascii="Arial" w:hAnsi="Arial" w:eastAsia="微软雅黑"/>
+                <w:b w:val="0"/>
+                <w:i w:val="0"/>
+                <w:color w:val="404040"/>
+                <w:sz w:val="19"/>
+              </w:rPr>
+            </w:pPr>
+          </w:p>
+        </w:tc>
+        <w:tc>
+          <w:tcPr>
+            <w:tcW w:w="1021" w:type="dxa"/>
+          </w:tcPr>
+          <w:p>
+            <w:pPr>
+              <w:spacing w:before="40" w:after="40" w:line="288" w:lineRule="auto"/>
+              <w:jc w:val="center"/>
+              <w:rPr>
+                <w:rFonts w:ascii="Arial" w:hAnsi="Arial" w:eastAsia="微软雅黑"/>
+                <w:b w:val="0"/>
+                <w:i w:val="0"/>
+                <w:color w:val="404040"/>
+                <w:sz w:val="19"/>
+              </w:rPr>
+            </w:pPr>
           </w:p>
         </w:tc>
       </w:tr>
@@ -5494,7 +7072,7 @@
     <w:tbl>
       <w:tblPr>
         <w:tblStyle w:val="35"/>
-        <w:tblW w:w="7253" w:type="dxa"/>
+        <w:tblW w:w="9582" w:type="dxa"/>
         <w:jc w:val="center"/>
         <w:tblBorders>
           <w:top w:val="single" w:color="auto" w:sz="4" w:space="0"/>
@@ -5513,8 +7091,10 @@
         </w:tblCellMar>
       </w:tblPr>
       <w:tblGrid>
-        <w:gridCol w:w="1794"/>
-        <w:gridCol w:w="5459"/>
+        <w:gridCol w:w="850"/>
+        <w:gridCol w:w="6690"/>
+        <w:gridCol w:w="1021"/>
+        <w:gridCol w:w="1021"/>
       </w:tblGrid>
       <w:tr>
         <w:tblPrEx>
@@ -5540,7 +7120,7 @@
         </w:trPr>
         <w:tc>
           <w:tcPr>
-            <w:tcW w:w="1794" w:type="dxa"/>
+            <w:tcW w:w="850" w:type="dxa"/>
             <w:shd w:val="clear" w:color="auto" w:fill="1F4E79"/>
           </w:tcPr>
           <w:p>
@@ -5562,7 +7142,7 @@
         </w:tc>
         <w:tc>
           <w:tcPr>
-            <w:tcW w:w="5459" w:type="dxa"/>
+            <w:tcW w:w="6690" w:type="dxa"/>
             <w:shd w:val="clear" w:color="auto" w:fill="1F4E79"/>
           </w:tcPr>
           <w:p>
@@ -5579,6 +7159,50 @@
                 <w:sz w:val="19"/>
               </w:rPr>
               <w:t>客户期望</w:t>
+            </w:r>
+          </w:p>
+        </w:tc>
+        <w:tc>
+          <w:tcPr>
+            <w:tcW w:w="1021" w:type="dxa"/>
+            <w:shd w:val="clear" w:color="auto" w:fill="1F4E79"/>
+          </w:tcPr>
+          <w:p>
+            <w:pPr>
+              <w:spacing w:before="40" w:after="40" w:line="288" w:lineRule="auto"/>
+              <w:jc w:val="center"/>
+            </w:pPr>
+            <w:r>
+              <w:rPr>
+                <w:rFonts w:ascii="Arial" w:hAnsi="Arial" w:eastAsia="微软雅黑"/>
+                <w:b/>
+                <w:i w:val="0"/>
+                <w:color w:val="FFFFFF"/>
+                <w:sz w:val="19"/>
+              </w:rPr>
+              <w:t xml:space="preserve">责任部门</w:t>
+            </w:r>
+          </w:p>
+        </w:tc>
+        <w:tc>
+          <w:tcPr>
+            <w:tcW w:w="1021" w:type="dxa"/>
+            <w:shd w:val="clear" w:color="auto" w:fill="1F4E79"/>
+          </w:tcPr>
+          <w:p>
+            <w:pPr>
+              <w:spacing w:before="40" w:after="40" w:line="288" w:lineRule="auto"/>
+              <w:jc w:val="center"/>
+            </w:pPr>
+            <w:r>
+              <w:rPr>
+                <w:rFonts w:ascii="Arial" w:hAnsi="Arial" w:eastAsia="微软雅黑"/>
+                <w:b/>
+                <w:i w:val="0"/>
+                <w:color w:val="FFFFFF"/>
+                <w:sz w:val="19"/>
+              </w:rPr>
+              <w:t xml:space="preserve">完成时间</w:t>
             </w:r>
           </w:p>
         </w:tc>
@@ -5606,7 +7230,7 @@
         </w:trPr>
         <w:tc>
           <w:tcPr>
-            <w:tcW w:w="1794" w:type="dxa"/>
+            <w:tcW w:w="850" w:type="dxa"/>
           </w:tcPr>
           <w:p>
             <w:pPr>
@@ -5627,7 +7251,7 @@
         </w:tc>
         <w:tc>
           <w:tcPr>
-            <w:tcW w:w="5459" w:type="dxa"/>
+            <w:tcW w:w="6690" w:type="dxa"/>
           </w:tcPr>
           <w:p>
             <w:pPr>
@@ -5643,6 +7267,42 @@
               </w:rPr>
               <w:t>客户将发出约 60 项清单（含优先级与分类），由 AI 工具汇总三位审计人员的记录，可能存在重叠或表述不清；客户要求我方有疑问立即提问（可要求照片/草图），并对照我方自己的记录，凡客户清单遗漏的项主动上报。</w:t>
             </w:r>
+          </w:p>
+        </w:tc>
+        <w:tc>
+          <w:tcPr>
+            <w:tcW w:w="1021" w:type="dxa"/>
+          </w:tcPr>
+          <w:p>
+            <w:pPr>
+              <w:spacing w:before="40" w:after="40" w:line="288" w:lineRule="auto"/>
+              <w:jc w:val="center"/>
+              <w:rPr>
+                <w:rFonts w:ascii="Arial" w:hAnsi="Arial" w:eastAsia="微软雅黑"/>
+                <w:b w:val="0"/>
+                <w:i w:val="0"/>
+                <w:color w:val="404040"/>
+                <w:sz w:val="19"/>
+              </w:rPr>
+            </w:pPr>
+          </w:p>
+        </w:tc>
+        <w:tc>
+          <w:tcPr>
+            <w:tcW w:w="1021" w:type="dxa"/>
+          </w:tcPr>
+          <w:p>
+            <w:pPr>
+              <w:spacing w:before="40" w:after="40" w:line="288" w:lineRule="auto"/>
+              <w:jc w:val="center"/>
+              <w:rPr>
+                <w:rFonts w:ascii="Arial" w:hAnsi="Arial" w:eastAsia="微软雅黑"/>
+                <w:b w:val="0"/>
+                <w:i w:val="0"/>
+                <w:color w:val="404040"/>
+                <w:sz w:val="19"/>
+              </w:rPr>
+            </w:pPr>
           </w:p>
         </w:tc>
       </w:tr>
@@ -5669,7 +7329,7 @@
         </w:trPr>
         <w:tc>
           <w:tcPr>
-            <w:tcW w:w="1794" w:type="dxa"/>
+            <w:tcW w:w="850" w:type="dxa"/>
             <w:shd w:val="clear" w:color="auto" w:fill="EAF1F8"/>
           </w:tcPr>
           <w:p>
@@ -5691,7 +7351,7 @@
         </w:tc>
         <w:tc>
           <w:tcPr>
-            <w:tcW w:w="5459" w:type="dxa"/>
+            <w:tcW w:w="6690" w:type="dxa"/>
             <w:shd w:val="clear" w:color="auto" w:fill="EAF1F8"/>
           </w:tcPr>
           <w:p>
@@ -5708,6 +7368,44 @@
               </w:rPr>
               <w:t>客户建议增加专题会：清洁策略专题会（固定频次）、验证（VOA）就绪专题会，与 JPT 工艺技术会分开，避免被工艺讨论挤占。</w:t>
             </w:r>
+          </w:p>
+        </w:tc>
+        <w:tc>
+          <w:tcPr>
+            <w:tcW w:w="1021" w:type="dxa"/>
+            <w:shd w:val="clear" w:color="auto" w:fill="EAF1F8"/>
+          </w:tcPr>
+          <w:p>
+            <w:pPr>
+              <w:spacing w:before="40" w:after="40" w:line="288" w:lineRule="auto"/>
+              <w:jc w:val="center"/>
+              <w:rPr>
+                <w:rFonts w:ascii="Arial" w:hAnsi="Arial" w:eastAsia="微软雅黑"/>
+                <w:b w:val="0"/>
+                <w:i w:val="0"/>
+                <w:color w:val="404040"/>
+                <w:sz w:val="19"/>
+              </w:rPr>
+            </w:pPr>
+          </w:p>
+        </w:tc>
+        <w:tc>
+          <w:tcPr>
+            <w:tcW w:w="1021" w:type="dxa"/>
+            <w:shd w:val="clear" w:color="auto" w:fill="EAF1F8"/>
+          </w:tcPr>
+          <w:p>
+            <w:pPr>
+              <w:spacing w:before="40" w:after="40" w:line="288" w:lineRule="auto"/>
+              <w:jc w:val="center"/>
+              <w:rPr>
+                <w:rFonts w:ascii="Arial" w:hAnsi="Arial" w:eastAsia="微软雅黑"/>
+                <w:b w:val="0"/>
+                <w:i w:val="0"/>
+                <w:color w:val="404040"/>
+                <w:sz w:val="19"/>
+              </w:rPr>
+            </w:pPr>
           </w:p>
         </w:tc>
       </w:tr>
@@ -5734,7 +7432,7 @@
         </w:trPr>
         <w:tc>
           <w:tcPr>
-            <w:tcW w:w="1794" w:type="dxa"/>
+            <w:tcW w:w="850" w:type="dxa"/>
           </w:tcPr>
           <w:p>
             <w:pPr>
@@ -5755,7 +7453,7 @@
         </w:tc>
         <w:tc>
           <w:tcPr>
-            <w:tcW w:w="5459" w:type="dxa"/>
+            <w:tcW w:w="6690" w:type="dxa"/>
           </w:tcPr>
           <w:p>
             <w:pPr>
@@ -5771,6 +7469,42 @@
               </w:rPr>
               <w:t>客户要求重大改造在投入人力物力之前先送审方案（如排放阀处理方式、分馏管线设计、水系统总管改造），避免返工。</w:t>
             </w:r>
+          </w:p>
+        </w:tc>
+        <w:tc>
+          <w:tcPr>
+            <w:tcW w:w="1021" w:type="dxa"/>
+          </w:tcPr>
+          <w:p>
+            <w:pPr>
+              <w:spacing w:before="40" w:after="40" w:line="288" w:lineRule="auto"/>
+              <w:jc w:val="center"/>
+              <w:rPr>
+                <w:rFonts w:ascii="Arial" w:hAnsi="Arial" w:eastAsia="微软雅黑"/>
+                <w:b w:val="0"/>
+                <w:i w:val="0"/>
+                <w:color w:val="404040"/>
+                <w:sz w:val="19"/>
+              </w:rPr>
+            </w:pPr>
+          </w:p>
+        </w:tc>
+        <w:tc>
+          <w:tcPr>
+            <w:tcW w:w="1021" w:type="dxa"/>
+          </w:tcPr>
+          <w:p>
+            <w:pPr>
+              <w:spacing w:before="40" w:after="40" w:line="288" w:lineRule="auto"/>
+              <w:jc w:val="center"/>
+              <w:rPr>
+                <w:rFonts w:ascii="Arial" w:hAnsi="Arial" w:eastAsia="微软雅黑"/>
+                <w:b w:val="0"/>
+                <w:i w:val="0"/>
+                <w:color w:val="404040"/>
+                <w:sz w:val="19"/>
+              </w:rPr>
+            </w:pPr>
           </w:p>
         </w:tc>
       </w:tr>
@@ -5797,7 +7531,7 @@
         </w:trPr>
         <w:tc>
           <w:tcPr>
-            <w:tcW w:w="1794" w:type="dxa"/>
+            <w:tcW w:w="850" w:type="dxa"/>
             <w:shd w:val="clear" w:color="auto" w:fill="EAF1F8"/>
           </w:tcPr>
           <w:p>
@@ -5819,7 +7553,7 @@
         </w:tc>
         <w:tc>
           <w:tcPr>
-            <w:tcW w:w="5459" w:type="dxa"/>
+            <w:tcW w:w="6690" w:type="dxa"/>
             <w:shd w:val="clear" w:color="auto" w:fill="EAF1F8"/>
           </w:tcPr>
           <w:p>
@@ -5836,6 +7570,44 @@
               </w:rPr>
               <w:t>客户认可通过详细视频发现问题（其部分发现即来自我方提供的视频），建议增加逐个接口的细节视频、现场直播走查，并改善会议室摄像条件、对设备做清晰标识。</w:t>
             </w:r>
+          </w:p>
+        </w:tc>
+        <w:tc>
+          <w:tcPr>
+            <w:tcW w:w="1021" w:type="dxa"/>
+            <w:shd w:val="clear" w:color="auto" w:fill="EAF1F8"/>
+          </w:tcPr>
+          <w:p>
+            <w:pPr>
+              <w:spacing w:before="40" w:after="40" w:line="288" w:lineRule="auto"/>
+              <w:jc w:val="center"/>
+              <w:rPr>
+                <w:rFonts w:ascii="Arial" w:hAnsi="Arial" w:eastAsia="微软雅黑"/>
+                <w:b w:val="0"/>
+                <w:i w:val="0"/>
+                <w:color w:val="404040"/>
+                <w:sz w:val="19"/>
+              </w:rPr>
+            </w:pPr>
+          </w:p>
+        </w:tc>
+        <w:tc>
+          <w:tcPr>
+            <w:tcW w:w="1021" w:type="dxa"/>
+            <w:shd w:val="clear" w:color="auto" w:fill="EAF1F8"/>
+          </w:tcPr>
+          <w:p>
+            <w:pPr>
+              <w:spacing w:before="40" w:after="40" w:line="288" w:lineRule="auto"/>
+              <w:jc w:val="center"/>
+              <w:rPr>
+                <w:rFonts w:ascii="Arial" w:hAnsi="Arial" w:eastAsia="微软雅黑"/>
+                <w:b w:val="0"/>
+                <w:i w:val="0"/>
+                <w:color w:val="404040"/>
+                <w:sz w:val="19"/>
+              </w:rPr>
+            </w:pPr>
           </w:p>
         </w:tc>
       </w:tr>
@@ -5862,7 +7634,7 @@
         </w:trPr>
         <w:tc>
           <w:tcPr>
-            <w:tcW w:w="1794" w:type="dxa"/>
+            <w:tcW w:w="850" w:type="dxa"/>
           </w:tcPr>
           <w:p>
             <w:pPr>
@@ -5883,7 +7655,7 @@
         </w:tc>
         <w:tc>
           <w:tcPr>
-            <w:tcW w:w="5459" w:type="dxa"/>
+            <w:tcW w:w="6690" w:type="dxa"/>
           </w:tcPr>
           <w:p>
             <w:pPr>
@@ -5899,6 +7671,42 @@
               </w:rPr>
               <w:t>客户提出在恢复/启动前可能再安排一次现场访问，并强调时间安排是关键关注点。</w:t>
             </w:r>
+          </w:p>
+        </w:tc>
+        <w:tc>
+          <w:tcPr>
+            <w:tcW w:w="1021" w:type="dxa"/>
+          </w:tcPr>
+          <w:p>
+            <w:pPr>
+              <w:spacing w:before="40" w:after="40" w:line="288" w:lineRule="auto"/>
+              <w:jc w:val="center"/>
+              <w:rPr>
+                <w:rFonts w:ascii="Arial" w:hAnsi="Arial" w:eastAsia="微软雅黑"/>
+                <w:b w:val="0"/>
+                <w:i w:val="0"/>
+                <w:color w:val="404040"/>
+                <w:sz w:val="19"/>
+              </w:rPr>
+            </w:pPr>
+          </w:p>
+        </w:tc>
+        <w:tc>
+          <w:tcPr>
+            <w:tcW w:w="1021" w:type="dxa"/>
+          </w:tcPr>
+          <w:p>
+            <w:pPr>
+              <w:spacing w:before="40" w:after="40" w:line="288" w:lineRule="auto"/>
+              <w:jc w:val="center"/>
+              <w:rPr>
+                <w:rFonts w:ascii="Arial" w:hAnsi="Arial" w:eastAsia="微软雅黑"/>
+                <w:b w:val="0"/>
+                <w:i w:val="0"/>
+                <w:color w:val="404040"/>
+                <w:sz w:val="19"/>
+              </w:rPr>
+            </w:pPr>
           </w:p>
         </w:tc>
       </w:tr>

</xml_diff>